<commit_message>
add dataset ref and render
</commit_message>
<xml_diff>
--- a/paper/drafts/data_paper_scidata.docx
+++ b/paper/drafts/data_paper_scidata.docx
@@ -375,7 +375,7 @@
         <w:pStyle w:val="FirstParagraph"/>
       </w:pPr>
       <w:r>
-        <w:t xml:space="preserve">Four categories of source material were assembled during data reconstruction and validation process: spatial datasets produced or maintained by Malagasy institutions responsible for protected areas; current and historical versions of the World Database on Protected Areas; official legal records from the national legislative database and public gazette (Journal Officel); and expert sources used to reconstruct or verify protected-area histories. These materials played different roles in the workflow: some were used only to identify or validate potential changes, whereas a more restricted set provides geometries or attribute amendments to the released dataset.</w:t>
+        <w:t xml:space="preserve">Four categories of source material were assembled during the data reconstruction and validation process: spatial datasets produced or maintained by Malagasy institutions responsible for protected areas; current and historical versions of the World Database on Protected Areas; official legal records from the national legislative database and public gazette (Journal Officiel); and expert sources used to reconstruct or verify protected-area histories. These materials played different roles in the workflow: some were used only to identify or validate potential changes, whereas a more restricted set provides geometries or attribute amendments to the released dataset.</w:t>
       </w:r>
     </w:p>
     <w:p>
@@ -1983,7 +1983,7 @@
       </w:tr>
     </w:tbl>
     <w:bookmarkEnd w:id="33"/>
-    <w:bookmarkStart w:id="35" w:name="usage-notes"/>
+    <w:bookmarkStart w:id="34" w:name="usage-notes"/>
     <w:p>
       <w:pPr>
         <w:pStyle w:val="Heading1"/>
@@ -1997,7 +1997,22 @@
         <w:pStyle w:val="FirstParagraph"/>
       </w:pPr>
       <w:r>
-        <w:t xml:space="preserve">The GeoPackage and GeoParquet files can be opened directly in QGIS, ArcGIS, R (with the sf or arrow packages), or Python (with geopandas or pyarrow). The WDPAID field enables direct linkage with global WDPA analyses, allowing users to enrich the standard database with temporal information for Madagascar.</w:t>
+        <w:t xml:space="preserve">The published dataset can be used directly without reproducing the data-preparation pipeline. The GeoPackage can be opened in standard GIS software including QGIS and ArcGIS and in R or Python through geospatial libraries. The Parquet representation is intended for efficient analytical workflows, while the RDS file preserves the R spatial object directly. The</w:t>
+      </w:r>
+      <w:r>
+        <w:t xml:space="preserve"> </w:t>
+      </w:r>
+      <w:r>
+        <w:rPr>
+          <w:rStyle w:val="VerbatimChar"/>
+        </w:rPr>
+        <w:t xml:space="preserve">WDPAID</w:t>
+      </w:r>
+      <w:r>
+        <w:t xml:space="preserve"> </w:t>
+      </w:r>
+      <w:r>
+        <w:t xml:space="preserve">field enables linkage with other WDPCA-based datasets.</w:t>
       </w:r>
     </w:p>
     <w:p>
@@ -2005,35 +2020,472 @@
         <w:pStyle w:val="BodyText"/>
       </w:pPr>
       <w:r>
-        <w:t xml:space="preserve">In the event that pre-compiled datasets cannot be distributed publicly due to WDPA licensing restrictions, users can easily generate the consolidated dataset themselves. By downloading the WDPA baseline directly from Protected Planet (</w:t>
-      </w:r>
-      <w:hyperlink r:id="rId34">
+        <w:t xml:space="preserve">Temporal configurations can be selected using</w:t>
+      </w:r>
+      <w:r>
+        <w:t xml:space="preserve"> </w:t>
+      </w:r>
+      <w:r>
+        <w:rPr>
+          <w:rStyle w:val="VerbatimChar"/>
+        </w:rPr>
+        <w:t xml:space="preserve">valid_from</w:t>
+      </w:r>
+      <w:r>
+        <w:t xml:space="preserve"> </w:t>
+      </w:r>
+      <w:r>
+        <w:t xml:space="preserve">and</w:t>
+      </w:r>
+      <w:r>
+        <w:t xml:space="preserve"> </w:t>
+      </w:r>
+      <w:r>
+        <w:rPr>
+          <w:rStyle w:val="VerbatimChar"/>
+        </w:rPr>
+        <w:t xml:space="preserve">valid_to</w:t>
+      </w:r>
+      <w:r>
+        <w:t xml:space="preserve">. Validity intervals follow a start-inclusive and end-exclusive convention. An</w:t>
+      </w:r>
+      <w:r>
+        <w:t xml:space="preserve"> </w:t>
+      </w:r>
+      <w:r>
+        <w:rPr>
+          <w:rStyle w:val="VerbatimChar"/>
+        </w:rPr>
+        <w:t xml:space="preserve">NA</w:t>
+      </w:r>
+      <w:r>
+        <w:t xml:space="preserve"> </w:t>
+      </w:r>
+      <w:r>
+        <w:t xml:space="preserve">value in</w:t>
+      </w:r>
+      <w:r>
+        <w:t xml:space="preserve"> </w:t>
+      </w:r>
+      <w:r>
+        <w:rPr>
+          <w:rStyle w:val="VerbatimChar"/>
+        </w:rPr>
+        <w:t xml:space="preserve">valid_to</w:t>
+      </w:r>
+      <w:r>
+        <w:t xml:space="preserve"> </w:t>
+      </w:r>
+      <w:r>
+        <w:t xml:space="preserve">indicates that no later state is recorded and therefore normally identifies the configuration valid at the reference date. The</w:t>
+      </w:r>
+      <w:r>
+        <w:t xml:space="preserve"> </w:t>
+      </w:r>
+      <w:r>
+        <w:rPr>
+          <w:rStyle w:val="VerbatimChar"/>
+        </w:rPr>
+        <w:t xml:space="preserve">zone_type</w:t>
+      </w:r>
+      <w:r>
+        <w:t xml:space="preserve">field distinguishes external protected-area boundaries from secondary zoning geometries.</w:t>
+      </w:r>
+      <w:r>
+        <w:t xml:space="preserve"> </w:t>
+      </w:r>
+      <w:r>
+        <w:t xml:space="preserve">Researchers wishing to update the dataset beyond the November 2025 baseline can download a more recent WDPCA release from Protected Planet and apply the published amendment registry using the Consolidation and Auditing Rules provided in the GitHub repository. This reconstruction route uses the curated YAML and GeoJSON amendment registry as input and does not require repeating the complete historical source-curation process.</w:t>
+      </w:r>
+    </w:p>
+    <w:p>
+      <w:pPr>
+        <w:pStyle w:val="BodyText"/>
+      </w:pPr>
+      <w:r>
+        <w:t xml:space="preserve">Users must observe the reuse conditions associated with the underlying source data. In particular, commercial use of WDPCA material or works derived from it requires prior written permission from UNEP-WCMC</w:t>
+      </w:r>
+      <w:r>
+        <w:t xml:space="preserve"> </w:t>
+      </w:r>
+      <w:r>
+        <w:t xml:space="preserve">(UNEP-WCMC 2026)</w:t>
+      </w:r>
+      <w:r>
+        <w:t xml:space="preserve">. UNEP-WCMC has separately provided written authorization for public redistribution of the Madagascar-specific derived outputs included in this dataset for the non-commercial use case described here.</w:t>
+      </w:r>
+    </w:p>
+    <w:p>
+      <w:pPr>
+        <w:pStyle w:val="BodyText"/>
+      </w:pPr>
+      <w:r>
+        <w:t xml:space="preserve">The YAML amendment registry is designed for collaborative extension. Researchers who identify additional legal texts, historical maps, or field-validated boundaries can propose corrections or new amendments through the associated GitHub repository, where changes remain auditable through version control. The interactive companion application allows users to explore individual protected areas and compare boundaries from different sources.</w:t>
+      </w:r>
+    </w:p>
+    <w:bookmarkEnd w:id="34"/>
+    <w:bookmarkStart w:id="35" w:name="data-availability-statement"/>
+    <w:p>
+      <w:pPr>
+        <w:pStyle w:val="Heading1"/>
+      </w:pPr>
+      <w:r>
+        <w:t xml:space="preserve">6. Data Availability Statement</w:t>
+      </w:r>
+    </w:p>
+    <w:p>
+      <w:pPr>
+        <w:pStyle w:val="FirstParagraph"/>
+      </w:pPr>
+      <w:r>
+        <w:t xml:space="preserve">The complete research dataset is publicly available from DataSuds, the institutional research data repository of the Institut de Recherche pour le Développment, at https://doi.org/10.23708/VN2TWC</w:t>
+      </w:r>
+      <w:r>
+        <w:t xml:space="preserve"> </w:t>
+      </w:r>
+      <w:r>
+        <w:t xml:space="preserve">(Bédécarrats et al. 2026)</w:t>
+      </w:r>
+      <w:r>
+        <w:t xml:space="preserve">. Version 2.0 includes the consolidated files</w:t>
+      </w:r>
+      <w:r>
+        <w:t xml:space="preserve"> </w:t>
+      </w:r>
+      <w:r>
+        <w:rPr>
+          <w:rStyle w:val="VerbatimChar"/>
+        </w:rPr>
+        <w:t xml:space="preserve">dynamic_wdpa.gpkg</w:t>
+      </w:r>
+      <w:r>
+        <w:t xml:space="preserve">,</w:t>
+      </w:r>
+      <w:r>
+        <w:t xml:space="preserve"> </w:t>
+      </w:r>
+      <w:r>
+        <w:rPr>
+          <w:rStyle w:val="VerbatimChar"/>
+        </w:rPr>
+        <w:t xml:space="preserve">dynamic_wdpa.parquet</w:t>
+      </w:r>
+      <w:r>
+        <w:t xml:space="preserve">, and</w:t>
+      </w:r>
+      <w:r>
+        <w:t xml:space="preserve"> </w:t>
+      </w:r>
+      <w:r>
+        <w:rPr>
+          <w:rStyle w:val="VerbatimChar"/>
+        </w:rPr>
+        <w:t xml:space="preserve">dynamic_wdpa.rds</w:t>
+      </w:r>
+      <w:r>
+        <w:t xml:space="preserve">, together with the archived amendment registry</w:t>
+      </w:r>
+      <w:r>
+        <w:t xml:space="preserve"> </w:t>
+      </w:r>
+      <w:r>
+        <w:rPr>
+          <w:rStyle w:val="VerbatimChar"/>
+        </w:rPr>
+        <w:t xml:space="preserve">amendments.zip</w:t>
+      </w:r>
+      <w:r>
+        <w:t xml:space="preserve">. The version-controlled amendment registry and associated processing code are also maintained in the GitHub repository at https://github.com/BETSAKA/conservation-dynamic-madagascar.</w:t>
+      </w:r>
+    </w:p>
+    <w:p>
+      <w:pPr>
+        <w:pStyle w:val="BodyText"/>
+      </w:pPr>
+      <w:r>
+        <w:t xml:space="preserve">The consolidated files incorporate information derived from the November 2025 WDPCA release. UNEP-WCMC has provided written authorization for redistribution of these Madagascar-specific derived outputs for this non-commercial use case. Commercial use of WDPCA material or derivative works requires prior written permission from UNEP-WCMC</w:t>
+      </w:r>
+      <w:r>
+        <w:t xml:space="preserve"> </w:t>
+      </w:r>
+      <w:r>
+        <w:t xml:space="preserve">(UNEP-WCMC 2026)</w:t>
+      </w:r>
+      <w:r>
+        <w:t xml:space="preserve">. The deposited files constitute a historical research snapshot; users requiring the latest official protected and conserved area data should obtain the current release directly from Protected Planet.</w:t>
+      </w:r>
+    </w:p>
+    <w:p>
+      <w:pPr>
+        <w:pStyle w:val="BodyText"/>
+      </w:pPr>
+      <w:r>
+        <w:t xml:space="preserve">Geometry-level provenance is recorded in</w:t>
+      </w:r>
+      <w:r>
+        <w:t xml:space="preserve"> </w:t>
+      </w:r>
+      <w:r>
+        <w:rPr>
+          <w:rStyle w:val="VerbatimChar"/>
+        </w:rPr>
+        <w:t xml:space="preserve">geometry_source_dataset_id</w:t>
+      </w:r>
+      <w:r>
+        <w:t xml:space="preserve">, while amendment-level provenance and corresponding legal sources are documented in the YAML registry. Source datasets that are not themselves redistributed can therefore be identified from the published metadata.</w:t>
+      </w:r>
+    </w:p>
+    <w:bookmarkEnd w:id="35"/>
+    <w:bookmarkStart w:id="36" w:name="code-availability"/>
+    <w:p>
+      <w:pPr>
+        <w:pStyle w:val="Heading1"/>
+      </w:pPr>
+      <w:r>
+        <w:t xml:space="preserve">7. Code Availability</w:t>
+      </w:r>
+    </w:p>
+    <w:p>
+      <w:pPr>
+        <w:pStyle w:val="FirstParagraph"/>
+      </w:pPr>
+      <w:r>
+        <w:t xml:space="preserve">All source code is available at https://github.com/BETSAKA/conservation-dynamic-madagascar under the MIT License. The repository contains the Quarto documentation, interactive verification application, amendment registry, and CAR consolidation engine. Data files contained in or linked from the repository remain subject to the source-specific reuse conditions described in the Data Availability Statement.</w:t>
+      </w:r>
+    </w:p>
+    <w:bookmarkEnd w:id="36"/>
+    <w:bookmarkStart w:id="37" w:name="acknowledgements"/>
+    <w:p>
+      <w:pPr>
+        <w:pStyle w:val="Heading1"/>
+      </w:pPr>
+      <w:r>
+        <w:t xml:space="preserve">8. Acknowledgements</w:t>
+      </w:r>
+    </w:p>
+    <w:p>
+      <w:pPr>
+        <w:pStyle w:val="FirstParagraph"/>
+      </w:pPr>
+      <w:r>
+        <w:t xml:space="preserve">This work was conducted within the BETSAKA project, supported by KfW (grant BMZ 2018-68-538/KfW 108778), Agence Française de Développement (grant PAIRES-CZZ2557), Institut de Recherche pour le Développement (IRD) and Agence Nationale de la Recherche (grant ANR-22-CPJ1-0052-01). The project is coordinated by IRD/UMI-SOURCE and the Université d’Antananarivo/CERED. We thank the Vahatra Association for the foundational monograph on Madagascar’s protected areas, the CNLEGIS team for maintaining the national legislative database, and the organizations (MEDD, MNP, MBG, GERP, WWF) that shared core zone spatial data.</w:t>
+      </w:r>
+    </w:p>
+    <w:bookmarkEnd w:id="37"/>
+    <w:bookmarkStart w:id="38" w:name="funding"/>
+    <w:p>
+      <w:pPr>
+        <w:pStyle w:val="Heading1"/>
+      </w:pPr>
+      <w:r>
+        <w:t xml:space="preserve">9. Funding</w:t>
+      </w:r>
+    </w:p>
+    <w:p>
+      <w:pPr>
+        <w:pStyle w:val="FirstParagraph"/>
+      </w:pPr>
+      <w:r>
+        <w:t xml:space="preserve">This work was supported by KfW (grant number BMZ 2018-68-538 / KfW 108778), Agence Française de Développement (grant number PAIRES-CZZ2557), and Agence Nationale de la Recherche (grant number ANR-22-CPJ1-0052-01).</w:t>
+      </w:r>
+    </w:p>
+    <w:bookmarkEnd w:id="38"/>
+    <w:bookmarkStart w:id="39" w:name="author-contributions"/>
+    <w:p>
+      <w:pPr>
+        <w:pStyle w:val="Heading1"/>
+      </w:pPr>
+      <w:r>
+        <w:t xml:space="preserve">10. Author Contributions</w:t>
+      </w:r>
+    </w:p>
+    <w:p>
+      <w:pPr>
+        <w:pStyle w:val="FirstParagraph"/>
+      </w:pPr>
+      <w:r>
+        <w:t xml:space="preserve">Following the CRediT (Contributor Roles Taxonomy) framework: F.B.: Conceptualization, Methodology, Software, Formal analysis, Data curation, Writing – original draft, Visualization, Project administration. S.R.: Investigation, Data curation, Validation, Resources, Writing – review &amp; editing. O.D.A.: Investigation, Data curation, Validation, Resources, Writing – review &amp; editing.</w:t>
+      </w:r>
+    </w:p>
+    <w:bookmarkEnd w:id="39"/>
+    <w:bookmarkStart w:id="40" w:name="competing-interests"/>
+    <w:p>
+      <w:pPr>
+        <w:pStyle w:val="Heading1"/>
+      </w:pPr>
+      <w:r>
+        <w:t xml:space="preserve">11. Competing Interests</w:t>
+      </w:r>
+    </w:p>
+    <w:p>
+      <w:pPr>
+        <w:pStyle w:val="FirstParagraph"/>
+      </w:pPr>
+      <w:r>
+        <w:t xml:space="preserve">S.R. is a civil servant in charge of protected area governance at the Ministère de l’Environnement et du Développement Durable (MEDD) of Madagascar. O.D.A. heads the data information system and innovation unit at Madagascar National Parks (MNP). Producing and maintaining protected area information is part of their professional responsibilities. The authors have no financial conflicts of interest to declare.</w:t>
+      </w:r>
+    </w:p>
+    <w:bookmarkEnd w:id="40"/>
+    <w:bookmarkStart w:id="41" w:name="funding-1"/>
+    <w:p>
+      <w:pPr>
+        <w:pStyle w:val="Heading1"/>
+      </w:pPr>
+      <w:r>
+        <w:t xml:space="preserve">12. Funding</w:t>
+      </w:r>
+    </w:p>
+    <w:p>
+      <w:pPr>
+        <w:pStyle w:val="FirstParagraph"/>
+      </w:pPr>
+      <w:r>
+        <w:t xml:space="preserve">BETSAKA project, supported by KfW, Agence Française de Développement (AFD), Institut de Recherche pour le Développement (IRD), and Agence Nationale de la Recherche (ANR).</w:t>
+      </w:r>
+    </w:p>
+    <w:bookmarkEnd w:id="41"/>
+    <w:bookmarkStart w:id="57" w:name="references"/>
+    <w:p>
+      <w:pPr>
+        <w:pStyle w:val="Heading1"/>
+      </w:pPr>
+      <w:r>
+        <w:t xml:space="preserve">13. References</w:t>
+      </w:r>
+    </w:p>
+    <w:bookmarkStart w:id="56" w:name="refs"/>
+    <w:bookmarkStart w:id="43" w:name="ref-bedecarrats2026dataset"/>
+    <w:p>
+      <w:pPr>
+        <w:pStyle w:val="Bibliography"/>
+      </w:pPr>
+      <w:r>
+        <w:t xml:space="preserve">Bédécarrats F, Ramanantsoa S, Andrianambinina OD (2026)</w:t>
+      </w:r>
+      <w:r>
+        <w:t xml:space="preserve"> </w:t>
+      </w:r>
+      <w:hyperlink r:id="rId42">
         <w:r>
           <w:rPr>
             <w:rStyle w:val="Hyperlink"/>
           </w:rPr>
-          <w:t xml:space="preserve">https://www.protectedplanet.net/</w:t>
+          <w:t xml:space="preserve">Dynamic spatial conservation boundaries and internal zoning of madagascar from 2000 to 2025</w:t>
         </w:r>
       </w:hyperlink>
-      <w:r>
-        <w:t xml:space="preserve">) to their local environment, users can run the open-source Consolidation and Auditing Rules (CAR) R scripts provided in our repository. These automatically apply all YAML amendments to compile the exact same historical spatio-temporal dataset locally.</w:t>
-      </w:r>
-    </w:p>
-    <w:p>
-      <w:pPr>
-        <w:pStyle w:val="BodyText"/>
-      </w:pPr>
-      <w:r>
-        <w:t xml:space="preserve">For temporal queries, users can filter states by</w:t>
-      </w:r>
-      <w:r>
-        <w:t xml:space="preserve"> </w:t>
-      </w:r>
-      <w:r>
-        <w:rPr>
-          <w:rStyle w:val="VerbatimChar"/>
-        </w:rPr>
-        <w:t xml:space="preserve">valid_from</w:t>
+    </w:p>
+    <w:bookmarkEnd w:id="43"/>
+    <w:bookmarkStart w:id="44" w:name="ref-Bingham2019a"/>
+    <w:p>
+      <w:pPr>
+        <w:pStyle w:val="Bibliography"/>
+      </w:pPr>
+      <w:r>
+        <w:t xml:space="preserve">Bingham HC, Deguignet M, Lewis E, et al (2019a) User</w:t>
+      </w:r>
+      <w:r>
+        <w:t xml:space="preserve"> </w:t>
+      </w:r>
+      <w:r>
+        <w:t xml:space="preserve">Manual</w:t>
+      </w:r>
+      <w:r>
+        <w:t xml:space="preserve"> </w:t>
+      </w:r>
+      <w:r>
+        <w:t xml:space="preserve">for the</w:t>
+      </w:r>
+      <w:r>
+        <w:t xml:space="preserve"> </w:t>
+      </w:r>
+      <w:r>
+        <w:t xml:space="preserve">World Database</w:t>
+      </w:r>
+      <w:r>
+        <w:t xml:space="preserve"> </w:t>
+      </w:r>
+      <w:r>
+        <w:t xml:space="preserve">on</w:t>
+      </w:r>
+      <w:r>
+        <w:t xml:space="preserve"> </w:t>
+      </w:r>
+      <w:r>
+        <w:t xml:space="preserve">Protected Areas</w:t>
+      </w:r>
+      <w:r>
+        <w:t xml:space="preserve"> </w:t>
+      </w:r>
+      <w:r>
+        <w:t xml:space="preserve">and world database on other effective area- based conservation measures: 1.6. UNEP-WCMC, Cambridge, UK</w:t>
+      </w:r>
+    </w:p>
+    <w:bookmarkEnd w:id="44"/>
+    <w:bookmarkStart w:id="45" w:name="ref-bingham2019b"/>
+    <w:p>
+      <w:pPr>
+        <w:pStyle w:val="Bibliography"/>
+      </w:pPr>
+      <w:r>
+        <w:t xml:space="preserve">Bingham HC, Juffe Bignoli D, Lewis E, et al (2019b) Sixty years of tracking conservation progress using the</w:t>
+      </w:r>
+      <w:r>
+        <w:t xml:space="preserve"> </w:t>
+      </w:r>
+      <w:r>
+        <w:t xml:space="preserve">World Database</w:t>
+      </w:r>
+      <w:r>
+        <w:t xml:space="preserve"> </w:t>
+      </w:r>
+      <w:r>
+        <w:t xml:space="preserve">on</w:t>
+      </w:r>
+      <w:r>
+        <w:t xml:space="preserve"> </w:t>
+      </w:r>
+      <w:r>
+        <w:t xml:space="preserve">Protected Areas</w:t>
+      </w:r>
+      <w:r>
+        <w:t xml:space="preserve">. Nature Ecology &amp; Evolution 3:737–743</w:t>
+      </w:r>
+    </w:p>
+    <w:bookmarkEnd w:id="45"/>
+    <w:bookmarkStart w:id="46" w:name="ref-Ebregt2000"/>
+    <w:p>
+      <w:pPr>
+        <w:pStyle w:val="Bibliography"/>
+      </w:pPr>
+      <w:r>
+        <w:t xml:space="preserve">Ebregt A, De Greve P (2000) Buffer</w:t>
+      </w:r>
+      <w:r>
+        <w:t xml:space="preserve"> </w:t>
+      </w:r>
+      <w:r>
+        <w:t xml:space="preserve">Zones</w:t>
+      </w:r>
+      <w:r>
+        <w:t xml:space="preserve"> </w:t>
+      </w:r>
+      <w:r>
+        <w:t xml:space="preserve">and their</w:t>
+      </w:r>
+      <w:r>
+        <w:t xml:space="preserve"> </w:t>
+      </w:r>
+      <w:r>
+        <w:t xml:space="preserve">Management</w:t>
+      </w:r>
+      <w:r>
+        <w:t xml:space="preserve">.</w:t>
+      </w:r>
+      <w:r>
+        <w:t xml:space="preserve"> </w:t>
+      </w:r>
+      <w:r>
+        <w:t xml:space="preserve">Policy</w:t>
       </w:r>
       <w:r>
         <w:t xml:space="preserve"> </w:t>
@@ -2045,536 +2497,152 @@
         <w:t xml:space="preserve"> </w:t>
       </w:r>
       <w:r>
-        <w:rPr>
-          <w:rStyle w:val="VerbatimChar"/>
-        </w:rPr>
-        <w:t xml:space="preserve">valid_to</w:t>
-      </w:r>
-      <w:r>
-        <w:t xml:space="preserve"> </w:t>
-      </w:r>
-      <w:r>
-        <w:t xml:space="preserve">to retrieve the configuration of any protected area at a given date. The</w:t>
-      </w:r>
-      <w:r>
-        <w:t xml:space="preserve"> </w:t>
-      </w:r>
-      <w:r>
-        <w:rPr>
-          <w:rStyle w:val="VerbatimChar"/>
-        </w:rPr>
-        <w:t xml:space="preserve">zone_type</w:t>
-      </w:r>
-      <w:r>
-        <w:t xml:space="preserve"> </w:t>
-      </w:r>
-      <w:r>
-        <w:t xml:space="preserve">field distinguishes external boundaries from internal zones, enabling analyses at different spatial scales.</w:t>
-      </w:r>
-    </w:p>
-    <w:p>
-      <w:pPr>
-        <w:pStyle w:val="BodyText"/>
-      </w:pPr>
-      <w:r>
-        <w:t xml:space="preserve">The YAML amendment registry is designed for collaborative extension. Researchers with access to complementary sources — additional legal texts, historical maps, field boundary surveys — can propose new amendments via GitHub pull requests. The CAR engine will automatically integrate validated amendments into subsequent dataset releases.</w:t>
-      </w:r>
-    </w:p>
-    <w:p>
-      <w:pPr>
-        <w:pStyle w:val="BodyText"/>
-      </w:pPr>
-      <w:r>
-        <w:t xml:space="preserve">Users should note that the WDPA baseline attributes are subject to UNEP-WCMC licensing terms regarding commercial use. The amendments and the temporal data model itself are released under a CC-BY 4.0 license. An interactive companion website provides visual exploration of the dataset, enabling users to browse individual protected areas, view their temporal trajectories, and compare boundaries across sources and time periods.</w:t>
-      </w:r>
-    </w:p>
-    <w:bookmarkEnd w:id="35"/>
-    <w:bookmarkStart w:id="38" w:name="data-availability-statement"/>
-    <w:p>
-      <w:pPr>
-        <w:pStyle w:val="Heading1"/>
-      </w:pPr>
-      <w:r>
-        <w:t xml:space="preserve">6. Data Availability Statement</w:t>
-      </w:r>
-    </w:p>
-    <w:p>
-      <w:pPr>
-        <w:pStyle w:val="FirstParagraph"/>
-      </w:pPr>
-      <w:r>
-        <w:t xml:space="preserve">The amendment registry (YAML and GeoJSON files) along with the source metadata is deposited on DataSuds, the institutional research data repository of the Institut de Recherche pour le Développement (IRD), under the DOI:</w:t>
-      </w:r>
-      <w:r>
-        <w:t xml:space="preserve"> </w:t>
-      </w:r>
-      <w:hyperlink r:id="rId36">
-        <w:r>
-          <w:rPr>
-            <w:rStyle w:val="Hyperlink"/>
-          </w:rPr>
-          <w:t xml:space="preserve">https://doi.org/10.23708/VN2TWC</w:t>
-        </w:r>
-      </w:hyperlink>
+        <w:t xml:space="preserve">Best Practices</w:t>
+      </w:r>
+      <w:r>
+        <w:t xml:space="preserve"> </w:t>
+      </w:r>
+      <w:r>
+        <w:t xml:space="preserve">for terrestrial ecosystems in developing countries.</w:t>
+      </w:r>
+      <w:r>
+        <w:t xml:space="preserve"> </w:t>
+      </w:r>
+      <w:r>
+        <w:t xml:space="preserve">Theme Studies Series</w:t>
+      </w:r>
+      <w:r>
+        <w:t xml:space="preserve"> </w:t>
+      </w:r>
+      <w:r>
+        <w:t xml:space="preserve">5,</w:t>
+      </w:r>
+      <w:r>
+        <w:t xml:space="preserve"> </w:t>
+      </w:r>
+      <w:r>
+        <w:t xml:space="preserve">Forest</w:t>
+      </w:r>
+      <w:r>
+        <w:t xml:space="preserve">,</w:t>
+      </w:r>
+      <w:r>
+        <w:t xml:space="preserve"> </w:t>
+      </w:r>
+      <w:r>
+        <w:t xml:space="preserve">Forestry</w:t>
+      </w:r>
+      <w:r>
+        <w:t xml:space="preserve"> </w:t>
+      </w:r>
+      <w:r>
+        <w:t xml:space="preserve">and</w:t>
+      </w:r>
+      <w:r>
+        <w:t xml:space="preserve"> </w:t>
+      </w:r>
+      <w:r>
+        <w:t xml:space="preserve">Biological Support Group</w:t>
+      </w:r>
       <w:r>
         <w:t xml:space="preserve">.</w:t>
       </w:r>
-    </w:p>
-    <w:p>
-      <w:pPr>
-        <w:pStyle w:val="BodyText"/>
-      </w:pPr>
-      <w:r>
-        <w:t xml:space="preserve">For the purpose of peer review, the fully consolidated datasets (</w:t>
-      </w:r>
-      <w:r>
-        <w:rPr>
-          <w:rStyle w:val="VerbatimChar"/>
-        </w:rPr>
-        <w:t xml:space="preserve">dynamic_wdpa.gpkg</w:t>
-      </w:r>
-      <w:r>
-        <w:t xml:space="preserve"> </w:t>
-      </w:r>
-      <w:r>
-        <w:t xml:space="preserve">and</w:t>
-      </w:r>
-      <w:r>
-        <w:t xml:space="preserve"> </w:t>
-      </w:r>
-      <w:r>
-        <w:rPr>
-          <w:rStyle w:val="VerbatimChar"/>
-        </w:rPr>
-        <w:t xml:space="preserve">dynamic_wdpa.parquet</w:t>
-      </w:r>
-      <w:r>
-        <w:t xml:space="preserve">) and the source amendment registry are provided via a secure, anonymous institutional drive. Reviewers can instantly and anonymously download the data without any login or password requirements at the following temporary link:</w:t>
-      </w:r>
-      <w:r>
-        <w:t xml:space="preserve"> </w:t>
-      </w:r>
-      <w:hyperlink r:id="rId37">
-        <w:r>
-          <w:rPr>
-            <w:rStyle w:val="Hyperlink"/>
-          </w:rPr>
-          <w:t xml:space="preserve">https://drive.ird.fr/s/cqo3bZr8RSA2LAM</w:t>
-        </w:r>
-      </w:hyperlink>
-    </w:p>
-    <w:p>
-      <w:pPr>
-        <w:pStyle w:val="BodyText"/>
-      </w:pPr>
-      <w:r>
-        <w:t xml:space="preserve">This dual-hosting arrangement is maintained pending final permission from UNEP-WCMC to publicly redistribute geometries derived from the WDPA baseline. Once permission is secured, the compiled geodata will be integrated directly into the DataSuds repository.</w:t>
-      </w:r>
-    </w:p>
-    <w:bookmarkEnd w:id="38"/>
-    <w:bookmarkStart w:id="40" w:name="code-availability"/>
-    <w:p>
-      <w:pPr>
-        <w:pStyle w:val="Heading1"/>
-      </w:pPr>
-      <w:r>
-        <w:t xml:space="preserve">7. Code Availability</w:t>
-      </w:r>
-    </w:p>
-    <w:p>
-      <w:pPr>
-        <w:pStyle w:val="FirstParagraph"/>
-      </w:pPr>
-      <w:r>
-        <w:t xml:space="preserve">All source code is available at</w:t>
-      </w:r>
-      <w:r>
-        <w:t xml:space="preserve"> </w:t>
-      </w:r>
-      <w:hyperlink r:id="rId39">
-        <w:r>
-          <w:rPr>
-            <w:rStyle w:val="Hyperlink"/>
-          </w:rPr>
-          <w:t xml:space="preserve">https://github.com/BETSAKA/conservation-dynamic-madagascar</w:t>
-        </w:r>
-      </w:hyperlink>
-      <w:r>
-        <w:t xml:space="preserve"> </w:t>
-      </w:r>
-      <w:r>
-        <w:t xml:space="preserve">under a CC-BY 4.0 license. The repository contains the complete Quarto book documenting all processing steps across nine chapters, the Shiny verification application, and the CAR consolidation engine. The code is archived via Software Heritage for long-term preservation, providing a persistent software identifier (SWHID).</w:t>
-      </w:r>
-    </w:p>
-    <w:bookmarkEnd w:id="40"/>
-    <w:bookmarkStart w:id="41" w:name="acknowledgements"/>
-    <w:p>
-      <w:pPr>
-        <w:pStyle w:val="Heading1"/>
-      </w:pPr>
-      <w:r>
-        <w:t xml:space="preserve">8. Acknowledgements</w:t>
-      </w:r>
-    </w:p>
-    <w:p>
-      <w:pPr>
-        <w:pStyle w:val="FirstParagraph"/>
-      </w:pPr>
-      <w:r>
-        <w:t xml:space="preserve">This work was conducted within the BETSAKA project, supported by KfW (grant BMZ 2018-68-538/KfW 108778), Agence Française de Développement (grant PAIRES-CZZ2557), Institut de Recherche pour le Développement (IRD) and Agence Nationale de la Recherche (grant ANR-22-CPJ1-0052-01). The project is coordinated by IRD/UMI-SOURCE and the Université d’Antananarivo/CERED. We thank the Vahatra Association for the foundational monograph on Madagascar’s protected areas, the CNLEGIS team for maintaining the national legislative database, and the organizations (MEDD, MNP, MBG, GERP, WWF) that shared core zone spatial data.</w:t>
-      </w:r>
-    </w:p>
-    <w:bookmarkEnd w:id="41"/>
-    <w:bookmarkStart w:id="42" w:name="funding"/>
-    <w:p>
-      <w:pPr>
-        <w:pStyle w:val="Heading1"/>
-      </w:pPr>
-      <w:r>
-        <w:t xml:space="preserve">9. Funding</w:t>
-      </w:r>
-    </w:p>
-    <w:p>
-      <w:pPr>
-        <w:pStyle w:val="FirstParagraph"/>
-      </w:pPr>
-      <w:r>
-        <w:t xml:space="preserve">This work was supported by KfW (grant number BMZ 2018-68-538 / KfW 108778), Agence Française de Développement (grant number PAIRES-CZZ2557), and Agence Nationale de la Recherche (grant number ANR-22-CPJ1-0052-01).</w:t>
-      </w:r>
-    </w:p>
-    <w:bookmarkEnd w:id="42"/>
-    <w:bookmarkStart w:id="43" w:name="author-contributions"/>
-    <w:p>
-      <w:pPr>
-        <w:pStyle w:val="Heading1"/>
-      </w:pPr>
-      <w:r>
-        <w:t xml:space="preserve">10. Author Contributions</w:t>
-      </w:r>
-    </w:p>
-    <w:p>
-      <w:pPr>
-        <w:pStyle w:val="FirstParagraph"/>
-      </w:pPr>
-      <w:r>
-        <w:t xml:space="preserve">Following the CRediT (Contributor Roles Taxonomy) framework: F.B.: Conceptualization, Methodology, Software, Formal analysis, Data curation, Writing – original draft, Visualization, Project administration. S.R.: Investigation, Data curation, Validation, Resources, Writing – review &amp; editing. O.D.A.: Investigation, Data curation, Validation, Resources, Writing – review &amp; editing.</w:t>
-      </w:r>
-    </w:p>
-    <w:bookmarkEnd w:id="43"/>
-    <w:bookmarkStart w:id="44" w:name="competing-interests"/>
-    <w:p>
-      <w:pPr>
-        <w:pStyle w:val="Heading1"/>
-      </w:pPr>
-      <w:r>
-        <w:t xml:space="preserve">11. Competing Interests</w:t>
-      </w:r>
-    </w:p>
-    <w:p>
-      <w:pPr>
-        <w:pStyle w:val="FirstParagraph"/>
-      </w:pPr>
-      <w:r>
-        <w:t xml:space="preserve">S.R. is a civil servant in charge of protected area governance at the Ministère de l’Environnement et du Développement Durable (MEDD) of Madagascar. O.D.A. heads the data information system and innovation unit at Madagascar National Parks (MNP). Producing and maintaining protected area information is part of their professional responsibilities. The authors have no financial conflicts of interest to declare.</w:t>
-      </w:r>
-    </w:p>
-    <w:bookmarkEnd w:id="44"/>
-    <w:bookmarkStart w:id="45" w:name="funding-1"/>
-    <w:p>
-      <w:pPr>
-        <w:pStyle w:val="Heading1"/>
-      </w:pPr>
-      <w:r>
-        <w:t xml:space="preserve">12. Funding</w:t>
-      </w:r>
-    </w:p>
-    <w:p>
-      <w:pPr>
-        <w:pStyle w:val="FirstParagraph"/>
-      </w:pPr>
-      <w:r>
-        <w:t xml:space="preserve">BETSAKA project, supported by KfW, Agence Française de Développement (AFD), Institut de Recherche pour le Développement (IRD), and Agence Nationale de la Recherche (ANR).</w:t>
-      </w:r>
-    </w:p>
-    <w:bookmarkEnd w:id="45"/>
-    <w:bookmarkStart w:id="59" w:name="references"/>
-    <w:p>
-      <w:pPr>
-        <w:pStyle w:val="Heading1"/>
-      </w:pPr>
-      <w:r>
-        <w:t xml:space="preserve">13. References</w:t>
-      </w:r>
-    </w:p>
-    <w:bookmarkStart w:id="58" w:name="refs"/>
-    <w:bookmarkStart w:id="46" w:name="ref-Bingham2019a"/>
+      <w:r>
+        <w:t xml:space="preserve"> </w:t>
+      </w:r>
+      <w:r>
+        <w:t xml:space="preserve">National Reference Centre</w:t>
+      </w:r>
+      <w:r>
+        <w:t xml:space="preserve"> </w:t>
+      </w:r>
+      <w:r>
+        <w:t xml:space="preserve">for</w:t>
+      </w:r>
+      <w:r>
+        <w:t xml:space="preserve"> </w:t>
+      </w:r>
+      <w:r>
+        <w:t xml:space="preserve">Nature Management</w:t>
+      </w:r>
+      <w:r>
+        <w:t xml:space="preserve">. International Agricultural Centre, The Netherlands, 64pp</w:t>
+      </w:r>
+    </w:p>
+    <w:bookmarkEnd w:id="46"/>
+    <w:bookmarkStart w:id="47" w:name="ref-Goodman2018"/>
     <w:p>
       <w:pPr>
         <w:pStyle w:val="Bibliography"/>
       </w:pPr>
       <w:r>
-        <w:t xml:space="preserve">Bingham HC, Deguignet M, Lewis E, et al (2019a) User</w:t>
-      </w:r>
-      <w:r>
-        <w:t xml:space="preserve"> </w:t>
-      </w:r>
-      <w:r>
-        <w:t xml:space="preserve">Manual</w:t>
-      </w:r>
-      <w:r>
-        <w:t xml:space="preserve"> </w:t>
-      </w:r>
-      <w:r>
-        <w:t xml:space="preserve">for the</w:t>
-      </w:r>
-      <w:r>
-        <w:t xml:space="preserve"> </w:t>
-      </w:r>
-      <w:r>
-        <w:t xml:space="preserve">World Database</w:t>
-      </w:r>
-      <w:r>
-        <w:t xml:space="preserve"> </w:t>
-      </w:r>
-      <w:r>
-        <w:t xml:space="preserve">on</w:t>
-      </w:r>
-      <w:r>
-        <w:t xml:space="preserve"> </w:t>
-      </w:r>
-      <w:r>
-        <w:t xml:space="preserve">Protected Areas</w:t>
-      </w:r>
-      <w:r>
-        <w:t xml:space="preserve"> </w:t>
-      </w:r>
-      <w:r>
-        <w:t xml:space="preserve">and world database on other effective area- based conservation measures: 1.6. UNEP-WCMC, Cambridge, UK</w:t>
-      </w:r>
-    </w:p>
-    <w:bookmarkEnd w:id="46"/>
-    <w:bookmarkStart w:id="47" w:name="ref-bingham2019b"/>
+        <w:t xml:space="preserve">Goodman SM, Raherilalao MJ, Wohlhauser S, et al (2018) Les aires protégées terrestres de</w:t>
+      </w:r>
+      <w:r>
+        <w:t xml:space="preserve"> </w:t>
+      </w:r>
+      <w:r>
+        <w:t xml:space="preserve">Madagascar</w:t>
+      </w:r>
+      <w:r>
+        <w:t xml:space="preserve">: Leur histoire, description et biote. Association Vahatra</w:t>
+      </w:r>
+    </w:p>
+    <w:bookmarkEnd w:id="47"/>
+    <w:bookmarkStart w:id="48" w:name="ref-lewisDynamicsGlobalProtectedarea2019"/>
     <w:p>
       <w:pPr>
         <w:pStyle w:val="Bibliography"/>
       </w:pPr>
       <w:r>
-        <w:t xml:space="preserve">Bingham HC, Juffe Bignoli D, Lewis E, et al (2019b) Sixty years of tracking conservation progress using the</w:t>
-      </w:r>
-      <w:r>
-        <w:t xml:space="preserve"> </w:t>
-      </w:r>
-      <w:r>
-        <w:t xml:space="preserve">World Database</w:t>
-      </w:r>
-      <w:r>
-        <w:t xml:space="preserve"> </w:t>
-      </w:r>
-      <w:r>
-        <w:t xml:space="preserve">on</w:t>
-      </w:r>
-      <w:r>
-        <w:t xml:space="preserve"> </w:t>
-      </w:r>
-      <w:r>
-        <w:t xml:space="preserve">Protected Areas</w:t>
-      </w:r>
-      <w:r>
-        <w:t xml:space="preserve">. Nature Ecology &amp; Evolution 3:737–743</w:t>
-      </w:r>
-    </w:p>
-    <w:bookmarkEnd w:id="47"/>
-    <w:bookmarkStart w:id="48" w:name="ref-Ebregt2000"/>
+        <w:t xml:space="preserve">Lewis E, MacSharry B, Juffe-Bignoli D, et al (2019) Dynamics in the global protected-area estate since 2004. Conservation Biology 33:570–579</w:t>
+      </w:r>
+    </w:p>
+    <w:bookmarkEnd w:id="48"/>
+    <w:bookmarkStart w:id="49" w:name="ref-Maxwell2020"/>
     <w:p>
       <w:pPr>
         <w:pStyle w:val="Bibliography"/>
       </w:pPr>
       <w:r>
-        <w:t xml:space="preserve">Ebregt A, De Greve P (2000) Buffer</w:t>
-      </w:r>
-      <w:r>
-        <w:t xml:space="preserve"> </w:t>
-      </w:r>
-      <w:r>
-        <w:t xml:space="preserve">Zones</w:t>
-      </w:r>
-      <w:r>
-        <w:t xml:space="preserve"> </w:t>
-      </w:r>
-      <w:r>
-        <w:t xml:space="preserve">and their</w:t>
-      </w:r>
-      <w:r>
-        <w:t xml:space="preserve"> </w:t>
-      </w:r>
-      <w:r>
-        <w:t xml:space="preserve">Management</w:t>
-      </w:r>
-      <w:r>
-        <w:t xml:space="preserve">.</w:t>
-      </w:r>
-      <w:r>
-        <w:t xml:space="preserve"> </w:t>
-      </w:r>
-      <w:r>
-        <w:t xml:space="preserve">Policy</w:t>
-      </w:r>
-      <w:r>
-        <w:t xml:space="preserve"> </w:t>
-      </w:r>
-      <w:r>
-        <w:t xml:space="preserve">and</w:t>
-      </w:r>
-      <w:r>
-        <w:t xml:space="preserve"> </w:t>
-      </w:r>
-      <w:r>
-        <w:t xml:space="preserve">Best Practices</w:t>
-      </w:r>
-      <w:r>
-        <w:t xml:space="preserve"> </w:t>
-      </w:r>
-      <w:r>
-        <w:t xml:space="preserve">for terrestrial ecosystems in developing countries.</w:t>
-      </w:r>
-      <w:r>
-        <w:t xml:space="preserve"> </w:t>
-      </w:r>
-      <w:r>
-        <w:t xml:space="preserve">Theme Studies Series</w:t>
-      </w:r>
-      <w:r>
-        <w:t xml:space="preserve"> </w:t>
-      </w:r>
-      <w:r>
-        <w:t xml:space="preserve">5,</w:t>
-      </w:r>
-      <w:r>
-        <w:t xml:space="preserve"> </w:t>
-      </w:r>
-      <w:r>
-        <w:t xml:space="preserve">Forest</w:t>
-      </w:r>
-      <w:r>
-        <w:t xml:space="preserve">,</w:t>
-      </w:r>
-      <w:r>
-        <w:t xml:space="preserve"> </w:t>
-      </w:r>
-      <w:r>
-        <w:t xml:space="preserve">Forestry</w:t>
-      </w:r>
-      <w:r>
-        <w:t xml:space="preserve"> </w:t>
-      </w:r>
-      <w:r>
-        <w:t xml:space="preserve">and</w:t>
-      </w:r>
-      <w:r>
-        <w:t xml:space="preserve"> </w:t>
-      </w:r>
-      <w:r>
-        <w:t xml:space="preserve">Biological Support Group</w:t>
-      </w:r>
-      <w:r>
-        <w:t xml:space="preserve">.</w:t>
-      </w:r>
-      <w:r>
-        <w:t xml:space="preserve"> </w:t>
-      </w:r>
-      <w:r>
-        <w:t xml:space="preserve">National Reference Centre</w:t>
-      </w:r>
-      <w:r>
-        <w:t xml:space="preserve"> </w:t>
-      </w:r>
-      <w:r>
-        <w:t xml:space="preserve">for</w:t>
-      </w:r>
-      <w:r>
-        <w:t xml:space="preserve"> </w:t>
-      </w:r>
-      <w:r>
-        <w:t xml:space="preserve">Nature Management</w:t>
-      </w:r>
-      <w:r>
-        <w:t xml:space="preserve">. International Agricultural Centre, The Netherlands, 64pp</w:t>
-      </w:r>
-    </w:p>
-    <w:bookmarkEnd w:id="48"/>
-    <w:bookmarkStart w:id="49" w:name="ref-Goodman2018"/>
+        <w:t xml:space="preserve">Maxwell SL, Cazalis V, Dudley N, et al (2020) Area-based conservation in the twenty-first century. Nature 586:217–227</w:t>
+      </w:r>
+    </w:p>
+    <w:bookmarkEnd w:id="49"/>
+    <w:bookmarkStart w:id="50" w:name="ref-symesWhyWeLose2016"/>
     <w:p>
       <w:pPr>
         <w:pStyle w:val="Bibliography"/>
       </w:pPr>
       <w:r>
-        <w:t xml:space="preserve">Goodman SM, Raherilalao MJ, Wohlhauser S, et al (2018) Les aires protégées terrestres de</w:t>
-      </w:r>
-      <w:r>
-        <w:t xml:space="preserve"> </w:t>
-      </w:r>
-      <w:r>
-        <w:t xml:space="preserve">Madagascar</w:t>
-      </w:r>
-      <w:r>
-        <w:t xml:space="preserve">: Leur histoire, description et biote. Association Vahatra</w:t>
-      </w:r>
-    </w:p>
-    <w:bookmarkEnd w:id="49"/>
-    <w:bookmarkStart w:id="50" w:name="ref-lewisDynamicsGlobalProtectedarea2019"/>
+        <w:t xml:space="preserve">Symes WS, Rao M, Mascia MB, Carrasco LR (2016) Why do we lose protected areas?</w:t>
+      </w:r>
+      <w:r>
+        <w:t xml:space="preserve"> </w:t>
+      </w:r>
+      <w:r>
+        <w:t xml:space="preserve">Factors</w:t>
+      </w:r>
+      <w:r>
+        <w:t xml:space="preserve"> </w:t>
+      </w:r>
+      <w:r>
+        <w:t xml:space="preserve">influencing protected area downgrading, downsizing and degazettement in the tropics and subtropics. Global Change Biology 22:656–665</w:t>
+      </w:r>
+    </w:p>
+    <w:bookmarkEnd w:id="50"/>
+    <w:bookmarkStart w:id="52" w:name="ref-unepwcmcWDPCAlicense"/>
     <w:p>
       <w:pPr>
         <w:pStyle w:val="Bibliography"/>
       </w:pPr>
       <w:r>
-        <w:t xml:space="preserve">Lewis E, MacSharry B, Juffe-Bignoli D, et al (2019) Dynamics in the global protected-area estate since 2004. Conservation Biology 33:570–579</w:t>
-      </w:r>
-    </w:p>
-    <w:bookmarkEnd w:id="50"/>
-    <w:bookmarkStart w:id="51" w:name="ref-Maxwell2020"/>
-    <w:p>
-      <w:pPr>
-        <w:pStyle w:val="Bibliography"/>
-      </w:pPr>
-      <w:r>
-        <w:t xml:space="preserve">Maxwell SL, Cazalis V, Dudley N, et al (2020) Area-based conservation in the twenty-first century. Nature 586:217–227</w:t>
-      </w:r>
-    </w:p>
-    <w:bookmarkEnd w:id="51"/>
-    <w:bookmarkStart w:id="52" w:name="ref-symesWhyWeLose2016"/>
-    <w:p>
-      <w:pPr>
-        <w:pStyle w:val="Bibliography"/>
-      </w:pPr>
-      <w:r>
-        <w:t xml:space="preserve">Symes WS, Rao M, Mascia MB, Carrasco LR (2016) Why do we lose protected areas?</w:t>
-      </w:r>
-      <w:r>
-        <w:t xml:space="preserve"> </w:t>
-      </w:r>
-      <w:r>
-        <w:t xml:space="preserve">Factors</w:t>
-      </w:r>
-      <w:r>
-        <w:t xml:space="preserve"> </w:t>
-      </w:r>
-      <w:r>
-        <w:t xml:space="preserve">influencing protected area downgrading, downsizing and degazettement in the tropics and subtropics. Global Change Biology 22:656–665</w:t>
-      </w:r>
-    </w:p>
-    <w:bookmarkEnd w:id="52"/>
-    <w:bookmarkStart w:id="54" w:name="ref-unepwcmcWDPCAlicense"/>
-    <w:p>
-      <w:pPr>
-        <w:pStyle w:val="Bibliography"/>
-      </w:pPr>
-      <w:r>
         <w:t xml:space="preserve">UNEP-WCMC (2026)</w:t>
       </w:r>
       <w:r>
         <w:t xml:space="preserve"> </w:t>
       </w:r>
-      <w:hyperlink r:id="rId53">
+      <w:hyperlink r:id="rId51">
         <w:r>
           <w:rPr>
             <w:rStyle w:val="Hyperlink"/>
@@ -2583,8 +2651,8 @@
         </w:r>
       </w:hyperlink>
     </w:p>
-    <w:bookmarkEnd w:id="54"/>
-    <w:bookmarkStart w:id="55" w:name="ref-unep2024"/>
+    <w:bookmarkEnd w:id="52"/>
+    <w:bookmarkStart w:id="53" w:name="ref-unep2024"/>
     <w:p>
       <w:pPr>
         <w:pStyle w:val="Bibliography"/>
@@ -2593,8 +2661,8 @@
         <w:t xml:space="preserve">UNEP-WCMC and IUCN (2024) Protected planet report 2024. UNEP-WCMC; IUCN, Cambridge, United Kingdom; Gland, Switzerland</w:t>
       </w:r>
     </w:p>
-    <w:bookmarkEnd w:id="55"/>
-    <w:bookmarkStart w:id="57" w:name="ref-Waeber2020"/>
+    <w:bookmarkEnd w:id="53"/>
+    <w:bookmarkStart w:id="55" w:name="ref-Waeber2020"/>
     <w:p>
       <w:pPr>
         <w:pStyle w:val="Bibliography"/>
@@ -2611,7 +2679,7 @@
       <w:r>
         <w:t xml:space="preserve">: Managing biodiversity for a sustainable future. Protected Areas, National Parks and Sustainable Future AN Bakar and MN Suratman (eds) 89–108. https://doi.org/</w:t>
       </w:r>
-      <w:hyperlink r:id="rId56">
+      <w:hyperlink r:id="rId54">
         <w:r>
           <w:rPr>
             <w:rStyle w:val="Hyperlink"/>
@@ -2620,9 +2688,9 @@
         </w:r>
       </w:hyperlink>
     </w:p>
+    <w:bookmarkEnd w:id="55"/>
+    <w:bookmarkEnd w:id="56"/>
     <w:bookmarkEnd w:id="57"/>
-    <w:bookmarkEnd w:id="58"/>
-    <w:bookmarkEnd w:id="59"/>
     <w:sectPr>
       <w:footnotePr>
         <w:numRestart w:val="eachSect"/>

</xml_diff>

<commit_message>
correct mentions to reproductibility
</commit_message>
<xml_diff>
--- a/paper/drafts/data_paper_scidata.docx
+++ b/paper/drafts/data_paper_scidata.docx
@@ -39,7 +39,7 @@
         <w:pStyle w:val="Date"/>
       </w:pPr>
       <w:r>
-        <w:t xml:space="preserve">2026-10-14</w:t>
+        <w:t xml:space="preserve">2026-10-16</w:t>
       </w:r>
     </w:p>
     <w:p>
@@ -55,7 +55,7 @@
         <w:pStyle w:val="Abstract"/>
       </w:pPr>
       <w:r>
-        <w:t xml:space="preserve">Georeferenced data on protected areas underpin much of the research studying the impacts of nature conservation on the environment and human wellbeing. Yet, existing databases typically record only the current state of each site. When boundaries or designations change, previous configurations are silently overwritten, preventing reliable temporal analyses and introducing bias in impact evaluations. We present a replicable temporal data model that extends the World Database on Protected Areas with time-bounded states documenting boundary modifications, status reclassifications, governance changes, temporary protections, and internal zoning. The model is designed to be generalizable to any national context and extensible to the full diversity of protected area modifications. We demonstrate it on Madagascar’s 123 terrestrial protected areas over 2000–2025, integrating historical archive snapshots, successive national system datasets, legal texts from the national legislative database, and expert literature. All amendments are stored in a version-controlled YAML registry and consolidated through deterministic rules implemented in R. The resulting dataset is distributed in GeoPackage and GeoParquet formats, enabling spatio-temporal analyses of conservation dynamics.</w:t>
+        <w:t xml:space="preserve">Georeferenced data on protected areas underpin much of the research studying the impacts of nature conservation on the environment and human wellbeing. Yet, existing databases typically record only the current state of each site. When boundaries or designations change, previous configurations are silently overwritten, preventing reliable temporal analyses and introducing bias in impact evaluations. We present a replicable temporal data model that extends the World Database on Protected Areas with time-bounded states documenting boundary modifications, status changes, temporary protections and internal zoning. The model is designed to be generalizable to any national context and extensible to the full diversity of protected area modifications. We demonstrate it on Madagascar’s 123 terrestrial protected areas over 2000–2025, integrating historical archive snapshots, successive national system datasets, legal texts from the national legislative database, and expert literature. All amendments are stored in a version-controlled YAML registry and consolidated through deterministic rules implemented in R. The resulting dataset is distributed in GeoPackage, RDS and GeoParquet formats, enabling spatio-temporal analyses of conservation dynamics. Although the sources and reconstruction process are country-specific, the amendment-based data model and consolidation engine can be applied to other national subsets of the WDPCA.</w:t>
       </w:r>
     </w:p>
     <w:p>
@@ -76,7 +76,7 @@
         <w:pStyle w:val="Heading1"/>
       </w:pPr>
       <w:r>
-        <w:t xml:space="preserve">1. Background &amp; Summary</w:t>
+        <w:t xml:space="preserve">Background &amp; Summary</w:t>
       </w:r>
     </w:p>
     <w:p>
@@ -231,7 +231,7 @@
         <w:pStyle w:val="BodyText"/>
       </w:pPr>
       <w:r>
-        <w:t xml:space="preserve">The problem, however, is not specific to Madagascar. In most countries, the WDPA contains protected areas whose histories of boundary and status changes are lost. The temporal data model we present here is designed to be generalizable to any country where complementary sources can supplement the WDPA baseline.</w:t>
+        <w:t xml:space="preserve">The problem, however, is not specific to Madagascar. In most countries, the WDPA contains protected areas whose histories of boundary and status changes are lost. The historical evidence needed to reconstruct these trajectories is inherently country-specific: legal systems, spatial archives, protected-area identifiers and institutional records differ widely across jurisdictions. The transferable component of our approach is therefore not a standardized reconstruction procedure, but a common data model for encoding reconstructed changes as dated amendments to a WDPCA baseline and consolidating them into temporal states.</w:t>
       </w:r>
     </w:p>
     <w:p>
@@ -239,7 +239,7 @@
         <w:pStyle w:val="BodyText"/>
       </w:pPr>
       <w:r>
-        <w:t xml:space="preserve">This paper presents three contributions. First, a temporal data model that extends the WDPA with time-bounded states, validity periods, legal source references, and secondary zoning, applicable to any national context. Second, a demonstration dataset covering 123 terrestrial protected areas in Madagascar from 2000 to 2025. Third, an open collaborative infrastructure consisting of a YAML amendment registry and a deterministic consolidation engine that enables other researchers to audit, correct, and extend the dataset through standard version control workflows. An interactive companion website allows visual exploration and verification of the data.</w:t>
+        <w:t xml:space="preserve">This paper presents three contributions. First, a reusable temporal data model that represents protected-area histories as time-bounded amendments to a current WDPCA baseline, including changes in external boundaries, legal status and internal zoning. Second, an application of this model to the 123 protected-area identities represented in Madagascar’s SAPM dataset over 2000–2025, reconstructed from country-specific spatial, legal and expert sources. Third, an open infrastructure consisting of a version-controlled YAML amendment registry and a deterministic consolidation engine, allowing curated histories to be audited, corrected and regenerated reproducibly.</w:t>
       </w:r>
     </w:p>
     <w:bookmarkEnd w:id="9"/>
@@ -249,7 +249,7 @@
         <w:pStyle w:val="Heading1"/>
       </w:pPr>
       <w:r>
-        <w:t xml:space="preserve">2. Methods</w:t>
+        <w:t xml:space="preserve">Methods</w:t>
       </w:r>
     </w:p>
     <w:p>
@@ -265,7 +265,7 @@
         <w:pStyle w:val="BodyText"/>
       </w:pPr>
       <w:r>
-        <w:t xml:space="preserve">The complete methodology is documented in a reproducible notebook accompanying this paper (see supplementary material). We summarize the key steps below and illustrate the overall workflow in</w:t>
+        <w:t xml:space="preserve">The complete workflow, source documentation, curation notebooks, amendment registry and consolidation code are publicly available in the associated GitHub repository and its rendered Quarto documentation. We summarize the key steps below and illustrate the overall workflow in</w:t>
       </w:r>
       <w:r>
         <w:t xml:space="preserve"> </w:t>
@@ -361,13 +361,21 @@
         </w:tc>
       </w:tr>
     </w:tbl>
+    <w:p>
+      <w:pPr>
+        <w:pStyle w:val="BodyText"/>
+      </w:pPr>
+      <w:r>
+        <w:t xml:space="preserve">The source-discovery and historical-reconstruction steps described below are specific to Madagascar and are not proposed as a standardized workflow for other countries. Generalizability instead lies in the downstream representation: once locally reconstructed changes are expressed through the amendment schema, the same consolidation model can transform any country-level WDPCA baseline into a temporal dataset.</w:t>
+      </w:r>
+    </w:p>
     <w:bookmarkStart w:id="14" w:name="input-data"/>
     <w:p>
       <w:pPr>
         <w:pStyle w:val="Heading2"/>
       </w:pPr>
       <w:r>
-        <w:t xml:space="preserve">2.1 Input data</w:t>
+        <w:t xml:space="preserve">Input data</w:t>
       </w:r>
     </w:p>
     <w:p>
@@ -520,7 +528,7 @@
         <w:t xml:space="preserve"> </w:t>
       </w:r>
       <w:r>
-        <w:t xml:space="preserve">field, enabling to identify the source actually used from sources that were consulted only during curation.</w:t>
+        <w:t xml:space="preserve">field, making possible to identify the source actually used from sources that were consulted only during curation.</w:t>
       </w:r>
       <w:r>
         <w:t xml:space="preserve"> </w:t>
@@ -545,7 +553,7 @@
         <w:pStyle w:val="Heading2"/>
       </w:pPr>
       <w:r>
-        <w:t xml:space="preserve">2.2 Consolidation and verification</w:t>
+        <w:t xml:space="preserve">Consolidation and verification</w:t>
       </w:r>
     </w:p>
     <w:p>
@@ -692,7 +700,7 @@
         <w:pStyle w:val="Heading2"/>
       </w:pPr>
       <w:r>
-        <w:t xml:space="preserve">2.3 YAML amendment registry</w:t>
+        <w:t xml:space="preserve">YAML amendment registry</w:t>
       </w:r>
     </w:p>
     <w:p>
@@ -718,7 +726,7 @@
         <w:pStyle w:val="Heading2"/>
       </w:pPr>
       <w:r>
-        <w:t xml:space="preserve">2.4 Consolidation and Auditing Rules</w:t>
+        <w:t xml:space="preserve">Consolidation and Auditing Rules</w:t>
       </w:r>
     </w:p>
     <w:p>
@@ -782,7 +790,7 @@
         <w:pStyle w:val="Heading1"/>
       </w:pPr>
       <w:r>
-        <w:t xml:space="preserve">3. Data Records</w:t>
+        <w:t xml:space="preserve">Data Records</w:t>
       </w:r>
     </w:p>
     <w:p>
@@ -1075,7 +1083,7 @@
                     <w:jc w:val="center"/>
                   </w:pPr>
                   <w:r>
-                    <w:t xml:space="preserve">Integer</w:t>
+                    <w:t xml:space="preserve">Character</w:t>
                   </w:r>
                 </w:p>
               </w:tc>
@@ -1740,24 +1748,7 @@
         <w:pStyle w:val="BodyText"/>
       </w:pPr>
       <w:r>
-        <w:t xml:space="preserve">The dataset covers 123 terrestrial protected areas in Madagascar with a temporal span from 2000 to 2025. Protected areas have between one and several temporal states depending on the documented amendments. Secondary zones are included for 73 protected areas where validated core zone shapefiles were available.</w:t>
-      </w:r>
-      <w:r>
-        <w:t xml:space="preserve"> </w:t>
-      </w:r>
-      <w:hyperlink w:anchor="fig-map">
-        <w:r>
-          <w:rPr>
-            <w:rStyle w:val="Hyperlink"/>
-          </w:rPr>
-          <w:t xml:space="preserve">Figure 3</w:t>
-        </w:r>
-      </w:hyperlink>
-      <w:r>
-        <w:t xml:space="preserve"> </w:t>
-      </w:r>
-      <w:r>
-        <w:t xml:space="preserve">shows the spatial distribution of protected areas colored by the number of documented temporal states, illustrating where the dataset adds information relative to the static WDPA.</w:t>
+        <w:t xml:space="preserve">The national temporal reconstruction targets the 123 protected-area identities represented in SAPM until beginning of 2026. The consolidated files additionally preserve the complete Madagascar WDPCA baseline, including proposed and international-designation records, together with one historical dissolved protected-area record. The current release therefore contains 168 distinct WDPAIDs, represented by 367 temporal states and 437 zone-state rows. Secondary zoning is included for 70 protected-area identities.</w:t>
       </w:r>
     </w:p>
     <w:tbl>
@@ -1832,7 +1823,7 @@
               <w:pStyle w:val="ImageCaption"/>
             </w:pPr>
             <w:r>
-              <w:t xml:space="preserve">Figure 3: Map of Madagascar’s 123 terrestrial protected areas</w:t>
+              <w:t xml:space="preserve">Figure 3: Map of Madagascar’s 123 terrestrial protected areas from SAPM, up to early 2026</w:t>
             </w:r>
           </w:p>
           <w:bookmarkEnd w:id="27"/>
@@ -1844,7 +1835,7 @@
         <w:pStyle w:val="BodyText"/>
       </w:pPr>
       <w:r>
-        <w:t xml:space="preserve">The data model and the associated infrastructure are designed to be generalizable to any country or region where complementary sources can supplement the WDPA baseline, and extensible to the full diversity of protected area modifications including boundary changes, status reclassifications, governance changes, temporary protections, and any form of internal zoning.</w:t>
+        <w:t xml:space="preserve">The amendment schema and consolidation engine are independent of the particular sources used in Madagascar. They can therefore be applied to another country or region once locally reconstructed historical information has been expressed as dated amendments to the corresponding WDPCA baseline.</w:t>
       </w:r>
     </w:p>
     <w:bookmarkEnd w:id="28"/>
@@ -1854,7 +1845,7 @@
         <w:pStyle w:val="Heading1"/>
       </w:pPr>
       <w:r>
-        <w:t xml:space="preserve">4. Technical Validation</w:t>
+        <w:t xml:space="preserve">Technical Validation</w:t>
       </w:r>
     </w:p>
     <w:p>
@@ -1916,22 +1907,7 @@
         <w:pStyle w:val="BodyText"/>
       </w:pPr>
       <w:r>
-        <w:t xml:space="preserve">All geometries were validated using</w:t>
-      </w:r>
-      <w:r>
-        <w:t xml:space="preserve"> </w:t>
-      </w:r>
-      <w:r>
-        <w:rPr>
-          <w:rStyle w:val="VerbatimChar"/>
-        </w:rPr>
-        <w:t xml:space="preserve">sf::st_make_valid()</w:t>
-      </w:r>
-      <w:r>
-        <w:t xml:space="preserve"> </w:t>
-      </w:r>
-      <w:r>
-        <w:t xml:space="preserve">in R. Core zones were verified to fall within their parent protected area’s external boundaries using spatial containment checks. Coordinate reference system consistency was enforced across all source datasets.</w:t>
+        <w:t xml:space="preserve">Curated amendment geometries were checked during processing and spatial review. Baseline WDPCA geometries are retained without silently modifying their topology, in order to preserve source fidelity.</w:t>
       </w:r>
     </w:p>
     <w:p>
@@ -2039,7 +2015,7 @@
         <w:pStyle w:val="Heading1"/>
       </w:pPr>
       <w:r>
-        <w:t xml:space="preserve">5. Usage Notes</w:t>
+        <w:t xml:space="preserve">Usage Notes</w:t>
       </w:r>
     </w:p>
     <w:p>
@@ -2139,6 +2115,9 @@
         <w:t xml:space="preserve">zone_type</w:t>
       </w:r>
       <w:r>
+        <w:t xml:space="preserve"> </w:t>
+      </w:r>
+      <w:r>
         <w:t xml:space="preserve">field distinguishes external protected-area boundaries from secondary zoning geometries.</w:t>
       </w:r>
       <w:r>
@@ -2180,7 +2159,7 @@
         <w:pStyle w:val="Heading1"/>
       </w:pPr>
       <w:r>
-        <w:t xml:space="preserve">6. Data Availability Statement</w:t>
+        <w:t xml:space="preserve">Data Availability Statement</w:t>
       </w:r>
     </w:p>
     <w:p>
@@ -2292,7 +2271,7 @@
         <w:pStyle w:val="Heading1"/>
       </w:pPr>
       <w:r>
-        <w:t xml:space="preserve">7. Code Availability</w:t>
+        <w:t xml:space="preserve">Code Availability</w:t>
       </w:r>
     </w:p>
     <w:p>
@@ -2310,7 +2289,7 @@
         <w:pStyle w:val="Heading1"/>
       </w:pPr>
       <w:r>
-        <w:t xml:space="preserve">8. Acknowledgements</w:t>
+        <w:t xml:space="preserve">Acknowledgements</w:t>
       </w:r>
     </w:p>
     <w:p>
@@ -2328,7 +2307,7 @@
         <w:pStyle w:val="Heading1"/>
       </w:pPr>
       <w:r>
-        <w:t xml:space="preserve">9. Funding</w:t>
+        <w:t xml:space="preserve">Funding</w:t>
       </w:r>
     </w:p>
     <w:p>
@@ -2346,7 +2325,7 @@
         <w:pStyle w:val="Heading1"/>
       </w:pPr>
       <w:r>
-        <w:t xml:space="preserve">10. Author Contributions</w:t>
+        <w:t xml:space="preserve">Author Contributions</w:t>
       </w:r>
     </w:p>
     <w:p>
@@ -2364,7 +2343,7 @@
         <w:pStyle w:val="Heading1"/>
       </w:pPr>
       <w:r>
-        <w:t xml:space="preserve">11. Competing Interests</w:t>
+        <w:t xml:space="preserve">Competing Interests</w:t>
       </w:r>
     </w:p>
     <w:p>
@@ -2382,7 +2361,7 @@
         <w:pStyle w:val="Heading1"/>
       </w:pPr>
       <w:r>
-        <w:t xml:space="preserve">12. Funding</w:t>
+        <w:t xml:space="preserve">Funding</w:t>
       </w:r>
     </w:p>
     <w:p>
@@ -2400,7 +2379,7 @@
         <w:pStyle w:val="Heading1"/>
       </w:pPr>
       <w:r>
-        <w:t xml:space="preserve">13. References</w:t>
+        <w:t xml:space="preserve">References</w:t>
       </w:r>
     </w:p>
     <w:bookmarkStart w:id="56" w:name="refs"/>

</xml_diff>

<commit_message>
harmonize dates and specify amendment scope and validation
</commit_message>
<xml_diff>
--- a/paper/drafts/data_paper_scidata.docx
+++ b/paper/drafts/data_paper_scidata.docx
@@ -239,7 +239,7 @@
         <w:pStyle w:val="BodyText"/>
       </w:pPr>
       <w:r>
-        <w:t xml:space="preserve">This paper presents three contributions. First, a reusable temporal data model that represents protected-area histories as time-bounded amendments to a current WDPCA baseline, including changes in external boundaries, legal status and internal zoning. Second, an application of this model to the 123 protected-area identities represented in Madagascar’s SAPM dataset over 2000–2025, reconstructed from country-specific spatial, legal and expert sources. Third, an open infrastructure consisting of a version-controlled YAML amendment registry and a deterministic consolidation engine, allowing curated histories to be audited, corrected and regenerated reproducibly.</w:t>
+        <w:t xml:space="preserve">This paper presents three contributions. First, a reusable temporal data model that represents protected-area histories as time-bounded amendments to a current WDPCA baseline, including changes in external boundaries, legal status and internal zoning. Second, an application of this model to the 123 protected areas that constituted Madagascar’s national protected-area system through late 2025, reconstructed over 2000–2025 from country-specific spatial, legal and expert sources. Third, an open infrastructure consisting of a version-controlled YAML amendment registry and a deterministic consolidation engine, allowing curated histories to be audited, corrected and regenerated reproducibly.</w:t>
       </w:r>
     </w:p>
     <w:bookmarkEnd w:id="9"/>
@@ -577,7 +577,7 @@
         <w:pStyle w:val="BodyText"/>
       </w:pPr>
       <w:r>
-        <w:t xml:space="preserve">Core zone shapefiles from five organizations (MEDD, MNP, MBG, GERP, WWF) were collected and validated against WDPA external boundaries through spatial containment checks, yielding 73 validated core zone geometries that were integrated as secondary zones in the temporal dataset.</w:t>
+        <w:t xml:space="preserve">Core zone shapefiles from five organizations (MEDD, MNP, MBG, GERP, WWF) were collected and compared with protected-area boundaries. Of the 73 protected areas for which exploitable zoning information was available, 70 fall within the temporal scope of the dataset and were integrated as secondary zones; three sites created in 2026 were excluded.</w:t>
       </w:r>
     </w:p>
     <w:p>
@@ -708,7 +708,7 @@
         <w:pStyle w:val="FirstParagraph"/>
       </w:pPr>
       <w:r>
-        <w:t xml:space="preserve">All corrections and temporal information are stored in a registry of YAML files, one per protected area, accompanied by GeoJSON geometry files where boundaries differ from the WDPA baseline. YAML was chosen because it is human-readable without specialized software, auditable in that each amendment includes the legal source, effective date, and amendment type, and Git-friendly in that text-based diffs enable collaborative editing with full change history tracking. Automated validation checks detect duplicate entries, temporal overlaps, and missing geometries.</w:t>
+        <w:t xml:space="preserve">All corrections and temporal information are stored in a version-controlled registry of YAML files, with one file for each amendment. GeoJSON files are associated with amendments that introduce a new geometry. YAML was chosen because it is human-readable without specialized software, auditable in that each amendment includes the legal source, effective date, and amendment type, and Git-friendly in that text-based diffs enable collaborative editing with full change history tracking. Automated validation checks detect duplicate entries, temporal overlaps, and missing geometries.</w:t>
       </w:r>
     </w:p>
     <w:p>
@@ -716,7 +716,7 @@
         <w:pStyle w:val="BodyText"/>
       </w:pPr>
       <w:r>
-        <w:t xml:space="preserve">The registry documents four types of amendments: boundary modifications (legally documented changes to external limits), status changes (reclassifications such as from Strict Nature Reserve to National Park), corrections (errors in the WDPA regarding dates, statuses, or geometries), and secondary zoning (internal zones including core zones and buffer zones).</w:t>
+        <w:t xml:space="preserve">The registry documents five types of amendments: boundary modifications, status changes, temporary protections, corrections to the WDPCA baseline, and secondary zoning.</w:t>
       </w:r>
     </w:p>
     <w:bookmarkEnd w:id="20"/>
@@ -1748,7 +1748,7 @@
         <w:pStyle w:val="BodyText"/>
       </w:pPr>
       <w:r>
-        <w:t xml:space="preserve">The national temporal reconstruction targets the 123 protected-area identities represented in SAPM until beginning of 2026. The consolidated files additionally preserve the complete Madagascar WDPCA baseline, including proposed and international-designation records, together with one historical dissolved protected-area record. The current release therefore contains 168 distinct WDPAIDs, represented by 367 temporal states and 437 zone-state rows. Secondary zoning is included for 70 protected-area identities.</w:t>
+        <w:t xml:space="preserve">The national temporal reconstruction targets the 123 protected-area that constituted Madagascar’s national protected area system until the end of 2025. The consolidated files additionally preserve the complete Madagascar WDPCA baseline, including proposed and international-designation records, together with one historical dissolved protected-area record. The current release therefore contains 168 distinct WDPAIDs, represented by 367 temporal states and 437 zone-state rows. Secondary zoning is included for 70 protected-area identities.</w:t>
       </w:r>
     </w:p>
     <w:tbl>
@@ -1861,7 +1861,7 @@
         <w:pStyle w:val="BodyText"/>
       </w:pPr>
       <w:r>
-        <w:t xml:space="preserve">Every amendment in the YAML registry is linked to a specific legal decision identified by its decree or order number, date, and URL in the CNLEGIS database. Domain experts reviewed all amendments through the interactive Shiny dashboard, verifying that recorded boundary changes and status modifications match the corresponding legal texts.</w:t>
+        <w:t xml:space="preserve">Every amendment in the YAML registry is linked to a specific legal Each amendment records its provenance and, where relevant, the legal instrument on which it is based. Legal amendments are linked to the corresponding decree or ministerial order and its effective date, while spatial amendments retain information on the source dataset from which their geometry was obtained.</w:t>
       </w:r>
     </w:p>
     <w:p>
@@ -1869,37 +1869,7 @@
         <w:pStyle w:val="BodyText"/>
       </w:pPr>
       <w:r>
-        <w:t xml:space="preserve">Automated checks enforce three invariants across the dataset: no overlapping validity periods exist for the same zone of the same protected area; no temporal gaps exist in the coverage of external boundaries from the creation date to the reference date; and</w:t>
-      </w:r>
-      <w:r>
-        <w:t xml:space="preserve"> </w:t>
-      </w:r>
-      <w:r>
-        <w:rPr>
-          <w:rStyle w:val="VerbatimChar"/>
-        </w:rPr>
-        <w:t xml:space="preserve">valid_from</w:t>
-      </w:r>
-      <w:r>
-        <w:t xml:space="preserve"> </w:t>
-      </w:r>
-      <w:r>
-        <w:t xml:space="preserve">is strictly earlier than</w:t>
-      </w:r>
-      <w:r>
-        <w:t xml:space="preserve"> </w:t>
-      </w:r>
-      <w:r>
-        <w:rPr>
-          <w:rStyle w:val="VerbatimChar"/>
-        </w:rPr>
-        <w:t xml:space="preserve">valid_to</w:t>
-      </w:r>
-      <w:r>
-        <w:t xml:space="preserve"> </w:t>
-      </w:r>
-      <w:r>
-        <w:t xml:space="preserve">for every state.</w:t>
+        <w:t xml:space="preserve">Automated checks are applied during consolidation to detect duplicate temporal states, invalid or overlapping validity periods, empty geometries, missing geometry provenance and inconsistent protected-area identifiers. Additional checks ensure that national historical information is not inadvertently assigned to distinct international WDPCA designations. The three distributed formats are also checked for consistency after generation.</w:t>
       </w:r>
     </w:p>
     <w:p>

</xml_diff>

<commit_message>
improve reproductibility and correct some details
</commit_message>
<xml_diff>
--- a/paper/drafts/data_paper_scidata.docx
+++ b/paper/drafts/data_paper_scidata.docx
@@ -55,7 +55,7 @@
         <w:pStyle w:val="Abstract"/>
       </w:pPr>
       <w:r>
-        <w:t xml:space="preserve">Georeferenced data on protected areas underpin much of the research studying the impacts of nature conservation on the environment and human wellbeing. Yet, existing databases typically record only the current state of each site. When boundaries or designations change, previous configurations are silently overwritten, preventing reliable temporal analyses and introducing bias in impact evaluations. We present a replicable temporal data model that extends the World Database on Protected Areas with time-bounded states documenting boundary modifications, status changes, temporary protections and internal zoning. The model is designed to be generalizable to any national context and extensible to the full diversity of protected area modifications. We apply the model to the 123 protected areas that constituted Madagascar’s national protected-area system through late 2025, reconstructing their histories over 2000–2025 from historical spatial datasets, successive national system datasets, legal texts from the national legislative database, and expert literature. All amendments are stored in a version-controlled YAML registry and consolidated through deterministic rules implemented in R. The resulting dataset is distributed in GeoPackage, RDS and GeoParquet formats, enabling spatio-temporal analyses of conservation dynamics. Although the sources and reconstruction process are country-specific, the amendment-based data model and consolidation engine can be applied to other national subsets of the WDPA.</w:t>
+        <w:t xml:space="preserve">Georeferenced data on protected areas underpin much of the research studying the impacts of nature conservation on the environment and human wellbeing. Yet, existing databases typically record only the current state of each site. When boundaries or designations change, previous configurations are silently overwritten, preventing reliable temporal analyses and introducing bias in impact evaluations. We present a replicable temporal data model that extends the World Database on Protected Areas with time-bounded states documenting boundary modifications, status changes, temporary protections and internal zoning. The model is designed to be generalizable to any national context and extensible to the full diversity of protected area modifications. We apply the model to the 123 protected areas that constituted Madagascar’s national protected-area system through late 2025, reconstructing their histories over 2000–2025 from historical spatial datasets, successive national system datasets, legal texts from the national legislative database, and expert literature. All amendments are stored in a version-controlled YAML registry and consolidated through deterministic rules implemented in R. The resulting dataset is distributed in GeoPackage, RDS and Parquet formats, enabling spatio-temporal analyses of conservation dynamics. Although the sources and reconstruction process are country-specific, the amendment-based data model and consolidation engine can be applied to other national subsets of the WDPA.</w:t>
       </w:r>
     </w:p>
     <w:p>
@@ -131,7 +131,7 @@
         <w:t xml:space="preserve"> </w:t>
       </w:r>
       <w:r>
-        <w:t xml:space="preserve">examined the factors driving PADDD events in the tropics and subtropics, showing that protected areas are not permanent — they can be reduced, reclassified, or revoked entirely.</w:t>
+        <w:t xml:space="preserve">examined the factors driving PADDD events in the tropics and subtropics, showing that protected areas are not permanent — they can be reduced, reclassified, or revoked entirely. Lewis et al.</w:t>
       </w:r>
       <w:r>
         <w:rPr>
@@ -176,7 +176,7 @@
         <w:pStyle w:val="BodyText"/>
       </w:pPr>
       <w:r>
-        <w:t xml:space="preserve">This matters for researchers from all disciplines that study conservation (biology, ecology, economics, anthropology, etc.). For instance, when impact evaluations assume that current boundaries have remained unchanged since a protected area was established, they may treat recently added areas as if they had been protected for much longer, inducing a downward biais. It is also relevant for policymakers, as protected areas have become a major instrument of spatial planning, with global terrestrial coverage exceeding 17% in 2023</w:t>
+        <w:t xml:space="preserve">This matters for researchers from all disciplines that study conservation (biology, ecology, economics, anthropology, etc.). For instance, when impact evaluations assume that current boundaries have remained unchanged since a protected area was established, they may treat recently added areas as if they had been protected for much longer, inducing a downward bias. It is also relevant for policymakers, as protected areas have become a major instrument of spatial planning, with global terrestrial coverage exceeding 17% in 2023</w:t>
       </w:r>
       <w:r>
         <w:rPr>
@@ -504,7 +504,7 @@
         <w:pStyle w:val="BodyText"/>
       </w:pPr>
       <w:r>
-        <w:t xml:space="preserve">Additional sources, including the</w:t>
+        <w:t xml:space="preserve">Additional sources, including the monograph by Goodman et al.</w:t>
       </w:r>
       <w:r>
         <w:rPr>
@@ -516,7 +516,7 @@
         <w:t xml:space="preserve"> </w:t>
       </w:r>
       <w:r>
-        <w:t xml:space="preserve">monograph and the associated Vahatra dataset, were used for historical interpretation, cross-checking and validation. Their geometries are not redistributed in the released dataset. Each geometry in the final files carries a</w:t>
+        <w:t xml:space="preserve">and the associated Vahatra dataset, were used for historical interpretation, cross-checking and validation. Their geometries are not redistributed in the released dataset. Each geometry in the final files carries a</w:t>
       </w:r>
       <w:r>
         <w:t xml:space="preserve"> </w:t>
@@ -534,7 +534,7 @@
         <w:t xml:space="preserve"> </w:t>
       </w:r>
       <w:r>
-        <w:t xml:space="preserve">Additional historical context was drawn from</w:t>
+        <w:t xml:space="preserve">Additional historical context was drawn from Waeber et al.</w:t>
       </w:r>
       <w:r>
         <w:rPr>
@@ -1535,7 +1535,7 @@
                     <w:jc w:val="center"/>
                   </w:pPr>
                   <w:r>
-                    <w:t xml:space="preserve">Integer</w:t>
+                    <w:t xml:space="preserve">Character</w:t>
                   </w:r>
                 </w:p>
               </w:tc>
@@ -1588,7 +1588,7 @@
                     <w:jc w:val="center"/>
                   </w:pPr>
                   <w:r>
-                    <w:t xml:space="preserve">Governance type inherited from the WDPA baseline unless explicitly amended</w:t>
+                    <w:t xml:space="preserve">Governance type inherited from the WDPA baseline in this release</w:t>
                   </w:r>
                 </w:p>
               </w:tc>
@@ -1629,7 +1629,7 @@
                     <w:jc w:val="center"/>
                   </w:pPr>
                   <w:r>
-                    <w:t xml:space="preserve">Management authority inherited from the WDPA baseline unless explicitly amended</w:t>
+                    <w:t xml:space="preserve">Management authority inherited from the WDPA baseline in this release</w:t>
                   </w:r>
                 </w:p>
               </w:tc>
@@ -1751,7 +1751,7 @@
         <w:pStyle w:val="BodyText"/>
       </w:pPr>
       <w:r>
-        <w:t xml:space="preserve">The national temporal reconstruction targets the 123 protected-area that constituted Madagascar’s national protected area system until the end of 2025. The consolidated files additionally preserve the complete Madagascar WDPA baseline, including proposed and international-designation records, together with one historical dissolved protected-area record. The current release therefore contains 168 distinct WDPAIDs, represented by 367 temporal states and 437 zone-state rows. Secondary zoning is included for 70 protected-area identities.</w:t>
+        <w:t xml:space="preserve">The national temporal reconstruction targets the 123 protected areas that constituted Madagascar’s national protected area system until the end of 2025. The consolidated files additionally preserve the complete Madagascar WDPA baseline, including proposed and international-designation records, together with one historical dissolved protected-area record. The current release therefore contains 168 distinct WDPAIDs, represented by 367 temporal states and 437 zone-state rows. Secondary zoning is included for 70 protected-area identities.</w:t>
       </w:r>
     </w:p>
     <w:tbl>
@@ -1856,7 +1856,7 @@
         <w:pStyle w:val="FirstParagraph"/>
       </w:pPr>
       <w:r>
-        <w:t xml:space="preserve">Every amendment in the YAML registry is linked to a specific legal Each amendment records its provenance and, where relevant, the legal instrument on which it is based. Legal amendments are linked to the corresponding decree or ministerial order and its effective date, while spatial amendments retain information on the source dataset from which their geometry was obtained.</w:t>
+        <w:t xml:space="preserve">Each amendment records its provenance and, where relevant, the legal instrument on which it is based. Legal amendments are linked to the corresponding decree or ministerial order and its effective date, while spatial amendments retain information on the source dataset from which their geometry was obtained.</w:t>
       </w:r>
     </w:p>
     <w:p>

</xml_diff>

<commit_message>
rerender + edits in manuscript
</commit_message>
<xml_diff>
--- a/paper/drafts/data_paper_scidata.docx
+++ b/paper/drafts/data_paper_scidata.docx
@@ -383,7 +383,19 @@
         <w:pStyle w:val="FirstParagraph"/>
       </w:pPr>
       <w:r>
-        <w:t xml:space="preserve">Four categories of source material were assembled during the data reconstruction and validation process: spatial datasets produced or maintained by Malagasy institutions responsible for protected areas; current and historical versions of the World Database on Protected Areas; official legal records from the national legislative database and public gazette (Journal Officiel); and expert sources used to reconstruct or verify protected-area histories. These materials played different roles in the workflow: some were used only to identify or validate potential changes, whereas a more restricted set provides geometries or attribute amendments to the released dataset.</w:t>
+        <w:t xml:space="preserve">Four categories of source material were assembled during the data reconstruction and validation process: spatial datasets produced or maintained by Malagasy institutions responsible for protected areas; current and historical versions of the World Database on Protected Areas; official legal records from the national legislative database and public gazette (Journal Officiel); and expert sources used to reconstruct or verify protected-area histories. These materials played different roles in the workflow: some were used only to identify or validate potential changes, whereas a more restricted set provides geometries or attribute amendments to the released dataset. Each geometry in the final files carries a</w:t>
+      </w:r>
+      <w:r>
+        <w:t xml:space="preserve"> </w:t>
+      </w:r>
+      <w:r>
+        <w:t xml:space="preserve">“geometry_source_dataset_id”</w:t>
+      </w:r>
+      <w:r>
+        <w:t xml:space="preserve"> </w:t>
+      </w:r>
+      <w:r>
+        <w:t xml:space="preserve">field, making it possible to identify the source actually used from sources that were consulted only during curation.</w:t>
       </w:r>
     </w:p>
     <w:p>
@@ -391,7 +403,7 @@
         <w:pStyle w:val="BodyText"/>
       </w:pPr>
       <w:r>
-        <w:t xml:space="preserve">The current WDPA provides the baseline geometry and attributes to which documented historical amendments are applied. The consolidated release presented here uses the November 2025 WDPA for Madagascar. Historical WDPA snapshots were additionally examined during data preparation and validation. In one documented case, a historical geometry was reconstructed by separating polygons from the November 2025 WDPA geometry (labelled WDPA_2025_split in the metadata). WDPA-derived material is identified explicitly in the provenance metadata.</w:t>
+        <w:t xml:space="preserve">The current WDPA provides the baseline geometry and attributes to which documented historical amendments are applied. The consolidated release presented here uses the November 2025 WDPA for Madagascar, obtained from Protected Planet (https://www.protectedplanet.net). Historical WDPA snapshots were additionally examined during data preparation and validation. Versions from July 2017 onward were accessed through the Google Earth Engine WDPA archive; earlier snapshots for 2010–2016 were recovered from UNEP-WCMC’s public AWS archive. In one documented case, a historical geometry was reconstructed by separating polygons from the November 2025 WDPA geometry (labelled WDPA_2025_split in the metadata). WDPA-derived material is identified explicitly in the provenance metadata.</w:t>
       </w:r>
     </w:p>
     <w:p>
@@ -411,7 +423,7 @@
         <w:t xml:space="preserve"> </w:t>
       </w:r>
       <w:r>
-        <w:t xml:space="preserve">is a historical spatial database of the Association Nationale pour la Gestion des Aires Protégées (ANGAP), which was renamed Madagascar National Parks (MNP) in 2008. Second, the sources</w:t>
+        <w:t xml:space="preserve">is a historical spatial database of the Association Nationale pour la Gestion des Aires Protégées (ANGAP), which was renamed Madagascar National Parks (MNP) in 2008. The other MNP sources incorporated in the released dataset are</w:t>
       </w:r>
       <w:r>
         <w:t xml:space="preserve"> </w:t>
@@ -426,31 +438,43 @@
         <w:t xml:space="preserve"> </w:t>
       </w:r>
       <w:r>
+        <w:t xml:space="preserve">“MNP_Anka_RNI_pre2002”</w:t>
+      </w:r>
+      <w:r>
+        <w:t xml:space="preserve"> </w:t>
+      </w:r>
+      <w:r>
+        <w:t xml:space="preserve">and</w:t>
+      </w:r>
+      <w:r>
+        <w:t xml:space="preserve"> </w:t>
+      </w:r>
+      <w:r>
+        <w:t xml:space="preserve">“MNP_Mantadia_pre2002”</w:t>
+      </w:r>
+      <w:r>
+        <w:t xml:space="preserve">;</w:t>
+      </w:r>
+      <w:r>
+        <w:t xml:space="preserve"> </w:t>
+      </w:r>
+      <w:r>
         <w:t xml:space="preserve">“MNP_2010_split”</w:t>
       </w:r>
       <w:r>
-        <w:t xml:space="preserve">,</w:t>
-      </w:r>
-      <w:r>
-        <w:t xml:space="preserve"> </w:t>
-      </w:r>
-      <w:r>
-        <w:t xml:space="preserve">“MNP_Anka_RNI_pre2002”</w:t>
-      </w:r>
-      <w:r>
-        <w:t xml:space="preserve">, and</w:t>
-      </w:r>
-      <w:r>
-        <w:t xml:space="preserve"> </w:t>
-      </w:r>
-      <w:r>
-        <w:t xml:space="preserve">“MNP_Mantadia_pre2002”</w:t>
-      </w:r>
-      <w:r>
-        <w:t xml:space="preserve"> </w:t>
-      </w:r>
-      <w:r>
-        <w:t xml:space="preserve">were produced or reconstructed by co-author Ollier D. Andrianambinina, Chef de Département Système d’Information et Innovation at MNP, in the combined context of his operational responsibilities at MNP and doctoral research on the use of spatial information for conservation research and management. These reconstructions draw on MNP spatial documentation and the legal descriptions of protected-area boundaries contained in official decrees and their annexes.</w:t>
+        <w:t xml:space="preserve"> </w:t>
+      </w:r>
+      <w:r>
+        <w:t xml:space="preserve">is a subdivision of</w:t>
+      </w:r>
+      <w:r>
+        <w:t xml:space="preserve"> </w:t>
+      </w:r>
+      <w:r>
+        <w:t xml:space="preserve">“MNP_2010”</w:t>
+      </w:r>
+      <w:r>
+        <w:t xml:space="preserve">, not an independent source. These geometries were produced, reconstructed or validated by co-author Ollier D. Andrianambinina in the context of his responsibilities at MNP and associated doctoral research. The original institutional source databases are not redistributed as such; requests concerning access to the underlying archives should be addressed to Madagascar National Parks, in particular its Information System and Innovation Department. MNP has provided written authorization for the use, adaptation, publication and redistribution of the ANGAP/MNP-derived geometries incorporated into this scientific dataset under CC BY 4.0, with appropriate attribution of their provenance.</w:t>
       </w:r>
     </w:p>
     <w:p>
@@ -458,37 +482,7 @@
         <w:pStyle w:val="BodyText"/>
       </w:pPr>
       <w:r>
-        <w:t xml:space="preserve">A second national stream consists of official spatial information produced or coordinated within the SAPM and the Ministry of Environment and Sustainable Development (MEDD). The geometries from this stream that enter the released dataset are identified as</w:t>
-      </w:r>
-      <w:r>
-        <w:t xml:space="preserve"> </w:t>
-      </w:r>
-      <w:r>
-        <w:t xml:space="preserve">“SAPM_evol_2001-2011”</w:t>
-      </w:r>
-      <w:r>
-        <w:t xml:space="preserve">,</w:t>
-      </w:r>
-      <w:r>
-        <w:t xml:space="preserve"> </w:t>
-      </w:r>
-      <w:r>
-        <w:t xml:space="preserve">“SAPM_2010”</w:t>
-      </w:r>
-      <w:r>
-        <w:t xml:space="preserve"> </w:t>
-      </w:r>
-      <w:r>
-        <w:t xml:space="preserve">and</w:t>
-      </w:r>
-      <w:r>
-        <w:t xml:space="preserve"> </w:t>
-      </w:r>
-      <w:r>
-        <w:t xml:space="preserve">“MEDD_subdivisions”</w:t>
-      </w:r>
-      <w:r>
-        <w:t xml:space="preserve">. Their provenance was verified within the institutional collaboration underlying this work, including by co-author Seheno Ramanantsoa, Chef du Service de la Gouvernance des Aires Protégées within the MEDD directorate responsible for protected areas and SAPM coordination.</w:t>
+        <w:t xml:space="preserve">A second national stream consists of official protected-area geographic information produced, compiled or coordinated within the SAPM and the Ministry of Environment and Sustainable Development (MEDD). The geometries from this stream that enter the released dataset are identified as SAPM_evol_2001-2011, SAPM_2010 and MEDD_subdivisions. The latter includes zoning information produced in the course of protected-area management, including by organizations operating under delegated management arrangements, and consolidated as part of the official geographic information associated with the protected-area system. Their institutional provenance and the legal framework governing the circulation and dissemination of protected-area geographic information were documented in a signed attestation by co-author Seheno Ramanantsoa, Head of the Protected Areas Governance Service within MEDD. The original historical source databases are not redistributed as such; requests concerning access to them should be addressed to the MEDD service responsible for protected-area governance and SAPM coordination.</w:t>
       </w:r>
     </w:p>
     <w:p>
@@ -496,7 +490,7 @@
         <w:pStyle w:val="BodyText"/>
       </w:pPr>
       <w:r>
-        <w:t xml:space="preserve">Attribute amendments were derived from official legal instruments, principally decrees and ministerial or interministerial orders published through the Journal Officiel and made accessible through the Centre National de Légistique (CNLEGIS). Approximately 200 protected-area-related legal decisions were compiled and linked to WDPA identifiers using textual and spatial matching followed by manual verification. These legal records provide the authoritative basis for dates of creation, temporary protection, status changes, boundary modifications, and other dated amendments. WDPA attributes that are not explicitly amended are inherited from the baseline.</w:t>
+        <w:t xml:space="preserve">Attribute amendments were derived from official legal registry, principally decrees and ministerial or interministerial orders published through the Journal Officiel and made accessible through the Centre National de Légistique (CNLEGIS). These records were accessed through the CNLEGIS legislative database (https://www.cnlegis.gov.mg), using searches by legal instrument number, date, type and protected-area name or related keywords. Approximately 200 protected-area-related legal decisions were compiled and linked to WDPA identifiers using textual and spatial matching followed by manual verification. These legal records provide the authoritative basis for dates of creation, temporary protection, status changes, boundary modifications, and other dated amendments. WDPA attributes that are not explicitly amended are inherited from the baseline.</w:t>
       </w:r>
     </w:p>
     <w:p>
@@ -516,23 +510,13 @@
         <w:t xml:space="preserve"> </w:t>
       </w:r>
       <w:r>
-        <w:t xml:space="preserve">and the associated Vahatra dataset, were used for historical interpretation, cross-checking and validation. Their geometries are not redistributed in the released dataset. Each geometry in the final files carries a</w:t>
-      </w:r>
-      <w:r>
-        <w:t xml:space="preserve"> </w:t>
-      </w:r>
-      <w:r>
-        <w:t xml:space="preserve">“geometry_source_dataset_id”</w:t>
-      </w:r>
-      <w:r>
-        <w:t xml:space="preserve"> </w:t>
-      </w:r>
-      <w:r>
-        <w:t xml:space="preserve">field, making it possible to identify the source actually used from sources that were consulted only during curation.</w:t>
-      </w:r>
-      <w:r>
-        <w:t xml:space="preserve"> </w:t>
-      </w:r>
+        <w:t xml:space="preserve">and the associated Vahatra dataset, were used for historical interpretation, cross-checking and validation. Vahatra disseminates these geometries under a CC-BY license on the institutional website (https://protectedareas.mg), but these geometries are not redistributed in our released dataset.</w:t>
+      </w:r>
+    </w:p>
+    <w:p>
+      <w:pPr>
+        <w:pStyle w:val="BodyText"/>
+      </w:pPr>
       <w:r>
         <w:t xml:space="preserve">Additional historical context was drawn from Waeber et al.</w:t>
       </w:r>
@@ -577,7 +561,16 @@
         <w:pStyle w:val="BodyText"/>
       </w:pPr>
       <w:r>
-        <w:t xml:space="preserve">Core zone shapefiles from five organizations (MEDD, MNP, MBG, GERP, WWF) were collected and compared with protected-area boundaries. Of the 73 protected areas for which exploitable zoning information was available, 70 fall within the temporal scope of the dataset and were integrated as secondary zones; three sites created in 2026 were excluded.</w:t>
+        <w:t xml:space="preserve">Core-zone shapefiles produced by protected-area managers, including MEDD, MNP, MBG, GERP and WWF, were assembled and compared with protected-area boundaries. These zoning data form part of the geographic information associated with the official management of protected areas under MEDD responsibility, including where MEDD delegates its management mandate to another organization. For the released dataset, the selected and harmonized zoning geometries are recorded under the source identifier</w:t>
+      </w:r>
+      <w:r>
+        <w:t xml:space="preserve"> </w:t>
+      </w:r>
+      <w:r>
+        <w:t xml:space="preserve">“MEDD_subdivisions”</w:t>
+      </w:r>
+      <w:r>
+        <w:t xml:space="preserve">. Of the 73 protected areas for which exploitable zoning information was available, 70 fall within the temporal scope of the dataset and were integrated as secondary zones; three sites created in 2026 were excluded.</w:t>
       </w:r>
     </w:p>
     <w:p>
@@ -740,10 +733,7 @@
         <w:t xml:space="preserve"> </w:t>
       </w:r>
       <w:r>
-        <w:rPr>
-          <w:rStyle w:val="VerbatimChar"/>
-        </w:rPr>
-        <w:t xml:space="preserve">generate_timeline()</w:t>
+        <w:t xml:space="preserve">“generate_timeline()”</w:t>
       </w:r>
       <w:r>
         <w:t xml:space="preserve"> </w:t>
@@ -755,10 +745,7 @@
         <w:t xml:space="preserve"> </w:t>
       </w:r>
       <w:r>
-        <w:rPr>
-          <w:rStyle w:val="VerbatimChar"/>
-        </w:rPr>
-        <w:t xml:space="preserve">find_active_amendments()</w:t>
+        <w:t xml:space="preserve">“find_active_amendments()”</w:t>
       </w:r>
       <w:r>
         <w:t xml:space="preserve"> </w:t>
@@ -770,10 +757,7 @@
         <w:t xml:space="preserve"> </w:t>
       </w:r>
       <w:r>
-        <w:rPr>
-          <w:rStyle w:val="VerbatimChar"/>
-        </w:rPr>
-        <w:t xml:space="preserve">consolidate_pa_states()</w:t>
+        <w:t xml:space="preserve">“consolidate_pa_states()”</w:t>
       </w:r>
       <w:r>
         <w:t xml:space="preserve"> </w:t>
@@ -813,10 +797,7 @@
         <w:t xml:space="preserve"> </w:t>
       </w:r>
       <w:r>
-        <w:rPr>
-          <w:rStyle w:val="VerbatimChar"/>
-        </w:rPr>
-        <w:t xml:space="preserve">dynamic_wdpa.gpkg</w:t>
+        <w:t xml:space="preserve">“dynamic_wdpa.gpkg”</w:t>
       </w:r>
       <w:r>
         <w:t xml:space="preserve">,</w:t>
@@ -825,10 +806,7 @@
         <w:t xml:space="preserve"> </w:t>
       </w:r>
       <w:r>
-        <w:rPr>
-          <w:rStyle w:val="VerbatimChar"/>
-        </w:rPr>
-        <w:t xml:space="preserve">dynamic_wdpa.rds</w:t>
+        <w:t xml:space="preserve">“dynamic_wdpa.rds”</w:t>
       </w:r>
       <w:r>
         <w:t xml:space="preserve">, and</w:t>
@@ -837,10 +815,7 @@
         <w:t xml:space="preserve"> </w:t>
       </w:r>
       <w:r>
-        <w:rPr>
-          <w:rStyle w:val="VerbatimChar"/>
-        </w:rPr>
-        <w:t xml:space="preserve">dynamic_wdpa.parquet</w:t>
+        <w:t xml:space="preserve">“dynamic_wdpa.parquet”</w:t>
       </w:r>
       <w:r>
         <w:t xml:space="preserve">. These three consolidated files contain the same information in distinct formats suited respectively to GIS software, R, and a broader range of data analysis solutions. The file</w:t>
@@ -849,10 +824,7 @@
         <w:t xml:space="preserve"> </w:t>
       </w:r>
       <w:r>
-        <w:rPr>
-          <w:rStyle w:val="VerbatimChar"/>
-        </w:rPr>
-        <w:t xml:space="preserve">amendments.zip</w:t>
+        <w:t xml:space="preserve">“amendments.zip”</w:t>
       </w:r>
       <w:r>
         <w:t xml:space="preserve"> </w:t>
@@ -889,10 +861,7 @@
         <w:t xml:space="preserve"> </w:t>
       </w:r>
       <w:r>
-        <w:rPr>
-          <w:rStyle w:val="VerbatimChar"/>
-        </w:rPr>
-        <w:t xml:space="preserve">amendment_source</w:t>
+        <w:t xml:space="preserve">“amendment_source”</w:t>
       </w:r>
       <w:r>
         <w:t xml:space="preserve"> </w:t>
@@ -904,10 +873,7 @@
         <w:t xml:space="preserve"> </w:t>
       </w:r>
       <w:r>
-        <w:rPr>
-          <w:rStyle w:val="VerbatimChar"/>
-        </w:rPr>
-        <w:t xml:space="preserve">geometry_source_dataset_id</w:t>
+        <w:t xml:space="preserve">“geometry_source_dataset_id”</w:t>
       </w:r>
       <w:r>
         <w:t xml:space="preserve"> </w:t>
@@ -1838,7 +1804,7 @@
         <w:pStyle w:val="BodyText"/>
       </w:pPr>
       <w:r>
-        <w:t xml:space="preserve">The temporal reconstruction changes the inferred evolution of protected-area extent. Figure</w:t>
+        <w:t xml:space="preserve">The temporal reconstruction changes the inferred evolution of protected-area extent.</w:t>
       </w:r>
       <w:r>
         <w:t xml:space="preserve"> </w:t>
@@ -1861,10 +1827,7 @@
         <w:t xml:space="preserve"> </w:t>
       </w:r>
       <w:r>
-        <w:rPr>
-          <w:rStyle w:val="VerbatimChar"/>
-        </w:rPr>
-        <w:t xml:space="preserve">STATUS_YR</w:t>
+        <w:t xml:space="preserve">“STATUS_YR”</w:t>
       </w:r>
       <w:r>
         <w:t xml:space="preserve"> </w:t>
@@ -1951,10 +1914,7 @@
               <w:t xml:space="preserve"> </w:t>
             </w:r>
             <w:r>
-              <w:rPr>
-                <w:rStyle w:val="VerbatimChar"/>
-              </w:rPr>
-              <w:t xml:space="preserve">STATUS_YR</w:t>
+              <w:t xml:space="preserve">“STATUS_YR”</w:t>
             </w:r>
             <w:r>
               <w:t xml:space="preserve">; records with an unreported status year are excluded. The temporally extended series uses the external-boundary state in force at the end of each year.</w:t>
@@ -2133,10 +2093,7 @@
         <w:t xml:space="preserve"> </w:t>
       </w:r>
       <w:r>
-        <w:rPr>
-          <w:rStyle w:val="VerbatimChar"/>
-        </w:rPr>
-        <w:t xml:space="preserve">WDPAID</w:t>
+        <w:t xml:space="preserve">“WDPAID”</w:t>
       </w:r>
       <w:r>
         <w:t xml:space="preserve"> </w:t>
@@ -2156,10 +2113,7 @@
         <w:t xml:space="preserve"> </w:t>
       </w:r>
       <w:r>
-        <w:rPr>
-          <w:rStyle w:val="VerbatimChar"/>
-        </w:rPr>
-        <w:t xml:space="preserve">valid_from</w:t>
+        <w:t xml:space="preserve">“valid_from”</w:t>
       </w:r>
       <w:r>
         <w:t xml:space="preserve"> </w:t>
@@ -2171,10 +2125,7 @@
         <w:t xml:space="preserve"> </w:t>
       </w:r>
       <w:r>
-        <w:rPr>
-          <w:rStyle w:val="VerbatimChar"/>
-        </w:rPr>
-        <w:t xml:space="preserve">valid_to</w:t>
+        <w:t xml:space="preserve">“valid_to”</w:t>
       </w:r>
       <w:r>
         <w:t xml:space="preserve">. Validity intervals follow a start-inclusive and end-exclusive convention. An</w:t>
@@ -2183,10 +2134,7 @@
         <w:t xml:space="preserve"> </w:t>
       </w:r>
       <w:r>
-        <w:rPr>
-          <w:rStyle w:val="VerbatimChar"/>
-        </w:rPr>
-        <w:t xml:space="preserve">NA</w:t>
+        <w:t xml:space="preserve">“NA”</w:t>
       </w:r>
       <w:r>
         <w:t xml:space="preserve"> </w:t>
@@ -2198,10 +2146,7 @@
         <w:t xml:space="preserve"> </w:t>
       </w:r>
       <w:r>
-        <w:rPr>
-          <w:rStyle w:val="VerbatimChar"/>
-        </w:rPr>
-        <w:t xml:space="preserve">valid_to</w:t>
+        <w:t xml:space="preserve">“valid_to”</w:t>
       </w:r>
       <w:r>
         <w:t xml:space="preserve"> </w:t>
@@ -2213,10 +2158,7 @@
         <w:t xml:space="preserve"> </w:t>
       </w:r>
       <w:r>
-        <w:rPr>
-          <w:rStyle w:val="VerbatimChar"/>
-        </w:rPr>
-        <w:t xml:space="preserve">zone_type</w:t>
+        <w:t xml:space="preserve">“zone_type”</w:t>
       </w:r>
       <w:r>
         <w:t xml:space="preserve"> </w:t>
@@ -2224,9 +2166,11 @@
       <w:r>
         <w:t xml:space="preserve">field distinguishes external protected-area boundaries from secondary zoning geometries.</w:t>
       </w:r>
-      <w:r>
-        <w:t xml:space="preserve"> </w:t>
-      </w:r>
+    </w:p>
+    <w:p>
+      <w:pPr>
+        <w:pStyle w:val="BodyText"/>
+      </w:pPr>
       <w:r>
         <w:t xml:space="preserve">Researchers wishing to update the dataset beyond the November 2025 baseline can download a more recent WDPA release from Protected Planet and apply the published amendment registry using the Consolidation and Auditing Rules provided in the GitHub repository. This reconstruction route uses the curated YAML and GeoJSON amendment registry as input and does not require repeating the complete historical source-curation process.</w:t>
       </w:r>
@@ -2286,10 +2230,7 @@
         <w:t xml:space="preserve"> </w:t>
       </w:r>
       <w:r>
-        <w:rPr>
-          <w:rStyle w:val="VerbatimChar"/>
-        </w:rPr>
-        <w:t xml:space="preserve">dynamic_wdpa.gpkg</w:t>
+        <w:t xml:space="preserve">“dynamic_wdpa.gpkg”</w:t>
       </w:r>
       <w:r>
         <w:t xml:space="preserve">,</w:t>
@@ -2298,10 +2239,7 @@
         <w:t xml:space="preserve"> </w:t>
       </w:r>
       <w:r>
-        <w:rPr>
-          <w:rStyle w:val="VerbatimChar"/>
-        </w:rPr>
-        <w:t xml:space="preserve">dynamic_wdpa.parquet</w:t>
+        <w:t xml:space="preserve">“dynamic_wdpa.parquet”</w:t>
       </w:r>
       <w:r>
         <w:t xml:space="preserve">, and</w:t>
@@ -2310,10 +2248,7 @@
         <w:t xml:space="preserve"> </w:t>
       </w:r>
       <w:r>
-        <w:rPr>
-          <w:rStyle w:val="VerbatimChar"/>
-        </w:rPr>
-        <w:t xml:space="preserve">dynamic_wdpa.rds</w:t>
+        <w:t xml:space="preserve">“dynamic_wdpa.rds”</w:t>
       </w:r>
       <w:r>
         <w:t xml:space="preserve">, together with the archived amendment registry</w:t>
@@ -2322,10 +2257,7 @@
         <w:t xml:space="preserve"> </w:t>
       </w:r>
       <w:r>
-        <w:rPr>
-          <w:rStyle w:val="VerbatimChar"/>
-        </w:rPr>
-        <w:t xml:space="preserve">amendments.zip</w:t>
+        <w:t xml:space="preserve">“amendments.zip”</w:t>
       </w:r>
       <w:r>
         <w:t xml:space="preserve">, which contains a snapshot of the version-controlled YAML amendment registry and associated GeoJSON geometries. The three consolidated files contain the same substantive information in formats suited respectively to GIS software, R, and broader analytical workflows.</w:t>
@@ -2353,16 +2285,21 @@
         <w:pStyle w:val="BodyText"/>
       </w:pPr>
       <w:r>
+        <w:t xml:space="preserve">Source-specific reuse conditions apply to third-party material incorporated into the dataset. UNEP-WCMC has provided written authorization for redistribution of the Madagascar-specific WDPA-derived outputs for the non-commercial use case described here; commercial use of WDPA material or derivative works requires prior written permission from UNEP-WCMC. Madagascar National Parks has authorized the use, adaptation, publication and redistribution under CC BY 4.0 of the ANGAP/MNP-derived geometries incorporated into this dataset. For the SAPM/MEDD sources, including protected-area zoning information produced in the course of delegated management, their institutional provenance and the legal basis for public dissemination of protected-area geographic information have been documented in a signed attestation by co-author Seheno Ramanantsoa, Head of the Protected Areas Governance Service within MEDD. The attestation documents the statutory role of the ministry in the publication and dissemination of protected-area boundaries, zoning and associated geographic information; it does not constitute a general open licence for the underlying historical SAPM/MEDD databases.</w:t>
+      </w:r>
+    </w:p>
+    <w:p>
+      <w:pPr>
+        <w:pStyle w:val="BodyText"/>
+      </w:pPr>
+      <w:r>
         <w:t xml:space="preserve">Geometry-level provenance is recorded in</w:t>
       </w:r>
       <w:r>
         <w:t xml:space="preserve"> </w:t>
       </w:r>
       <w:r>
-        <w:rPr>
-          <w:rStyle w:val="VerbatimChar"/>
-        </w:rPr>
-        <w:t xml:space="preserve">geometry_source_dataset_id</w:t>
+        <w:t xml:space="preserve">“geometry_source_dataset_id”</w:t>
       </w:r>
       <w:r>
         <w:t xml:space="preserve">, while amendment-level provenance and corresponding legal sources are documented in the YAML registry. Source datasets that are not themselves redistributed can therefore be identified from the published metadata.</w:t>
@@ -2455,7 +2392,7 @@
         <w:pStyle w:val="FirstParagraph"/>
       </w:pPr>
       <w:r>
-        <w:t xml:space="preserve">S.R. is a civil servant in charge of protected area governance at the Ministère de l’Environnement et du Développement Durable (MEDD) of Madagascar. O.D.A. heads the data information system and innovation unit at Madagascar National Parks (MNP). Producing and maintaining protected area information is part of their professional responsibilities. The authors have no financial conflicts of interest to declare.</w:t>
+        <w:t xml:space="preserve">S.R. is a civil servant in charge of protected area governance at the Ministère de l’Environnement et du Développement Durable of Madagascar. O.D.A. heads the data information system and innovation unit at Madagascar National Parks. Producing and maintaining protected area information is part of their professional responsibilities. The authors have no financial conflicts of interest to declare.</w:t>
       </w:r>
     </w:p>
     <w:bookmarkEnd w:id="44"/>
@@ -3153,7 +3090,7 @@
           <w:rPr>
             <w:rStyle w:val="Hyperlink"/>
           </w:rPr>
-          <w:t xml:space="preserve">WDPCA data license</w:t>
+          <w:t xml:space="preserve">WDPA data license</w:t>
         </w:r>
       </w:hyperlink>
       <w:r>

</xml_diff>

<commit_message>
add line numbers and CNLEGIS acronym explainer
</commit_message>
<xml_diff>
--- a/paper/drafts/data_paper_scidata.docx
+++ b/paper/drafts/data_paper_scidata.docx
@@ -4,7 +4,7 @@
   <w:body>
     <w:p>
       <w:pPr>
-        <w:pStyle w:val="Title"/>
+        <w:pStyle w:val="Titre"/>
       </w:pPr>
       <w:r>
         <w:t xml:space="preserve">A replicable temporal extension of protected area geodata applied to 123 sites in Madagascar</w:t>
@@ -73,7 +73,7 @@
     <w:bookmarkStart w:id="9" w:name="background-summary"/>
     <w:p>
       <w:pPr>
-        <w:pStyle w:val="Heading1"/>
+        <w:pStyle w:val="Titre1"/>
       </w:pPr>
       <w:r>
         <w:t xml:space="preserve">Background &amp; Summary</w:t>
@@ -107,7 +107,7 @@
     </w:p>
     <w:p>
       <w:pPr>
-        <w:pStyle w:val="BodyText"/>
+        <w:pStyle w:val="Corpsdetexte"/>
       </w:pPr>
       <w:r>
         <w:t xml:space="preserve">The WDPA, however, was designed as a snapshot database. It records the current state of each protected area, and when boundaries or designations change, the previous configuration is overwritten. The WDPA user manual itself warns against using the STATUS_YR field for historical analysis, and degazetted sites are simply removed from the database</w:t>
@@ -148,7 +148,7 @@
     </w:p>
     <w:p>
       <w:pPr>
-        <w:pStyle w:val="BodyText"/>
+        <w:pStyle w:val="Corpsdetexte"/>
       </w:pPr>
       <w:r>
         <w:t xml:space="preserve">What remains largely unaddressed is the continuous evolution of ongoing protected areas. Between creation and the present, many sites undergo boundary modifications, status reclassifications (for instance from Strict Nature Reserve to National Park), governance changes, internal zoning, or temporary protection decrees. None of these transformations are preserved in the WDPA’s current-state model: each update silently replaces the previous configuration, making it impossible to reconstruct what a protected area looked like at any given date in the past.</w:t>
@@ -156,7 +156,7 @@
     </w:p>
     <w:p>
       <w:pPr>
-        <w:pStyle w:val="BodyText"/>
+        <w:pStyle w:val="Corpsdetexte"/>
       </w:pPr>
       <w:r>
         <w:t xml:space="preserve">A further dimension that static snapshot databases fail to capture is the internal zoning of protected areas. In many national systems, multi-use protected area categories — typically corresponding to IUCN Categories III to VI — are internally subdivided into zones with distinct levels of permitted human activity. In Madagascar, the Protected Area Management Code (Code de Gestion des Aires Protégées, COAP; Law 2015-005) requires such sites to delineate a strictly protected core zone (noyau dur), where extractive uses are prohibited and biodiversity conservation takes legal precedence, alongside internal buffer zones where regulated resource use by surrounding communities may be permitted. The term “buffer zone” is used in the literature to refer both to areas surrounding core zones within protected areas and to areas surrounding the external boundary of protected areas</w:t>
@@ -173,7 +173,7 @@
     </w:p>
     <w:p>
       <w:pPr>
-        <w:pStyle w:val="BodyText"/>
+        <w:pStyle w:val="Corpsdetexte"/>
       </w:pPr>
       <w:r>
         <w:t xml:space="preserve">This matters for researchers from all disciplines that study conservation (biology, ecology, economics, anthropology, etc.). For instance, when impact evaluations assume that current boundaries have remained unchanged since a protected area was established, they may treat recently added areas as if they had been protected for much longer, inducing a downward bias. It is also relevant for policymakers, as protected areas have become a major instrument of spatial planning, with global terrestrial coverage exceeding 17% in 2023</w:t>
@@ -190,7 +190,7 @@
     </w:p>
     <w:p>
       <w:pPr>
-        <w:pStyle w:val="BodyText"/>
+        <w:pStyle w:val="Corpsdetexte"/>
       </w:pPr>
       <w:r>
         <w:t xml:space="preserve">Madagascar offers a particularly instructive demonstration case. The island is one of the world’s foremost biodiversity hotspots, with forests sheltering over 80% of its biodiversity and endemism rates exceeding 80% across many taxonomic groups</w:t>
@@ -223,12 +223,12 @@
         <w:t xml:space="preserve"> </w:t>
       </w:r>
       <w:r>
-        <w:t xml:space="preserve">in a three-volume monograph covering 98 terrestrial sites, while the national protected area system (Système des Aires Protégées de Madagascar, SAPM) has produced successive spatial datasets, and the national legislative database (CNLEGIS) contains the legal decisions underpinning each status change. Yet no single dataset has assembled these complementary sources into a unified temporal record.</w:t>
-      </w:r>
-    </w:p>
-    <w:p>
-      <w:pPr>
-        <w:pStyle w:val="BodyText"/>
+        <w:t xml:space="preserve">in a three-volume monograph covering 98 terrestrial sites, while the national protected area system (Système des Aires Protégées de Madagascar, SAPM) has produced successive spatial datasets, and the national legislative database (Centre National d’information et de Documentation Législative et Juridique – CNLEGIS) contains the legal decisions underpinning each status change. Yet no single dataset has assembled these complementary sources into a unified temporal record.</w:t>
+      </w:r>
+    </w:p>
+    <w:p>
+      <w:pPr>
+        <w:pStyle w:val="Corpsdetexte"/>
       </w:pPr>
       <w:r>
         <w:t xml:space="preserve">The problem, however, is not specific to Madagascar. In most countries, the WDPA contains protected areas whose histories of boundary and status changes are lost. The historical evidence needed to reconstruct these trajectories is inherently country-specific: legal systems, spatial archives, protected-area identifiers and institutional records differ widely across jurisdictions. The transferable component of our approach is therefore not a standardized reconstruction procedure, but a common data model for encoding reconstructed changes as dated amendments to a WDPA baseline and consolidating them into temporal states.</w:t>
@@ -236,7 +236,7 @@
     </w:p>
     <w:p>
       <w:pPr>
-        <w:pStyle w:val="BodyText"/>
+        <w:pStyle w:val="Corpsdetexte"/>
       </w:pPr>
       <w:r>
         <w:t xml:space="preserve">This paper presents three contributions. First, a reusable temporal data model that represents protected-area histories as time-bounded amendments to a current WDPA baseline, including changes in external boundaries, legal status and internal zoning. Second, an application of this model to the 123 protected areas that constituted Madagascar’s national protected-area system through late 2025, reconstructed over 2000–2025 from country-specific spatial, legal and expert sources. Third, an open infrastructure consisting of a version-controlled YAML amendment registry and a deterministic consolidation engine, allowing curated histories to be audited, corrected and regenerated reproducibly.</w:t>
@@ -246,7 +246,7 @@
     <w:bookmarkStart w:id="22" w:name="methods"/>
     <w:p>
       <w:pPr>
-        <w:pStyle w:val="Heading1"/>
+        <w:pStyle w:val="Titre1"/>
       </w:pPr>
       <w:r>
         <w:t xml:space="preserve">Methods</w:t>
@@ -262,7 +262,7 @@
     </w:p>
     <w:p>
       <w:pPr>
-        <w:pStyle w:val="BodyText"/>
+        <w:pStyle w:val="Corpsdetexte"/>
       </w:pPr>
       <w:r>
         <w:t xml:space="preserve">The complete workflow, source documentation, curation notebooks, amendment registry and consolidation code are publicly available in the associated GitHub repository and its rendered Quarto documentation. We summarize the key steps below and illustrate the overall workflow in</w:t>
@@ -273,7 +273,7 @@
       <w:hyperlink w:anchor="fig-workflow">
         <w:r>
           <w:rPr>
-            <w:rStyle w:val="Hyperlink"/>
+            <w:rStyle w:val="Lienhypertexte"/>
           </w:rPr>
           <w:t xml:space="preserve">Figure 1</w:t>
         </w:r>
@@ -304,7 +304,7 @@
             <w:r>
               <w:drawing>
                 <wp:inline>
-                  <wp:extent cx="5334000" cy="2871560"/>
+                  <wp:extent cx="5969000" cy="3213412"/>
                   <wp:effectExtent b="0" l="0" r="0" t="0"/>
                   <wp:docPr descr="" title="" id="11" name="Picture"/>
                   <a:graphic>
@@ -325,7 +325,7 @@
                         <pic:spPr bwMode="auto">
                           <a:xfrm>
                             <a:off x="0" y="0"/>
-                            <a:ext cx="5334000" cy="2871560"/>
+                            <a:ext cx="5969000" cy="3213412"/>
                           </a:xfrm>
                           <a:prstGeom prst="rect">
                             <a:avLst/>
@@ -363,7 +363,7 @@
     </w:tbl>
     <w:p>
       <w:pPr>
-        <w:pStyle w:val="BodyText"/>
+        <w:pStyle w:val="Corpsdetexte"/>
       </w:pPr>
       <w:r>
         <w:t xml:space="preserve">The source-discovery and historical-reconstruction steps described below are specific to Madagascar and are not proposed as a standardized workflow for other countries. Generalizability instead lies in the downstream representation: once locally reconstructed changes are expressed through the amendment schema, the same consolidation model can transform any country-level WDPA baseline into a temporal dataset.</w:t>
@@ -372,7 +372,7 @@
     <w:bookmarkStart w:id="14" w:name="input-data"/>
     <w:p>
       <w:pPr>
-        <w:pStyle w:val="Heading2"/>
+        <w:pStyle w:val="Titre2"/>
       </w:pPr>
       <w:r>
         <w:t xml:space="preserve">Input data</w:t>
@@ -400,7 +400,7 @@
     </w:p>
     <w:p>
       <w:pPr>
-        <w:pStyle w:val="BodyText"/>
+        <w:pStyle w:val="Corpsdetexte"/>
       </w:pPr>
       <w:r>
         <w:t xml:space="preserve">The current WDPA provides the baseline geometry and attributes to which documented historical amendments are applied. The consolidated release presented here uses the November 2025 WDPA for Madagascar, obtained from Protected Planet (https://www.protectedplanet.net). Historical WDPA snapshots were additionally examined during data preparation and validation. Versions from July 2017 onward were accessed through the Google Earth Engine WDPA archive; earlier snapshots for 2010–2016 were recovered from UNEP-WCMC’s public AWS archive. In one documented case, a historical geometry was reconstructed by separating polygons from the November 2025 WDPA geometry (labelled WDPA_2025_split in the metadata). WDPA-derived material is identified explicitly in the provenance metadata.</w:t>
@@ -408,7 +408,7 @@
     </w:p>
     <w:p>
       <w:pPr>
-        <w:pStyle w:val="BodyText"/>
+        <w:pStyle w:val="Corpsdetexte"/>
       </w:pPr>
       <w:r>
         <w:t xml:space="preserve">National spatial information comes from two institutional streams. First,</w:t>
@@ -479,7 +479,7 @@
     </w:p>
     <w:p>
       <w:pPr>
-        <w:pStyle w:val="BodyText"/>
+        <w:pStyle w:val="Corpsdetexte"/>
       </w:pPr>
       <w:r>
         <w:t xml:space="preserve">A second national stream consists of official protected-area geographic information produced, compiled or coordinated within the SAPM and the Ministry of Environment and Sustainable Development (MEDD). The geometries from this stream that enter the released dataset are identified as SAPM_evol_2001-2011, SAPM_2010 and MEDD_subdivisions. The latter includes zoning information produced in the course of protected-area management, including by organizations operating under delegated management arrangements, and consolidated as part of the official geographic information associated with the protected-area system. Their institutional provenance and the legal framework governing the circulation and dissemination of protected-area geographic information were documented in a signed attestation by co-author Seheno Ramanantsoa, Head of the Protected Areas Governance Service within MEDD. The original historical source databases are not redistributed as such; requests concerning access to them should be addressed to the MEDD service responsible for protected-area governance and SAPM coordination.</w:t>
@@ -487,7 +487,7 @@
     </w:p>
     <w:p>
       <w:pPr>
-        <w:pStyle w:val="BodyText"/>
+        <w:pStyle w:val="Corpsdetexte"/>
       </w:pPr>
       <w:r>
         <w:t xml:space="preserve">Attribute amendments were derived from official legal records, principally decrees and ministerial or interministerial orders published through the Journal Officiel and made accessible through the Centre National de Légistique (CNLEGIS). These records were accessed through the CNLEGIS legislative database (https://www.cnlegis.gov.mg), using searches by legal instrument number, date, type and protected-area name or related keywords. Approximately 200 protected-area-related legal decisions were compiled and linked to WDPA identifiers using textual and spatial matching followed by manual verification. These legal records provide the authoritative basis for dates of creation, temporary protection, status changes, boundary modifications, and other dated amendments. WDPA attributes that are not explicitly amended are inherited from the baseline.</w:t>
@@ -495,7 +495,7 @@
     </w:p>
     <w:p>
       <w:pPr>
-        <w:pStyle w:val="BodyText"/>
+        <w:pStyle w:val="Corpsdetexte"/>
       </w:pPr>
       <w:r>
         <w:t xml:space="preserve">Additional sources, including the monograph by Goodman et al.</w:t>
@@ -515,7 +515,7 @@
     </w:p>
     <w:p>
       <w:pPr>
-        <w:pStyle w:val="BodyText"/>
+        <w:pStyle w:val="Corpsdetexte"/>
       </w:pPr>
       <w:r>
         <w:t xml:space="preserve">Additional historical context was drawn from Waeber et al.</w:t>
@@ -534,7 +534,7 @@
     <w:bookmarkStart w:id="19" w:name="consolidation-and-verification"/>
     <w:p>
       <w:pPr>
-        <w:pStyle w:val="Heading2"/>
+        <w:pStyle w:val="Titre2"/>
       </w:pPr>
       <w:r>
         <w:t xml:space="preserve">Consolidation and verification</w:t>
@@ -550,7 +550,7 @@
     </w:p>
     <w:p>
       <w:pPr>
-        <w:pStyle w:val="BodyText"/>
+        <w:pStyle w:val="Corpsdetexte"/>
       </w:pPr>
       <w:r>
         <w:t xml:space="preserve">A Shiny web application was developed and deployed for domain expert review. The validation involved protected area managers, GIS specialists from MEDD and Madagascar National Parks, and researchers with long-term experience on Madagascar’s protected area system. The application overlays geometries from different sources and time periods on interactive Leaflet maps, with filtering by IUCN category, dataset of origin, and associated legal texts. This tool enabled systematic visual comparison of boundaries reported by different sources for each protected area. The companion website provides ongoing access to this verification interface.</w:t>
@@ -558,7 +558,7 @@
     </w:p>
     <w:p>
       <w:pPr>
-        <w:pStyle w:val="BodyText"/>
+        <w:pStyle w:val="Corpsdetexte"/>
       </w:pPr>
       <w:r>
         <w:t xml:space="preserve">Core-zone shapefiles produced by protected-area managers, including MEDD, MNP, MBG, GERP and WWF, were assembled and compared with protected-area boundaries. These zoning data form part of the geographic information associated with the official management of protected areas under MEDD responsibility, including where MEDD delegates its management mandate to another organization. For the released dataset, the selected and harmonized zoning geometries are recorded under the source identifier</w:t>
@@ -575,7 +575,7 @@
     </w:p>
     <w:p>
       <w:pPr>
-        <w:pStyle w:val="BodyText"/>
+        <w:pStyle w:val="Corpsdetexte"/>
       </w:pPr>
       <w:r>
         <w:t xml:space="preserve">For approximately 25 protected areas with complex histories, a detailed case-by-case review was conducted, cross-referencing legal decisions, historical boundaries from Goodman et al.</w:t>
@@ -595,7 +595,7 @@
       <w:hyperlink w:anchor="fig-examples">
         <w:r>
           <w:rPr>
-            <w:rStyle w:val="Hyperlink"/>
+            <w:rStyle w:val="Lienhypertexte"/>
           </w:rPr>
           <w:t xml:space="preserve">Figure 2</w:t>
         </w:r>
@@ -629,7 +629,7 @@
             <w:r>
               <w:drawing>
                 <wp:inline>
-                  <wp:extent cx="5334000" cy="4667250"/>
+                  <wp:extent cx="5969000" cy="5222875"/>
                   <wp:effectExtent b="0" l="0" r="0" t="0"/>
                   <wp:docPr descr="" title="" id="16" name="Picture"/>
                   <a:graphic>
@@ -650,7 +650,7 @@
                         <pic:spPr bwMode="auto">
                           <a:xfrm>
                             <a:off x="0" y="0"/>
-                            <a:ext cx="5334000" cy="4667250"/>
+                            <a:ext cx="5969000" cy="5222875"/>
                           </a:xfrm>
                           <a:prstGeom prst="rect">
                             <a:avLst/>
@@ -690,7 +690,7 @@
     <w:bookmarkStart w:id="20" w:name="yaml-amendment-registry"/>
     <w:p>
       <w:pPr>
-        <w:pStyle w:val="Heading2"/>
+        <w:pStyle w:val="Titre2"/>
       </w:pPr>
       <w:r>
         <w:t xml:space="preserve">YAML amendment registry</w:t>
@@ -706,7 +706,7 @@
     </w:p>
     <w:p>
       <w:pPr>
-        <w:pStyle w:val="BodyText"/>
+        <w:pStyle w:val="Corpsdetexte"/>
       </w:pPr>
       <w:r>
         <w:t xml:space="preserve">The registry documents five types of amendments: boundary modifications, status changes, temporary protections, corrections to the WDPA baseline, and secondary zoning.</w:t>
@@ -716,7 +716,7 @@
     <w:bookmarkStart w:id="21" w:name="consolidation-and-auditing-rules"/>
     <w:p>
       <w:pPr>
-        <w:pStyle w:val="Heading2"/>
+        <w:pStyle w:val="Titre2"/>
       </w:pPr>
       <w:r>
         <w:t xml:space="preserve">Consolidation and Auditing Rules</w:t>
@@ -771,7 +771,7 @@
     <w:bookmarkStart w:id="32" w:name="data-records"/>
     <w:p>
       <w:pPr>
-        <w:pStyle w:val="Heading1"/>
+        <w:pStyle w:val="Titre1"/>
       </w:pPr>
       <w:r>
         <w:t xml:space="preserve">Data Records</w:t>
@@ -835,7 +835,7 @@
     </w:p>
     <w:p>
       <w:pPr>
-        <w:pStyle w:val="BodyText"/>
+        <w:pStyle w:val="Corpsdetexte"/>
       </w:pPr>
       <w:r>
         <w:t xml:space="preserve">The consolidated files are based on the November 2025 WDPA release and should therefore be regarded as a historical research snapshot rather than as the current official protected-area database. Users requiring the latest official protected and conserved area information should obtain it directly from Protected Planet. UNEP-WCMC has provided written authorization for redistribution of the Madagascar-specific WDPA-derived outputs included in this dataset. Commercial use remains subject to the WDPA Data License, which prohibits commercial use of WDPA materials and derivative works without prior written permission from UNEP-WCMC</w:t>
@@ -852,7 +852,7 @@
     </w:p>
     <w:p>
       <w:pPr>
-        <w:pStyle w:val="BodyText"/>
+        <w:pStyle w:val="Corpsdetexte"/>
       </w:pPr>
       <w:r>
         <w:t xml:space="preserve">Provenance is retained at row level. The field</w:t>
@@ -884,7 +884,7 @@
     </w:p>
     <w:p>
       <w:pPr>
-        <w:pStyle w:val="BodyText"/>
+        <w:pStyle w:val="Corpsdetexte"/>
       </w:pPr>
       <w:r>
         <w:t xml:space="preserve">Each row in the output dataset represents one zone in one temporal state. A protected area with boundary changes and internal zoning will have multiple rows across time periods.</w:t>
@@ -895,7 +895,7 @@
       <w:hyperlink w:anchor="tbl-schema">
         <w:r>
           <w:rPr>
-            <w:rStyle w:val="Hyperlink"/>
+            <w:rStyle w:val="Lienhypertexte"/>
           </w:rPr>
           <w:t xml:space="preserve">Table 1</w:t>
         </w:r>
@@ -1714,7 +1714,7 @@
     </w:tbl>
     <w:p>
       <w:pPr>
-        <w:pStyle w:val="BodyText"/>
+        <w:pStyle w:val="Corpsdetexte"/>
       </w:pPr>
       <w:r>
         <w:t xml:space="preserve">The national temporal reconstruction targets the 123 protected areas that constituted Madagascar’s national protected area system until the end of 2025. The consolidated files additionally preserve the complete Madagascar WDPA baseline, including proposed and international-designation records, together with one historical dissolved protected-area record. The current release therefore contains 168 distinct WDPAIDs, represented by 367 temporal states and 437 zone-state rows. Secondary zoning is included for 70 protected-area identities.</w:t>
@@ -1742,7 +1742,7 @@
             <w:r>
               <w:drawing>
                 <wp:inline>
-                  <wp:extent cx="3733800" cy="7382570"/>
+                  <wp:extent cx="4178300" cy="8261447"/>
                   <wp:effectExtent b="0" l="0" r="0" t="0"/>
                   <wp:docPr descr="" title="" id="25" name="Picture"/>
                   <a:graphic>
@@ -1763,7 +1763,7 @@
                         <pic:spPr bwMode="auto">
                           <a:xfrm>
                             <a:off x="0" y="0"/>
-                            <a:ext cx="3733800" cy="7382570"/>
+                            <a:ext cx="4178300" cy="8261447"/>
                           </a:xfrm>
                           <a:prstGeom prst="rect">
                             <a:avLst/>
@@ -1801,7 +1801,7 @@
     </w:tbl>
     <w:p>
       <w:pPr>
-        <w:pStyle w:val="BodyText"/>
+        <w:pStyle w:val="Corpsdetexte"/>
       </w:pPr>
       <w:r>
         <w:t xml:space="preserve">The temporal reconstruction changes the inferred evolution of protected-area extent.</w:t>
@@ -1812,7 +1812,7 @@
       <w:hyperlink w:anchor="fig-area-comparison">
         <w:r>
           <w:rPr>
-            <w:rStyle w:val="Hyperlink"/>
+            <w:rStyle w:val="Lienhypertexte"/>
           </w:rPr>
           <w:t xml:space="preserve">Figure 4</w:t>
         </w:r>
@@ -1858,7 +1858,7 @@
             <w:r>
               <w:drawing>
                 <wp:inline>
-                  <wp:extent cx="4267200" cy="2667000"/>
+                  <wp:extent cx="4775200" cy="2984500"/>
                   <wp:effectExtent b="0" l="0" r="0" t="0"/>
                   <wp:docPr descr="" title="" id="29" name="Picture"/>
                   <a:graphic>
@@ -1879,7 +1879,7 @@
                         <pic:spPr bwMode="auto">
                           <a:xfrm>
                             <a:off x="0" y="0"/>
-                            <a:ext cx="4267200" cy="2667000"/>
+                            <a:ext cx="4775200" cy="2984500"/>
                           </a:xfrm>
                           <a:prstGeom prst="rect">
                             <a:avLst/>
@@ -1926,7 +1926,7 @@
     </w:tbl>
     <w:p>
       <w:pPr>
-        <w:pStyle w:val="BodyText"/>
+        <w:pStyle w:val="Corpsdetexte"/>
       </w:pPr>
       <w:r>
         <w:t xml:space="preserve">By 2025 the two series nearly converge; the remaining difference of 878 km² corresponds to Tsimembo Manambolomaty, Mandrozo and Torotorofotsy, which have documented national legal histories in the reconstructed dataset but are represented only by international Ramsar records in the November 2025 WDPA.</w:t>
@@ -1934,7 +1934,7 @@
     </w:p>
     <w:p>
       <w:pPr>
-        <w:pStyle w:val="BodyText"/>
+        <w:pStyle w:val="Corpsdetexte"/>
       </w:pPr>
       <w:r>
         <w:t xml:space="preserve">The amendment schema and consolidation engine are independent of the particular sources used in Madagascar. They can therefore be applied to another country or region once locally reconstructed historical information has been expressed as dated amendments to the corresponding WDPA baseline.</w:t>
@@ -1944,7 +1944,7 @@
     <w:bookmarkStart w:id="37" w:name="technical-validation"/>
     <w:p>
       <w:pPr>
-        <w:pStyle w:val="Heading1"/>
+        <w:pStyle w:val="Titre1"/>
       </w:pPr>
       <w:r>
         <w:t xml:space="preserve">Technical Validation</w:t>
@@ -1960,7 +1960,7 @@
     </w:p>
     <w:p>
       <w:pPr>
-        <w:pStyle w:val="BodyText"/>
+        <w:pStyle w:val="Corpsdetexte"/>
       </w:pPr>
       <w:r>
         <w:t xml:space="preserve">Automated checks are applied during consolidation to detect duplicate temporal states, invalid or overlapping validity periods, empty geometries, missing geometry provenance and inconsistent protected-area identifiers. Additional checks ensure that national historical information is not inadvertently assigned to distinct international WDPA designations. The three distributed formats are also checked for consistency after generation.</w:t>
@@ -1968,7 +1968,7 @@
     </w:p>
     <w:p>
       <w:pPr>
-        <w:pStyle w:val="BodyText"/>
+        <w:pStyle w:val="Corpsdetexte"/>
       </w:pPr>
       <w:r>
         <w:t xml:space="preserve">Curated amendment geometries were checked during processing and spatial review. Baseline WDPA geometries are retained without silently modifying their topology, in order to preserve source fidelity.</w:t>
@@ -1976,12 +1976,12 @@
     </w:p>
     <w:p>
       <w:pPr>
-        <w:pStyle w:val="BodyText"/>
+        <w:pStyle w:val="Corpsdetexte"/>
       </w:pPr>
       <w:hyperlink w:anchor="fig-amendments">
         <w:r>
           <w:rPr>
-            <w:rStyle w:val="Hyperlink"/>
+            <w:rStyle w:val="Lienhypertexte"/>
           </w:rPr>
           <w:t xml:space="preserve">Figure 5</w:t>
         </w:r>
@@ -2015,7 +2015,7 @@
             <w:r>
               <w:drawing>
                 <wp:inline>
-                  <wp:extent cx="3733800" cy="2133600"/>
+                  <wp:extent cx="4178300" cy="2387600"/>
                   <wp:effectExtent b="0" l="0" r="0" t="0"/>
                   <wp:docPr descr="" title="" id="34" name="Picture"/>
                   <a:graphic>
@@ -2036,7 +2036,7 @@
                         <pic:spPr bwMode="auto">
                           <a:xfrm>
                             <a:off x="0" y="0"/>
-                            <a:ext cx="3733800" cy="2133600"/>
+                            <a:ext cx="4178300" cy="2387600"/>
                           </a:xfrm>
                           <a:prstGeom prst="rect">
                             <a:avLst/>
@@ -2076,7 +2076,7 @@
     <w:bookmarkStart w:id="38" w:name="usage-notes"/>
     <w:p>
       <w:pPr>
-        <w:pStyle w:val="Heading1"/>
+        <w:pStyle w:val="Titre1"/>
       </w:pPr>
       <w:r>
         <w:t xml:space="preserve">Usage Notes</w:t>
@@ -2104,7 +2104,7 @@
     </w:p>
     <w:p>
       <w:pPr>
-        <w:pStyle w:val="BodyText"/>
+        <w:pStyle w:val="Corpsdetexte"/>
       </w:pPr>
       <w:r>
         <w:t xml:space="preserve">Temporal configurations can be selected using</w:t>
@@ -2169,7 +2169,7 @@
     </w:p>
     <w:p>
       <w:pPr>
-        <w:pStyle w:val="BodyText"/>
+        <w:pStyle w:val="Corpsdetexte"/>
       </w:pPr>
       <w:r>
         <w:t xml:space="preserve">Researchers wishing to update the dataset beyond the November 2025 baseline can download a more recent WDPA release from Protected Planet and apply the published amendment registry using the Consolidation and Auditing Rules provided in the GitHub repository. This reconstruction route uses the curated YAML and GeoJSON amendment registry as input and does not require repeating the complete historical source-curation process.</w:t>
@@ -2177,7 +2177,7 @@
     </w:p>
     <w:p>
       <w:pPr>
-        <w:pStyle w:val="BodyText"/>
+        <w:pStyle w:val="Corpsdetexte"/>
       </w:pPr>
       <w:r>
         <w:t xml:space="preserve">Users must observe the reuse conditions associated with the underlying source data. In particular, commercial use of WDPA material or works derived from it requires prior written permission from UNEP-WCMC</w:t>
@@ -2194,7 +2194,7 @@
     </w:p>
     <w:p>
       <w:pPr>
-        <w:pStyle w:val="BodyText"/>
+        <w:pStyle w:val="Corpsdetexte"/>
       </w:pPr>
       <w:r>
         <w:t xml:space="preserve">The YAML amendment registry is designed for collaborative extension. Researchers who identify additional legal texts, historical maps, or field-validated boundaries can propose corrections or new amendments through the associated GitHub repository, where changes remain auditable through version control. The interactive companion application allows users to explore individual protected areas and compare boundaries from different sources.</w:t>
@@ -2204,7 +2204,7 @@
     <w:bookmarkStart w:id="39" w:name="data-availability-statement"/>
     <w:p>
       <w:pPr>
-        <w:pStyle w:val="Heading1"/>
+        <w:pStyle w:val="Titre1"/>
       </w:pPr>
       <w:r>
         <w:t xml:space="preserve">Data Availability Statement</w:t>
@@ -2265,7 +2265,7 @@
     </w:p>
     <w:p>
       <w:pPr>
-        <w:pStyle w:val="BodyText"/>
+        <w:pStyle w:val="Corpsdetexte"/>
       </w:pPr>
       <w:r>
         <w:t xml:space="preserve">The consolidated files incorporate information derived from the November 2025 WDPA release. UNEP-WCMC has provided written authorization for redistribution of these Madagascar-specific derived outputs for this non-commercial use case. Commercial use of WDPA material or derivative works requires prior written permission from UNEP-WCMC</w:t>
@@ -2282,7 +2282,7 @@
     </w:p>
     <w:p>
       <w:pPr>
-        <w:pStyle w:val="BodyText"/>
+        <w:pStyle w:val="Corpsdetexte"/>
       </w:pPr>
       <w:r>
         <w:t xml:space="preserve">Source-specific reuse conditions apply to third-party material incorporated into the dataset. UNEP-WCMC has provided written authorization for redistribution of the Madagascar-specific WDPA-derived outputs for the non-commercial use case described here; commercial use of WDPA material or derivative works requires prior written permission from UNEP-WCMC. Madagascar National Parks has authorized the use, adaptation, publication and redistribution under CC BY 4.0 of the ANGAP/MNP-derived geometries incorporated into this dataset. For the SAPM/MEDD sources, including protected-area zoning information produced in the course of delegated management, their institutional provenance and the legal basis for public dissemination of protected-area geographic information have been documented in a signed attestation by co-author Seheno Ramanantsoa, Head of the Protected Areas Governance Service within MEDD. The attestation documents the statutory role of the ministry in the publication and dissemination of protected-area boundaries, zoning and associated geographic information; it does not constitute a general open licence for the underlying historical SAPM/MEDD databases.</w:t>
@@ -2290,7 +2290,7 @@
     </w:p>
     <w:p>
       <w:pPr>
-        <w:pStyle w:val="BodyText"/>
+        <w:pStyle w:val="Corpsdetexte"/>
       </w:pPr>
       <w:r>
         <w:t xml:space="preserve">Geometry-level provenance is recorded in</w:t>
@@ -2309,7 +2309,7 @@
     <w:bookmarkStart w:id="40" w:name="code-availability"/>
     <w:p>
       <w:pPr>
-        <w:pStyle w:val="Heading1"/>
+        <w:pStyle w:val="Titre1"/>
       </w:pPr>
       <w:r>
         <w:t xml:space="preserve">Code Availability</w:t>
@@ -2327,7 +2327,7 @@
     <w:bookmarkStart w:id="41" w:name="acknowledgements"/>
     <w:p>
       <w:pPr>
-        <w:pStyle w:val="Heading1"/>
+        <w:pStyle w:val="Titre1"/>
       </w:pPr>
       <w:r>
         <w:t xml:space="preserve">Acknowledgements</w:t>
@@ -2345,7 +2345,7 @@
     <w:bookmarkStart w:id="42" w:name="funding"/>
     <w:p>
       <w:pPr>
-        <w:pStyle w:val="Heading1"/>
+        <w:pStyle w:val="Titre1"/>
       </w:pPr>
       <w:r>
         <w:t xml:space="preserve">Funding</w:t>
@@ -2363,7 +2363,7 @@
     <w:bookmarkStart w:id="43" w:name="author-contributions"/>
     <w:p>
       <w:pPr>
-        <w:pStyle w:val="Heading1"/>
+        <w:pStyle w:val="Titre1"/>
       </w:pPr>
       <w:r>
         <w:t xml:space="preserve">Author Contributions</w:t>
@@ -2381,7 +2381,7 @@
     <w:bookmarkStart w:id="44" w:name="competing-interests"/>
     <w:p>
       <w:pPr>
-        <w:pStyle w:val="Heading1"/>
+        <w:pStyle w:val="Titre1"/>
       </w:pPr>
       <w:r>
         <w:t xml:space="preserve">Competing Interests</w:t>
@@ -2399,7 +2399,7 @@
     <w:bookmarkStart w:id="60" w:name="references"/>
     <w:p>
       <w:pPr>
-        <w:pStyle w:val="Heading1"/>
+        <w:pStyle w:val="Titre1"/>
       </w:pPr>
       <w:r>
         <w:t xml:space="preserve">References</w:t>
@@ -2409,7 +2409,7 @@
     <w:bookmarkStart w:id="45" w:name="ref-bingham2019b"/>
     <w:p>
       <w:pPr>
-        <w:pStyle w:val="Bibliography"/>
+        <w:pStyle w:val="Bibliographie"/>
       </w:pPr>
       <w:r>
         <w:t xml:space="preserve">1.</w:t>
@@ -2485,7 +2485,7 @@
     <w:bookmarkStart w:id="46" w:name="ref-Maxwell2020"/>
     <w:p>
       <w:pPr>
-        <w:pStyle w:val="Bibliography"/>
+        <w:pStyle w:val="Bibliographie"/>
       </w:pPr>
       <w:r>
         <w:t xml:space="preserve">2.</w:t>
@@ -2540,7 +2540,7 @@
     <w:bookmarkStart w:id="47" w:name="ref-Bingham2019a"/>
     <w:p>
       <w:pPr>
-        <w:pStyle w:val="Bibliography"/>
+        <w:pStyle w:val="Bibliographie"/>
       </w:pPr>
       <w:r>
         <w:t xml:space="preserve">3.</w:t>
@@ -2666,7 +2666,7 @@
     <w:bookmarkStart w:id="48" w:name="ref-symesWhyWeLose2016"/>
     <w:p>
       <w:pPr>
-        <w:pStyle w:val="Bibliography"/>
+        <w:pStyle w:val="Bibliographie"/>
       </w:pPr>
       <w:r>
         <w:t xml:space="preserve">4.</w:t>
@@ -2720,7 +2720,7 @@
     <w:bookmarkStart w:id="49" w:name="ref-lewisDynamicsGlobalProtectedarea2019"/>
     <w:p>
       <w:pPr>
-        <w:pStyle w:val="Bibliography"/>
+        <w:pStyle w:val="Bibliographie"/>
       </w:pPr>
       <w:r>
         <w:t xml:space="preserve">5.</w:t>
@@ -2775,7 +2775,7 @@
     <w:bookmarkStart w:id="50" w:name="ref-Ebregt2000"/>
     <w:p>
       <w:pPr>
-        <w:pStyle w:val="Bibliography"/>
+        <w:pStyle w:val="Bibliographie"/>
       </w:pPr>
       <w:r>
         <w:t xml:space="preserve">6.</w:t>
@@ -2918,7 +2918,7 @@
     <w:bookmarkStart w:id="51" w:name="ref-unep2024"/>
     <w:p>
       <w:pPr>
-        <w:pStyle w:val="Bibliography"/>
+        <w:pStyle w:val="Bibliographie"/>
       </w:pPr>
       <w:r>
         <w:t xml:space="preserve">7.</w:t>
@@ -2950,7 +2950,7 @@
     <w:bookmarkStart w:id="53" w:name="ref-Waeber2020"/>
     <w:p>
       <w:pPr>
-        <w:pStyle w:val="Bibliography"/>
+        <w:pStyle w:val="Bibliographie"/>
       </w:pPr>
       <w:r>
         <w:t xml:space="preserve">8.</w:t>
@@ -2992,7 +2992,7 @@
       <w:hyperlink r:id="rId52">
         <w:r>
           <w:rPr>
-            <w:rStyle w:val="Hyperlink"/>
+            <w:rStyle w:val="Lienhypertexte"/>
           </w:rPr>
           <w:t xml:space="preserve">http://dx.doi.org/10.5772/intechopen.85348</w:t>
         </w:r>
@@ -3005,7 +3005,7 @@
     <w:bookmarkStart w:id="54" w:name="ref-Goodman2018"/>
     <w:p>
       <w:pPr>
-        <w:pStyle w:val="Bibliography"/>
+        <w:pStyle w:val="Bibliographie"/>
       </w:pPr>
       <w:r>
         <w:t xml:space="preserve">9.</w:t>
@@ -3068,7 +3068,7 @@
     <w:bookmarkStart w:id="56" w:name="ref-unepwcmcWDPCAlicense"/>
     <w:p>
       <w:pPr>
-        <w:pStyle w:val="Bibliography"/>
+        <w:pStyle w:val="Bibliographie"/>
       </w:pPr>
       <w:r>
         <w:t xml:space="preserve">10.</w:t>
@@ -3088,7 +3088,7 @@
       <w:hyperlink r:id="rId55">
         <w:r>
           <w:rPr>
-            <w:rStyle w:val="Hyperlink"/>
+            <w:rStyle w:val="Lienhypertexte"/>
           </w:rPr>
           <w:t xml:space="preserve">WDPA data license</w:t>
         </w:r>
@@ -3101,7 +3101,7 @@
     <w:bookmarkStart w:id="58" w:name="ref-bedecarrats2026dataset"/>
     <w:p>
       <w:pPr>
-        <w:pStyle w:val="Bibliography"/>
+        <w:pStyle w:val="Bibliographie"/>
       </w:pPr>
       <w:r>
         <w:t xml:space="preserve">11.</w:t>
@@ -3121,7 +3121,7 @@
       <w:hyperlink r:id="rId57">
         <w:r>
           <w:rPr>
-            <w:rStyle w:val="Hyperlink"/>
+            <w:rStyle w:val="Lienhypertexte"/>
           </w:rPr>
           <w:t xml:space="preserve">https://doi.org/10.23708/VN2TWC</w:t>
         </w:r>
@@ -3140,6 +3140,11 @@
       <w:footnotePr>
         <w:numRestart w:val="eachSect"/>
       </w:footnotePr>
+      <w:pgSz w:h="15840" w:w="12240"/>
+      <w:pgMar w:bottom="1417" w:footer="720" w:gutter="0" w:header="720" w:left="1417" w:right="1417" w:top="1417"/>
+      <w:lnNumType w:countBy="1" w:restart="continuous"/>
+      <w:cols w:space="720"/>
+      <w:docGrid w:linePitch="326"/>
     </w:sectPr>
   </w:body>
 </w:document>
@@ -3169,7 +3174,111 @@
 </file>
 
 <file path=word/numbering.xml><?xml version="1.0" encoding="utf-8"?>
-<w:numbering xmlns:w="http://schemas.openxmlformats.org/wordprocessingml/2006/main">
+<w:numbering xmlns:aink="http://schemas.microsoft.com/office/drawing/2016/ink" xmlns:am3d="http://schemas.microsoft.com/office/drawing/2017/model3d" xmlns:cx="http://schemas.microsoft.com/office/drawing/2014/chartex" xmlns:cx1="http://schemas.microsoft.com/office/drawing/2015/9/8/chartex" xmlns:cx2="http://schemas.microsoft.com/office/drawing/2015/10/21/chartex" xmlns:cx3="http://schemas.microsoft.com/office/drawing/2016/5/9/chartex" xmlns:cx4="http://schemas.microsoft.com/office/drawing/2016/5/10/chartex" xmlns:cx5="http://schemas.microsoft.com/office/drawing/2016/5/11/chartex" xmlns:cx6="http://schemas.microsoft.com/office/drawing/2016/5/12/chartex" xmlns:cx7="http://schemas.microsoft.com/office/drawing/2016/5/13/chartex" xmlns:cx8="http://schemas.microsoft.com/office/drawing/2016/5/14/chartex" xmlns:m="http://schemas.openxmlformats.org/officeDocument/2006/math" xmlns:mc="http://schemas.openxmlformats.org/markup-compatibility/2006" xmlns:o="urn:schemas-microsoft-com:office:office" xmlns:oel="http://schemas.microsoft.com/office/2019/extlst" xmlns:r="http://schemas.openxmlformats.org/officeDocument/2006/relationships" xmlns:v="urn:schemas-microsoft-com:vml" xmlns:w="http://schemas.openxmlformats.org/wordprocessingml/2006/main" xmlns:w10="urn:schemas-microsoft-com:office:word" xmlns:w14="http://schemas.microsoft.com/office/word/2010/wordml" xmlns:w15="http://schemas.microsoft.com/office/word/2012/wordml" xmlns:w16="http://schemas.microsoft.com/office/word/2018/wordml" xmlns:w16cex="http://schemas.microsoft.com/office/word/2018/wordml/cex" xmlns:w16cid="http://schemas.microsoft.com/office/word/2016/wordml/cid" xmlns:w16sdtdh="http://schemas.microsoft.com/office/word/2020/wordml/sdtdatahash" xmlns:w16se="http://schemas.microsoft.com/office/word/2015/wordml/symex" xmlns:wne="http://schemas.microsoft.com/office/word/2006/wordml" xmlns:wp="http://schemas.openxmlformats.org/drawingml/2006/wordprocessingDrawing" xmlns:wp14="http://schemas.microsoft.com/office/word/2010/wordprocessingDrawing" xmlns:wpc="http://schemas.microsoft.com/office/word/2010/wordprocessingCanvas" xmlns:wpg="http://schemas.microsoft.com/office/word/2010/wordprocessingGroup" xmlns:wpi="http://schemas.microsoft.com/office/word/2010/wordprocessingInk" xmlns:wps="http://schemas.microsoft.com/office/word/2010/wordprocessingShape" mc:Ignorable="w14 w15 w16se w16cid w16 w16cex w16sdtdh wp14">
+  <w:abstractNum w15:restartNumberingAfterBreak="0" w:abstractNumId="0">
+    <w:nsid w:val="170CD2DE"/>
+    <w:multiLevelType w:val="multilevel"/>
+    <w:tmpl w:val="A9D0317C"/>
+    <w:lvl w:ilvl="0">
+      <w:numFmt w:val="bullet"/>
+      <w:lvlText w:val=" "/>
+      <w:lvlJc w:val="left"/>
+      <w:pPr>
+        <w:tabs>
+          <w:tab w:pos="0" w:val="num"/>
+        </w:tabs>
+        <w:ind w:hanging="480" w:left="480"/>
+      </w:pPr>
+    </w:lvl>
+    <w:lvl w:ilvl="1">
+      <w:numFmt w:val="bullet"/>
+      <w:lvlText w:val=" "/>
+      <w:lvlJc w:val="left"/>
+      <w:pPr>
+        <w:tabs>
+          <w:tab w:pos="720" w:val="num"/>
+        </w:tabs>
+        <w:ind w:hanging="480" w:left="1200"/>
+      </w:pPr>
+    </w:lvl>
+    <w:lvl w:ilvl="2">
+      <w:numFmt w:val="bullet"/>
+      <w:lvlText w:val=" "/>
+      <w:lvlJc w:val="left"/>
+      <w:pPr>
+        <w:tabs>
+          <w:tab w:pos="1440" w:val="num"/>
+        </w:tabs>
+        <w:ind w:hanging="480" w:left="1920"/>
+      </w:pPr>
+    </w:lvl>
+    <w:lvl w:ilvl="3">
+      <w:numFmt w:val="bullet"/>
+      <w:lvlText w:val=" "/>
+      <w:lvlJc w:val="left"/>
+      <w:pPr>
+        <w:tabs>
+          <w:tab w:pos="2160" w:val="num"/>
+        </w:tabs>
+        <w:ind w:hanging="480" w:left="2640"/>
+      </w:pPr>
+    </w:lvl>
+    <w:lvl w:ilvl="4">
+      <w:numFmt w:val="bullet"/>
+      <w:lvlText w:val=" "/>
+      <w:lvlJc w:val="left"/>
+      <w:pPr>
+        <w:tabs>
+          <w:tab w:pos="2880" w:val="num"/>
+        </w:tabs>
+        <w:ind w:hanging="480" w:left="3360"/>
+      </w:pPr>
+    </w:lvl>
+    <w:lvl w:ilvl="5">
+      <w:numFmt w:val="bullet"/>
+      <w:lvlText w:val=" "/>
+      <w:lvlJc w:val="left"/>
+      <w:pPr>
+        <w:tabs>
+          <w:tab w:pos="3600" w:val="num"/>
+        </w:tabs>
+        <w:ind w:hanging="480" w:left="4080"/>
+      </w:pPr>
+    </w:lvl>
+    <w:lvl w:ilvl="6">
+      <w:numFmt w:val="bullet"/>
+      <w:lvlText w:val=" "/>
+      <w:lvlJc w:val="left"/>
+      <w:pPr>
+        <w:tabs>
+          <w:tab w:pos="4320" w:val="num"/>
+        </w:tabs>
+        <w:ind w:hanging="480" w:left="4800"/>
+      </w:pPr>
+    </w:lvl>
+    <w:lvl w:ilvl="7">
+      <w:numFmt w:val="bullet"/>
+      <w:lvlText w:val=" "/>
+      <w:lvlJc w:val="left"/>
+      <w:pPr>
+        <w:tabs>
+          <w:tab w:pos="5040" w:val="num"/>
+        </w:tabs>
+        <w:ind w:hanging="480" w:left="5520"/>
+      </w:pPr>
+    </w:lvl>
+    <w:lvl w:ilvl="8">
+      <w:numFmt w:val="bullet"/>
+      <w:lvlText w:val=" "/>
+      <w:lvlJc w:val="left"/>
+      <w:pPr>
+        <w:tabs>
+          <w:tab w:pos="5760" w:val="num"/>
+        </w:tabs>
+        <w:ind w:hanging="480" w:left="6240"/>
+      </w:pPr>
+    </w:lvl>
+  </w:abstractNum>
   <w:abstractNum w:abstractNumId="990">
     <w:nsid w:val="0000A990"/>
     <w:multiLevelType w:val="multilevel"/>
@@ -3246,6 +3355,9 @@
       </w:pPr>
     </w:lvl>
   </w:abstractNum>
+  <w:num w16cid:durableId="1683390321" w:numId="1">
+    <w:abstractNumId w:val="0"/>
+  </w:num>
   <w:num w:numId="1000">
     <w:abstractNumId w:val="990"/>
   </w:num>
@@ -3253,7 +3365,7 @@
 </file>
 
 <file path=word/styles.xml><?xml version="1.0" encoding="utf-8"?>
-<w:styles xmlns:r="http://schemas.openxmlformats.org/officeDocument/2006/relationships" xmlns:w="http://schemas.openxmlformats.org/wordprocessingml/2006/main">
+<w:styles xmlns:mc="http://schemas.openxmlformats.org/markup-compatibility/2006" xmlns:r="http://schemas.openxmlformats.org/officeDocument/2006/relationships" xmlns:w="http://schemas.openxmlformats.org/wordprocessingml/2006/main" xmlns:w14="http://schemas.microsoft.com/office/word/2010/wordml" xmlns:w15="http://schemas.microsoft.com/office/word/2012/wordml" xmlns:w16="http://schemas.microsoft.com/office/word/2018/wordml" xmlns:w16cex="http://schemas.microsoft.com/office/word/2018/wordml/cex" xmlns:w16cid="http://schemas.microsoft.com/office/word/2016/wordml/cid" xmlns:w16sdtdh="http://schemas.microsoft.com/office/word/2020/wordml/sdtdatahash" xmlns:w16se="http://schemas.microsoft.com/office/word/2015/wordml/symex" mc:Ignorable="w14 w15 w16se w16cid w16 w16cex w16sdtdh">
   <w:docDefaults>
     <w:rPrDefault>
       <w:rPr>
@@ -3269,15 +3381,574 @@
       </w:pPr>
     </w:pPrDefault>
   </w:docDefaults>
-  <w:latentStyles w:count="276" w:defLockedState="0" w:defQFormat="0" w:defSemiHidden="0" w:defUIPriority="0" w:defUnhideWhenUsed="0"/>
+  <w:latentStyles w:count="376" w:defLockedState="0" w:defQFormat="0" w:defSemiHidden="0" w:defUIPriority="0" w:defUnhideWhenUsed="0">
+    <w:lsdException w:name="heading 5" w:semiHidden="1" w:unhideWhenUsed="1"/>
+    <w:lsdException w:name="index 2" w:semiHidden="1" w:unhideWhenUsed="1"/>
+    <w:lsdException w:name="index 3" w:semiHidden="1" w:unhideWhenUsed="1"/>
+    <w:lsdException w:name="index 4" w:semiHidden="1" w:unhideWhenUsed="1"/>
+    <w:lsdException w:name="index 5" w:semiHidden="1" w:unhideWhenUsed="1"/>
+    <w:lsdException w:name="index 6" w:semiHidden="1" w:unhideWhenUsed="1"/>
+    <w:lsdException w:name="index 7" w:semiHidden="1" w:unhideWhenUsed="1"/>
+    <w:lsdException w:name="index 8" w:semiHidden="1" w:unhideWhenUsed="1"/>
+    <w:lsdException w:name="index 9" w:semiHidden="1" w:unhideWhenUsed="1"/>
+    <w:lsdException w:name="toc 1" w:semiHidden="1" w:unhideWhenUsed="1"/>
+    <w:lsdException w:name="toc 2" w:semiHidden="1" w:unhideWhenUsed="1"/>
+    <w:lsdException w:name="toc 3" w:semiHidden="1" w:unhideWhenUsed="1"/>
+    <w:lsdException w:name="toc 4" w:semiHidden="1" w:unhideWhenUsed="1"/>
+    <w:lsdException w:name="toc 5" w:semiHidden="1" w:unhideWhenUsed="1"/>
+    <w:lsdException w:name="toc 6" w:semiHidden="1" w:unhideWhenUsed="1"/>
+    <w:lsdException w:name="toc 7" w:semiHidden="1" w:unhideWhenUsed="1"/>
+    <w:lsdException w:name="toc 8" w:semiHidden="1" w:unhideWhenUsed="1"/>
+    <w:lsdException w:name="toc 9" w:semiHidden="1" w:unhideWhenUsed="1"/>
+    <w:lsdException w:name="Normal Indent" w:semiHidden="1" w:unhideWhenUsed="1"/>
+    <w:lsdException w:name="footnote text" w:semiHidden="1" w:unhideWhenUsed="1"/>
+    <w:lsdException w:name="annotation text" w:semiHidden="1" w:unhideWhenUsed="1"/>
+    <w:lsdException w:name="header" w:semiHidden="1" w:unhideWhenUsed="1"/>
+    <w:lsdException w:name="footer" w:semiHidden="1" w:unhideWhenUsed="1"/>
+    <w:lsdException w:name="index heading" w:semiHidden="1" w:unhideWhenUsed="1"/>
+    <w:lsdException w:name="caption" w:semiHidden="1" w:unhideWhenUsed="1"/>
+    <w:lsdException w:name="table of figures" w:semiHidden="1" w:unhideWhenUsed="1"/>
+    <w:lsdException w:name="envelope address" w:semiHidden="1" w:unhideWhenUsed="1"/>
+    <w:lsdException w:name="envelope return" w:semiHidden="1" w:unhideWhenUsed="1"/>
+    <w:lsdException w:name="footnote reference" w:semiHidden="1" w:unhideWhenUsed="1"/>
+    <w:lsdException w:name="annotation reference" w:semiHidden="1" w:unhideWhenUsed="1"/>
+    <w:lsdException w:name="line number" w:semiHidden="1" w:unhideWhenUsed="1"/>
+    <w:lsdException w:name="page number" w:semiHidden="1" w:unhideWhenUsed="1"/>
+    <w:lsdException w:name="endnote reference" w:semiHidden="1" w:unhideWhenUsed="1"/>
+    <w:lsdException w:name="endnote text" w:semiHidden="1" w:unhideWhenUsed="1"/>
+    <w:lsdException w:name="table of authorities" w:semiHidden="1" w:unhideWhenUsed="1"/>
+    <w:lsdException w:name="macro" w:semiHidden="1" w:unhideWhenUsed="1"/>
+    <w:lsdException w:name="toa heading" w:semiHidden="1" w:unhideWhenUsed="1"/>
+    <w:lsdException w:name="List" w:semiHidden="1" w:unhideWhenUsed="1"/>
+    <w:lsdException w:name="List Bullet" w:semiHidden="1" w:unhideWhenUsed="1"/>
+    <w:lsdException w:name="List Number" w:semiHidden="1" w:unhideWhenUsed="1"/>
+    <w:lsdException w:name="List 2" w:semiHidden="1" w:unhideWhenUsed="1"/>
+    <w:lsdException w:name="List 3" w:semiHidden="1" w:unhideWhenUsed="1"/>
+    <w:lsdException w:name="List 4" w:semiHidden="1" w:unhideWhenUsed="1"/>
+    <w:lsdException w:name="List Bullet 2" w:semiHidden="1" w:unhideWhenUsed="1"/>
+    <w:lsdException w:name="List Bullet 3" w:semiHidden="1" w:unhideWhenUsed="1"/>
+    <w:lsdException w:name="List Number 2" w:semiHidden="1" w:unhideWhenUsed="1"/>
+    <w:lsdException w:name="List Number 3" w:semiHidden="1" w:unhideWhenUsed="1"/>
+    <w:lsdException w:name="List Number 4" w:semiHidden="1" w:unhideWhenUsed="1"/>
+    <w:lsdException w:name="List Number 5" w:semiHidden="1" w:unhideWhenUsed="1"/>
+    <w:lsdException w:name="Closing" w:semiHidden="1" w:unhideWhenUsed="1"/>
+    <w:lsdException w:name="Signature" w:semiHidden="1" w:unhideWhenUsed="1"/>
+    <w:lsdException w:name="Default Paragraph Font" w:semiHidden="1" w:unhideWhenUsed="1"/>
+    <w:lsdException w:name="Body Text" w:semiHidden="1" w:unhideWhenUsed="1"/>
+    <w:lsdException w:name="Body Text Indent" w:semiHidden="1" w:unhideWhenUsed="1"/>
+    <w:lsdException w:name="List Continue" w:semiHidden="1" w:unhideWhenUsed="1"/>
+    <w:lsdException w:name="List Continue 2" w:semiHidden="1" w:unhideWhenUsed="1"/>
+    <w:lsdException w:name="List Continue 3" w:semiHidden="1" w:unhideWhenUsed="1"/>
+    <w:lsdException w:name="List Continue 4" w:semiHidden="1" w:unhideWhenUsed="1"/>
+    <w:lsdException w:name="List Continue 5" w:semiHidden="1" w:unhideWhenUsed="1"/>
+    <w:lsdException w:name="Message Header" w:semiHidden="1" w:unhideWhenUsed="1"/>
+    <w:lsdException w:name="Salutation" w:semiHidden="1" w:unhideWhenUsed="1"/>
+    <w:lsdException w:name="Date" w:semiHidden="1" w:unhideWhenUsed="1"/>
+    <w:lsdException w:name="Body Text First Indent" w:semiHidden="1" w:unhideWhenUsed="1"/>
+    <w:lsdException w:name="Body Text Indent 2" w:semiHidden="1" w:unhideWhenUsed="1"/>
+    <w:lsdException w:name="Body Text Indent 3" w:semiHidden="1" w:unhideWhenUsed="1"/>
+    <w:lsdException w:name="Block Text" w:semiHidden="1" w:unhideWhenUsed="1"/>
+    <w:lsdException w:name="Hyperlink" w:semiHidden="1" w:unhideWhenUsed="1"/>
+    <w:lsdException w:name="FollowedHyperlink" w:semiHidden="1" w:unhideWhenUsed="1"/>
+    <w:lsdException w:name="Document Map" w:semiHidden="1" w:unhideWhenUsed="1"/>
+    <w:lsdException w:name="Plain Text" w:semiHidden="1" w:unhideWhenUsed="1"/>
+    <w:lsdException w:name="E-mail Signature" w:semiHidden="1" w:unhideWhenUsed="1"/>
+    <w:lsdException w:name="HTML Top of Form" w:semiHidden="1" w:unhideWhenUsed="1"/>
+    <w:lsdException w:name="HTML Bottom of Form" w:semiHidden="1" w:unhideWhenUsed="1"/>
+    <w:lsdException w:name="Normal (Web)" w:semiHidden="1" w:unhideWhenUsed="1"/>
+    <w:lsdException w:name="HTML Acronym" w:semiHidden="1" w:unhideWhenUsed="1"/>
+    <w:lsdException w:name="HTML Address" w:semiHidden="1" w:unhideWhenUsed="1"/>
+    <w:lsdException w:name="HTML Cite" w:semiHidden="1" w:unhideWhenUsed="1"/>
+    <w:lsdException w:name="HTML Code" w:semiHidden="1" w:unhideWhenUsed="1"/>
+    <w:lsdException w:name="HTML Definition" w:semiHidden="1" w:unhideWhenUsed="1"/>
+    <w:lsdException w:name="HTML Keyboard" w:semiHidden="1" w:unhideWhenUsed="1"/>
+    <w:lsdException w:name="HTML Preformatted" w:semiHidden="1" w:unhideWhenUsed="1"/>
+    <w:lsdException w:name="HTML Sample" w:semiHidden="1" w:unhideWhenUsed="1"/>
+    <w:lsdException w:name="HTML Typewriter" w:semiHidden="1" w:unhideWhenUsed="1"/>
+    <w:lsdException w:name="HTML Variable" w:semiHidden="1" w:unhideWhenUsed="1"/>
+    <w:lsdException w:name="Normal Table" w:semiHidden="1" w:unhideWhenUsed="1"/>
+    <w:lsdException w:name="annotation subject" w:semiHidden="1" w:unhideWhenUsed="1"/>
+    <w:lsdException w:name="No List" w:semiHidden="1" w:unhideWhenUsed="1"/>
+    <w:lsdException w:name="Outline List 1" w:semiHidden="1" w:unhideWhenUsed="1"/>
+    <w:lsdException w:name="Outline List 2" w:semiHidden="1" w:unhideWhenUsed="1"/>
+    <w:lsdException w:name="Outline List 3" w:semiHidden="1" w:unhideWhenUsed="1"/>
+    <w:lsdException w:name="Table Simple 1" w:semiHidden="1" w:unhideWhenUsed="1"/>
+    <w:lsdException w:name="Table Simple 2" w:semiHidden="1" w:unhideWhenUsed="1"/>
+    <w:lsdException w:name="Table Simple 3" w:semiHidden="1" w:unhideWhenUsed="1"/>
+    <w:lsdException w:name="Table Classic 1" w:semiHidden="1" w:unhideWhenUsed="1"/>
+    <w:lsdException w:name="Table Classic 2" w:semiHidden="1" w:unhideWhenUsed="1"/>
+    <w:lsdException w:name="Table Classic 3" w:semiHidden="1" w:unhideWhenUsed="1"/>
+    <w:lsdException w:name="Table Classic 4" w:semiHidden="1" w:unhideWhenUsed="1"/>
+    <w:lsdException w:name="Table Colorful 1" w:semiHidden="1" w:unhideWhenUsed="1"/>
+    <w:lsdException w:name="Table Colorful 2" w:semiHidden="1" w:unhideWhenUsed="1"/>
+    <w:lsdException w:name="Table Colorful 3" w:semiHidden="1" w:unhideWhenUsed="1"/>
+    <w:lsdException w:name="Table Columns 1" w:semiHidden="1" w:unhideWhenUsed="1"/>
+    <w:lsdException w:name="Table Columns 2" w:semiHidden="1" w:unhideWhenUsed="1"/>
+    <w:lsdException w:name="Table Columns 3" w:semiHidden="1" w:unhideWhenUsed="1"/>
+    <w:lsdException w:name="Table Columns 4" w:semiHidden="1" w:unhideWhenUsed="1"/>
+    <w:lsdException w:name="Table Columns 5" w:semiHidden="1" w:unhideWhenUsed="1"/>
+    <w:lsdException w:name="Table Grid 1" w:semiHidden="1" w:unhideWhenUsed="1"/>
+    <w:lsdException w:name="Table Grid 2" w:semiHidden="1" w:unhideWhenUsed="1"/>
+    <w:lsdException w:name="Table Grid 3" w:semiHidden="1" w:unhideWhenUsed="1"/>
+    <w:lsdException w:name="Table Grid 4" w:semiHidden="1" w:unhideWhenUsed="1"/>
+    <w:lsdException w:name="Table Grid 5" w:semiHidden="1" w:unhideWhenUsed="1"/>
+    <w:lsdException w:name="Table Grid 6" w:semiHidden="1" w:unhideWhenUsed="1"/>
+    <w:lsdException w:name="Table Grid 7" w:semiHidden="1" w:unhideWhenUsed="1"/>
+    <w:lsdException w:name="Table Grid 8" w:semiHidden="1" w:unhideWhenUsed="1"/>
+    <w:lsdException w:name="Table List 1" w:semiHidden="1" w:unhideWhenUsed="1"/>
+    <w:lsdException w:name="Table List 2" w:semiHidden="1" w:unhideWhenUsed="1"/>
+    <w:lsdException w:name="Table List 3" w:semiHidden="1" w:unhideWhenUsed="1"/>
+    <w:lsdException w:name="Table List 4" w:semiHidden="1" w:unhideWhenUsed="1"/>
+    <w:lsdException w:name="Table List 5" w:semiHidden="1" w:unhideWhenUsed="1"/>
+    <w:lsdException w:name="Table List 6" w:semiHidden="1" w:unhideWhenUsed="1"/>
+    <w:lsdException w:name="Table List 7" w:semiHidden="1" w:unhideWhenUsed="1"/>
+    <w:lsdException w:name="Table List 8" w:semiHidden="1" w:unhideWhenUsed="1"/>
+    <w:lsdException w:name="Table 3D effects 1" w:semiHidden="1" w:unhideWhenUsed="1"/>
+    <w:lsdException w:name="Table 3D effects 2" w:semiHidden="1" w:unhideWhenUsed="1"/>
+    <w:lsdException w:name="Table 3D effects 3" w:semiHidden="1" w:unhideWhenUsed="1"/>
+    <w:lsdException w:name="Table Contemporary" w:semiHidden="1" w:unhideWhenUsed="1"/>
+    <w:lsdException w:name="Table Elegant" w:semiHidden="1" w:unhideWhenUsed="1"/>
+    <w:lsdException w:name="Table Professional" w:semiHidden="1" w:unhideWhenUsed="1"/>
+    <w:lsdException w:name="Table Subtle 1" w:semiHidden="1" w:unhideWhenUsed="1"/>
+    <w:lsdException w:name="Table Subtle 2" w:semiHidden="1" w:unhideWhenUsed="1"/>
+    <w:lsdException w:name="Table Web 1" w:semiHidden="1" w:unhideWhenUsed="1"/>
+    <w:lsdException w:name="Table Web 2" w:semiHidden="1" w:unhideWhenUsed="1"/>
+    <w:lsdException w:name="Table Web 3" w:semiHidden="1" w:unhideWhenUsed="1"/>
+    <w:lsdException w:name="Balloon Text" w:semiHidden="1" w:unhideWhenUsed="1"/>
+    <w:lsdException w:name="Table Theme" w:semiHidden="1" w:unhideWhenUsed="1"/>
+    <w:lsdException w:name="Placeholder Text" w:semiHidden="1"/>
+    <w:lsdException w:name="Light Shading"/>
+    <w:lsdException w:name="Light List"/>
+    <w:lsdException w:name="Medium Grid 3"/>
+    <w:lsdException w:name="Dark List"/>
+    <w:lsdException w:name="Colorful Shading"/>
+    <w:lsdException w:name="Colorful List"/>
+    <w:lsdException w:name="Colorful Grid"/>
+    <w:lsdException w:name="Light Shading Accent 1"/>
+    <w:lsdException w:name="Light List Accent 1"/>
+    <w:lsdException w:name="Light Grid Accent 1"/>
+    <w:lsdException w:name="Medium Shading 1 Accent 1"/>
+    <w:lsdException w:name="Medium Shading 2 Accent 1"/>
+    <w:lsdException w:name="Medium List 1 Accent 1"/>
+    <w:lsdException w:name="Revision" w:semiHidden="1"/>
+    <w:lsdException w:name="Medium List 2 Accent 1"/>
+    <w:lsdException w:name="Medium Grid 1 Accent 1"/>
+    <w:lsdException w:name="Medium Grid 2 Accent 1"/>
+    <w:lsdException w:name="Medium Grid 3 Accent 1"/>
+    <w:lsdException w:name="Dark List Accent 1"/>
+    <w:lsdException w:name="Colorful Shading Accent 1"/>
+    <w:lsdException w:name="Colorful List Accent 1"/>
+    <w:lsdException w:name="Colorful Grid Accent 1"/>
+    <w:lsdException w:name="Light Shading Accent 2"/>
+    <w:lsdException w:name="Light List Accent 2"/>
+    <w:lsdException w:name="Light Grid Accent 2"/>
+    <w:lsdException w:name="Medium Shading 1 Accent 2"/>
+    <w:lsdException w:name="Medium Shading 2 Accent 2"/>
+    <w:lsdException w:name="Medium List 1 Accent 2"/>
+    <w:lsdException w:name="Medium List 2 Accent 2"/>
+    <w:lsdException w:name="Medium Grid 1 Accent 2"/>
+    <w:lsdException w:name="Medium Grid 2 Accent 2"/>
+    <w:lsdException w:name="Medium Grid 3 Accent 2"/>
+    <w:lsdException w:name="Dark List Accent 2"/>
+    <w:lsdException w:name="Colorful Shading Accent 2"/>
+    <w:lsdException w:name="Colorful List Accent 2"/>
+    <w:lsdException w:name="Colorful Grid Accent 2"/>
+    <w:lsdException w:name="Light Shading Accent 3"/>
+    <w:lsdException w:name="Light List Accent 3"/>
+    <w:lsdException w:name="Light Grid Accent 3"/>
+    <w:lsdException w:name="Medium Shading 1 Accent 3"/>
+    <w:lsdException w:name="Medium Shading 2 Accent 3"/>
+    <w:lsdException w:name="Medium List 1 Accent 3"/>
+    <w:lsdException w:name="Medium List 2 Accent 3"/>
+    <w:lsdException w:name="Medium Grid 1 Accent 3"/>
+    <w:lsdException w:name="Medium Grid 2 Accent 3"/>
+    <w:lsdException w:name="Medium Grid 3 Accent 3"/>
+    <w:lsdException w:name="Dark List Accent 3"/>
+    <w:lsdException w:name="Colorful Shading Accent 3"/>
+    <w:lsdException w:name="Colorful List Accent 3"/>
+    <w:lsdException w:name="Colorful Grid Accent 3"/>
+    <w:lsdException w:name="Light Shading Accent 4"/>
+    <w:lsdException w:name="Light List Accent 4"/>
+    <w:lsdException w:name="Light Grid Accent 4"/>
+    <w:lsdException w:name="Medium Shading 1 Accent 4"/>
+    <w:lsdException w:name="Medium Shading 2 Accent 4"/>
+    <w:lsdException w:name="Medium List 1 Accent 4"/>
+    <w:lsdException w:name="Medium List 2 Accent 4"/>
+    <w:lsdException w:name="Medium Grid 1 Accent 4"/>
+    <w:lsdException w:name="Medium Grid 2 Accent 4"/>
+    <w:lsdException w:name="Medium Grid 3 Accent 4"/>
+    <w:lsdException w:name="Dark List Accent 4"/>
+    <w:lsdException w:name="Colorful Shading Accent 4"/>
+    <w:lsdException w:name="Colorful List Accent 4"/>
+    <w:lsdException w:name="Colorful Grid Accent 4"/>
+    <w:lsdException w:name="Light Shading Accent 5"/>
+    <w:lsdException w:name="Light List Accent 5"/>
+    <w:lsdException w:name="Light Grid Accent 5"/>
+    <w:lsdException w:name="Medium Shading 1 Accent 5"/>
+    <w:lsdException w:name="Medium Shading 2 Accent 5"/>
+    <w:lsdException w:name="Medium List 1 Accent 5"/>
+    <w:lsdException w:name="Medium List 2 Accent 5"/>
+    <w:lsdException w:name="Medium Grid 1 Accent 5"/>
+    <w:lsdException w:name="Medium Grid 2 Accent 5"/>
+    <w:lsdException w:name="Medium Grid 3 Accent 5"/>
+    <w:lsdException w:name="Dark List Accent 5"/>
+    <w:lsdException w:name="Colorful Shading Accent 5"/>
+    <w:lsdException w:name="Colorful List Accent 5"/>
+    <w:lsdException w:name="Colorful Grid Accent 5"/>
+    <w:lsdException w:name="Light Shading Accent 6"/>
+    <w:lsdException w:name="Light List Accent 6"/>
+    <w:lsdException w:name="Light Grid Accent 6"/>
+    <w:lsdException w:name="Medium Shading 1 Accent 6"/>
+    <w:lsdException w:name="Medium Shading 2 Accent 6"/>
+    <w:lsdException w:name="Medium List 1 Accent 6"/>
+    <w:lsdException w:name="Medium List 2 Accent 6"/>
+    <w:lsdException w:name="Medium Grid 1 Accent 6"/>
+    <w:lsdException w:name="Medium Grid 2 Accent 6"/>
+    <w:lsdException w:name="Medium Grid 3 Accent 6"/>
+    <w:lsdException w:name="Dark List Accent 6"/>
+    <w:lsdException w:name="Colorful Shading Accent 6"/>
+    <w:lsdException w:name="Colorful List Accent 6"/>
+    <w:lsdException w:name="Colorful Grid Accent 6"/>
+    <w:lsdException w:name="Bibliography" w:semiHidden="1" w:unhideWhenUsed="1"/>
+    <w:lsdException w:name="TOC Heading" w:semiHidden="1" w:unhideWhenUsed="1"/>
+    <w:lsdException w:name="Grid Table 4" w:uiPriority="49"/>
+    <w:lsdException w:name="Grid Table 5 Dark" w:uiPriority="50"/>
+    <w:lsdException w:name="Grid Table 6 Colorful" w:uiPriority="51"/>
+    <w:lsdException w:name="Grid Table 7 Colorful" w:uiPriority="52"/>
+    <w:lsdException w:name="Grid Table 1 Light Accent 1" w:uiPriority="46"/>
+    <w:lsdException w:name="Grid Table 2 Accent 1" w:uiPriority="47"/>
+    <w:lsdException w:name="Grid Table 3 Accent 1" w:uiPriority="48"/>
+    <w:lsdException w:name="Grid Table 4 Accent 1" w:uiPriority="49"/>
+    <w:lsdException w:name="Grid Table 5 Dark Accent 1" w:uiPriority="50"/>
+    <w:lsdException w:name="Grid Table 6 Colorful Accent 1" w:uiPriority="51"/>
+    <w:lsdException w:name="Grid Table 7 Colorful Accent 1" w:uiPriority="52"/>
+    <w:lsdException w:name="Grid Table 1 Light Accent 2" w:uiPriority="46"/>
+    <w:lsdException w:name="Grid Table 2 Accent 2" w:uiPriority="47"/>
+    <w:lsdException w:name="Grid Table 3 Accent 2" w:uiPriority="48"/>
+    <w:lsdException w:name="Grid Table 4 Accent 2" w:uiPriority="49"/>
+    <w:lsdException w:name="Grid Table 5 Dark Accent 2" w:uiPriority="50"/>
+    <w:lsdException w:name="Grid Table 6 Colorful Accent 2" w:uiPriority="51"/>
+    <w:lsdException w:name="Grid Table 7 Colorful Accent 2" w:uiPriority="52"/>
+    <w:lsdException w:name="Grid Table 1 Light Accent 3" w:uiPriority="46"/>
+    <w:lsdException w:name="Grid Table 2 Accent 3" w:uiPriority="47"/>
+    <w:lsdException w:name="Grid Table 3 Accent 3" w:uiPriority="48"/>
+    <w:lsdException w:name="Grid Table 4 Accent 3" w:uiPriority="49"/>
+    <w:lsdException w:name="Grid Table 5 Dark Accent 3" w:uiPriority="50"/>
+    <w:lsdException w:name="Grid Table 6 Colorful Accent 3" w:uiPriority="51"/>
+    <w:lsdException w:name="Grid Table 7 Colorful Accent 3" w:uiPriority="52"/>
+    <w:lsdException w:name="Grid Table 1 Light Accent 4" w:uiPriority="46"/>
+    <w:lsdException w:name="Grid Table 2 Accent 4" w:uiPriority="47"/>
+    <w:lsdException w:name="Grid Table 3 Accent 4" w:uiPriority="48"/>
+    <w:lsdException w:name="Grid Table 4 Accent 4" w:uiPriority="49"/>
+    <w:lsdException w:name="Grid Table 5 Dark Accent 4" w:uiPriority="50"/>
+    <w:lsdException w:name="Grid Table 6 Colorful Accent 4" w:uiPriority="51"/>
+    <w:lsdException w:name="Grid Table 7 Colorful Accent 4" w:uiPriority="52"/>
+    <w:lsdException w:name="Grid Table 1 Light Accent 5" w:uiPriority="46"/>
+    <w:lsdException w:name="Grid Table 2 Accent 5" w:uiPriority="47"/>
+    <w:lsdException w:name="Grid Table 3 Accent 5" w:uiPriority="48"/>
+    <w:lsdException w:name="Grid Table 4 Accent 5" w:uiPriority="49"/>
+    <w:lsdException w:name="Grid Table 5 Dark Accent 5" w:uiPriority="50"/>
+    <w:lsdException w:name="Grid Table 6 Colorful Accent 5" w:uiPriority="51"/>
+    <w:lsdException w:name="Grid Table 7 Colorful Accent 5" w:uiPriority="52"/>
+    <w:lsdException w:name="Grid Table 1 Light Accent 6" w:uiPriority="46"/>
+    <w:lsdException w:name="Grid Table 2 Accent 6" w:uiPriority="47"/>
+    <w:lsdException w:name="Grid Table 3 Accent 6" w:uiPriority="48"/>
+    <w:lsdException w:name="Grid Table 4 Accent 6" w:uiPriority="49"/>
+    <w:lsdException w:name="Grid Table 5 Dark Accent 6" w:uiPriority="50"/>
+    <w:lsdException w:name="Grid Table 6 Colorful Accent 6" w:uiPriority="51"/>
+    <w:lsdException w:name="Grid Table 7 Colorful Accent 6" w:uiPriority="52"/>
+    <w:lsdException w:name="List Table 1 Light" w:uiPriority="46"/>
+    <w:lsdException w:name="List Table 2" w:uiPriority="47"/>
+    <w:lsdException w:name="List Table 3" w:uiPriority="48"/>
+    <w:lsdException w:name="List Table 4" w:uiPriority="49"/>
+    <w:lsdException w:name="List Table 5 Dark" w:uiPriority="50"/>
+    <w:lsdException w:name="List Table 6 Colorful" w:uiPriority="51"/>
+    <w:lsdException w:name="List Table 7 Colorful" w:uiPriority="52"/>
+    <w:lsdException w:name="List Table 1 Light Accent 1" w:uiPriority="46"/>
+    <w:lsdException w:name="List Table 2 Accent 1" w:uiPriority="47"/>
+    <w:lsdException w:name="List Table 3 Accent 1" w:uiPriority="48"/>
+    <w:lsdException w:name="List Table 4 Accent 1" w:uiPriority="49"/>
+    <w:lsdException w:name="List Table 5 Dark Accent 1" w:uiPriority="50"/>
+    <w:lsdException w:name="List Table 6 Colorful Accent 1" w:uiPriority="51"/>
+    <w:lsdException w:name="List Table 7 Colorful Accent 1" w:uiPriority="52"/>
+    <w:lsdException w:name="List Table 1 Light Accent 2" w:uiPriority="46"/>
+    <w:lsdException w:name="List Table 2 Accent 2" w:uiPriority="47"/>
+    <w:lsdException w:name="List Table 3 Accent 2" w:uiPriority="48"/>
+    <w:lsdException w:name="List Table 4 Accent 2" w:uiPriority="49"/>
+    <w:lsdException w:name="List Table 5 Dark Accent 2" w:uiPriority="50"/>
+    <w:lsdException w:name="List Table 6 Colorful Accent 2" w:uiPriority="51"/>
+    <w:lsdException w:name="List Table 7 Colorful Accent 2" w:uiPriority="52"/>
+    <w:lsdException w:name="List Table 1 Light Accent 3" w:uiPriority="46"/>
+    <w:lsdException w:name="List Table 2 Accent 3" w:uiPriority="47"/>
+    <w:lsdException w:name="List Table 3 Accent 3" w:uiPriority="48"/>
+    <w:lsdException w:name="List Table 4 Accent 3" w:uiPriority="49"/>
+    <w:lsdException w:name="List Table 5 Dark Accent 3" w:uiPriority="50"/>
+    <w:lsdException w:name="List Table 6 Colorful Accent 3" w:uiPriority="51"/>
+    <w:lsdException w:name="List Table 7 Colorful Accent 3" w:uiPriority="52"/>
+    <w:lsdException w:name="List Table 1 Light Accent 4" w:uiPriority="46"/>
+    <w:lsdException w:name="List Table 2 Accent 4" w:uiPriority="47"/>
+    <w:lsdException w:name="List Table 3 Accent 4" w:uiPriority="48"/>
+    <w:lsdException w:name="List Table 4 Accent 4" w:uiPriority="49"/>
+    <w:lsdException w:name="List Table 5 Dark Accent 4" w:uiPriority="50"/>
+    <w:lsdException w:name="List Table 6 Colorful Accent 4" w:uiPriority="51"/>
+    <w:lsdException w:name="List Table 7 Colorful Accent 4" w:uiPriority="52"/>
+    <w:lsdException w:name="List Table 1 Light Accent 5" w:uiPriority="46"/>
+    <w:lsdException w:name="List Table 2 Accent 5" w:uiPriority="47"/>
+    <w:lsdException w:name="List Table 3 Accent 5" w:uiPriority="48"/>
+    <w:lsdException w:name="List Table 4 Accent 5" w:uiPriority="49"/>
+    <w:lsdException w:name="List Table 5 Dark Accent 5" w:uiPriority="50"/>
+    <w:lsdException w:name="List Table 6 Colorful Accent 5" w:uiPriority="51"/>
+    <w:lsdException w:name="List Table 7 Colorful Accent 5" w:uiPriority="52"/>
+    <w:lsdException w:name="List Table 1 Light Accent 6" w:uiPriority="46"/>
+    <w:lsdException w:name="List Table 2 Accent 6" w:uiPriority="47"/>
+    <w:lsdException w:name="List Table 3 Accent 6" w:uiPriority="48"/>
+    <w:lsdException w:name="List Table 4 Accent 6" w:uiPriority="49"/>
+    <w:lsdException w:name="List Table 5 Dark Accent 6" w:uiPriority="50"/>
+    <w:lsdException w:name="List Table 6 Colorful Accent 6" w:uiPriority="51"/>
+    <w:lsdException w:name="List Table 7 Colorful Accent 6" w:uiPriority="52"/>
+    <w:lsdException w:name="Mention" w:semiHidden="1" w:uiPriority="99" w:unhideWhenUsed="1"/>
+    <w:lsdException w:name="Smart Hyperlink" w:semiHidden="1" w:uiPriority="99" w:unhideWhenUsed="1"/>
+    <w:lsdException w:name="Hashtag" w:semiHidden="1" w:uiPriority="99" w:unhideWhenUsed="1"/>
+    <w:lsdException w:name="Unresolved Mention" w:semiHidden="1" w:uiPriority="99" w:unhideWhenUsed="1"/>
+    <w:lsdException w:name="Smart Link" w:semiHidden="1" w:uiPriority="99" w:unhideWhenUsed="1"/>
+  </w:latentStyles>
   <w:style w:default="1" w:styleId="Normal" w:type="paragraph">
     <w:name w:val="Normal"/>
     <w:qFormat/>
-  </w:style>
-  <w:style w:styleId="BodyText" w:type="paragraph">
+    <w:rsid w:val="00333C3B"/>
+    <w:pPr>
+      <w:jc w:val="both"/>
+    </w:pPr>
+  </w:style>
+  <w:style w:styleId="Titre1" w:type="paragraph">
+    <w:name w:val="heading 1"/>
+    <w:basedOn w:val="Normal"/>
+    <w:next w:val="Corpsdetexte"/>
+    <w:link w:val="Titre1Car"/>
+    <w:uiPriority w:val="9"/>
+    <w:qFormat/>
+    <w:rsid w:val="00A10FD9"/>
+    <w:pPr>
+      <w:keepNext/>
+      <w:keepLines/>
+      <w:spacing w:after="80" w:before="360"/>
+      <w:outlineLvl w:val="0"/>
+    </w:pPr>
+    <w:rPr>
+      <w:rFonts w:asciiTheme="majorHAnsi" w:cstheme="majorBidi" w:eastAsiaTheme="majorEastAsia" w:hAnsiTheme="majorHAnsi"/>
+      <w:color w:themeColor="accent1" w:themeShade="BF" w:val="0F4761"/>
+      <w:sz w:val="40"/>
+      <w:szCs w:val="40"/>
+    </w:rPr>
+  </w:style>
+  <w:style w:styleId="Titre2" w:type="paragraph">
+    <w:name w:val="heading 2"/>
+    <w:basedOn w:val="Normal"/>
+    <w:next w:val="Corpsdetexte"/>
+    <w:link w:val="Titre2Car"/>
+    <w:uiPriority w:val="9"/>
+    <w:semiHidden/>
+    <w:unhideWhenUsed/>
+    <w:qFormat/>
+    <w:rsid w:val="00A10FD9"/>
+    <w:pPr>
+      <w:keepNext/>
+      <w:keepLines/>
+      <w:spacing w:after="80" w:before="160"/>
+      <w:outlineLvl w:val="1"/>
+    </w:pPr>
+    <w:rPr>
+      <w:rFonts w:asciiTheme="majorHAnsi" w:cstheme="majorBidi" w:eastAsiaTheme="majorEastAsia" w:hAnsiTheme="majorHAnsi"/>
+      <w:color w:themeColor="accent1" w:themeShade="BF" w:val="0F4761"/>
+      <w:sz w:val="32"/>
+      <w:szCs w:val="32"/>
+    </w:rPr>
+  </w:style>
+  <w:style w:styleId="Titre3" w:type="paragraph">
+    <w:name w:val="heading 3"/>
+    <w:basedOn w:val="Normal"/>
+    <w:next w:val="Corpsdetexte"/>
+    <w:link w:val="Titre3Car"/>
+    <w:uiPriority w:val="9"/>
+    <w:semiHidden/>
+    <w:unhideWhenUsed/>
+    <w:qFormat/>
+    <w:rsid w:val="00A10FD9"/>
+    <w:pPr>
+      <w:keepNext/>
+      <w:keepLines/>
+      <w:spacing w:after="80" w:before="160"/>
+      <w:outlineLvl w:val="2"/>
+    </w:pPr>
+    <w:rPr>
+      <w:rFonts w:cstheme="majorBidi" w:eastAsiaTheme="majorEastAsia"/>
+      <w:color w:themeColor="accent1" w:themeShade="BF" w:val="0F4761"/>
+      <w:sz w:val="28"/>
+      <w:szCs w:val="28"/>
+    </w:rPr>
+  </w:style>
+  <w:style w:styleId="Titre4" w:type="paragraph">
+    <w:name w:val="heading 4"/>
+    <w:basedOn w:val="Normal"/>
+    <w:next w:val="Corpsdetexte"/>
+    <w:link w:val="Titre4Car"/>
+    <w:uiPriority w:val="9"/>
+    <w:semiHidden/>
+    <w:unhideWhenUsed/>
+    <w:qFormat/>
+    <w:rsid w:val="00A10FD9"/>
+    <w:pPr>
+      <w:keepNext/>
+      <w:keepLines/>
+      <w:spacing w:after="40" w:before="80"/>
+      <w:outlineLvl w:val="3"/>
+    </w:pPr>
+    <w:rPr>
+      <w:rFonts w:cstheme="majorBidi" w:eastAsiaTheme="majorEastAsia"/>
+      <w:i/>
+      <w:iCs/>
+      <w:color w:themeColor="accent1" w:themeShade="BF" w:val="0F4761"/>
+    </w:rPr>
+  </w:style>
+  <w:style w:styleId="Titre5" w:type="paragraph">
+    <w:name w:val="heading 5"/>
+    <w:basedOn w:val="Normal"/>
+    <w:next w:val="Corpsdetexte"/>
+    <w:link w:val="Titre5Car"/>
+    <w:uiPriority w:val="9"/>
+    <w:semiHidden/>
+    <w:unhideWhenUsed/>
+    <w:qFormat/>
+    <w:rsid w:val="00A10FD9"/>
+    <w:pPr>
+      <w:keepNext/>
+      <w:keepLines/>
+      <w:spacing w:after="40" w:before="80"/>
+      <w:outlineLvl w:val="4"/>
+    </w:pPr>
+    <w:rPr>
+      <w:rFonts w:cstheme="majorBidi" w:eastAsiaTheme="majorEastAsia"/>
+      <w:color w:themeColor="accent1" w:themeShade="BF" w:val="0F4761"/>
+    </w:rPr>
+  </w:style>
+  <w:style w:styleId="Titre6" w:type="paragraph">
+    <w:name w:val="heading 6"/>
+    <w:basedOn w:val="Normal"/>
+    <w:next w:val="Corpsdetexte"/>
+    <w:link w:val="Titre6Car"/>
+    <w:uiPriority w:val="9"/>
+    <w:semiHidden/>
+    <w:unhideWhenUsed/>
+    <w:qFormat/>
+    <w:rsid w:val="00A10FD9"/>
+    <w:pPr>
+      <w:keepNext/>
+      <w:keepLines/>
+      <w:spacing w:after="0" w:before="40"/>
+      <w:outlineLvl w:val="5"/>
+    </w:pPr>
+    <w:rPr>
+      <w:rFonts w:cstheme="majorBidi" w:eastAsiaTheme="majorEastAsia"/>
+      <w:i/>
+      <w:iCs/>
+      <w:color w:themeColor="text1" w:themeTint="A6" w:val="595959"/>
+    </w:rPr>
+  </w:style>
+  <w:style w:styleId="Titre7" w:type="paragraph">
+    <w:name w:val="heading 7"/>
+    <w:basedOn w:val="Normal"/>
+    <w:next w:val="Corpsdetexte"/>
+    <w:link w:val="Titre7Car"/>
+    <w:uiPriority w:val="9"/>
+    <w:semiHidden/>
+    <w:unhideWhenUsed/>
+    <w:qFormat/>
+    <w:rsid w:val="00A10FD9"/>
+    <w:pPr>
+      <w:keepNext/>
+      <w:keepLines/>
+      <w:spacing w:after="0" w:before="40"/>
+      <w:outlineLvl w:val="6"/>
+    </w:pPr>
+    <w:rPr>
+      <w:rFonts w:cstheme="majorBidi" w:eastAsiaTheme="majorEastAsia"/>
+      <w:color w:themeColor="text1" w:themeTint="A6" w:val="595959"/>
+    </w:rPr>
+  </w:style>
+  <w:style w:styleId="Titre8" w:type="paragraph">
+    <w:name w:val="heading 8"/>
+    <w:basedOn w:val="Normal"/>
+    <w:next w:val="Corpsdetexte"/>
+    <w:link w:val="Titre8Car"/>
+    <w:uiPriority w:val="9"/>
+    <w:semiHidden/>
+    <w:unhideWhenUsed/>
+    <w:qFormat/>
+    <w:rsid w:val="00A10FD9"/>
+    <w:pPr>
+      <w:keepNext/>
+      <w:keepLines/>
+      <w:spacing w:after="0"/>
+      <w:outlineLvl w:val="7"/>
+    </w:pPr>
+    <w:rPr>
+      <w:rFonts w:cstheme="majorBidi" w:eastAsiaTheme="majorEastAsia"/>
+      <w:i/>
+      <w:iCs/>
+      <w:color w:themeColor="text1" w:themeTint="D8" w:val="272727"/>
+    </w:rPr>
+  </w:style>
+  <w:style w:styleId="Titre9" w:type="paragraph">
+    <w:name w:val="heading 9"/>
+    <w:basedOn w:val="Normal"/>
+    <w:next w:val="Corpsdetexte"/>
+    <w:link w:val="Titre9Car"/>
+    <w:uiPriority w:val="9"/>
+    <w:semiHidden/>
+    <w:unhideWhenUsed/>
+    <w:qFormat/>
+    <w:rsid w:val="00A10FD9"/>
+    <w:pPr>
+      <w:keepNext/>
+      <w:keepLines/>
+      <w:spacing w:after="0"/>
+      <w:outlineLvl w:val="8"/>
+    </w:pPr>
+    <w:rPr>
+      <w:rFonts w:cstheme="majorBidi" w:eastAsiaTheme="majorEastAsia"/>
+      <w:color w:themeColor="text1" w:themeTint="D8" w:val="272727"/>
+    </w:rPr>
+  </w:style>
+  <w:style w:default="1" w:styleId="Policepardfaut" w:type="character">
+    <w:name w:val="Default Paragraph Font"/>
+    <w:uiPriority w:val="1"/>
+    <w:semiHidden/>
+    <w:unhideWhenUsed/>
+  </w:style>
+  <w:style w:default="1" w:styleId="TableauNormal" w:type="table">
+    <w:name w:val="Normal Table"/>
+    <w:uiPriority w:val="99"/>
+    <w:semiHidden/>
+    <w:unhideWhenUsed/>
+    <w:tblPr>
+      <w:tblInd w:type="dxa" w:w="0"/>
+      <w:tblCellMar>
+        <w:top w:type="dxa" w:w="0"/>
+        <w:left w:type="dxa" w:w="108"/>
+        <w:bottom w:type="dxa" w:w="0"/>
+        <w:right w:type="dxa" w:w="108"/>
+      </w:tblCellMar>
+    </w:tblPr>
+  </w:style>
+  <w:style w:default="1" w:styleId="Aucuneliste" w:type="numbering">
+    <w:name w:val="No List"/>
+    <w:uiPriority w:val="99"/>
+    <w:semiHidden/>
+    <w:unhideWhenUsed/>
+  </w:style>
+  <w:style w:styleId="Corpsdetexte" w:type="paragraph">
     <w:name w:val="Body Text"/>
     <w:basedOn w:val="Normal"/>
-    <w:link w:val="BodyTextChar"/>
     <w:qFormat/>
     <w:pPr>
       <w:spacing w:after="180" w:before="180"/>
@@ -3285,28 +3956,28 @@
   </w:style>
   <w:style w:customStyle="1" w:styleId="FirstParagraph" w:type="paragraph">
     <w:name w:val="First Paragraph"/>
-    <w:basedOn w:val="BodyText"/>
-    <w:next w:val="BodyText"/>
+    <w:basedOn w:val="Corpsdetexte"/>
+    <w:next w:val="Corpsdetexte"/>
     <w:qFormat/>
   </w:style>
   <w:style w:customStyle="1" w:styleId="Compact" w:type="paragraph">
     <w:name w:val="Compact"/>
-    <w:basedOn w:val="BodyText"/>
+    <w:basedOn w:val="Corpsdetexte"/>
     <w:qFormat/>
     <w:pPr>
       <w:spacing w:after="36" w:before="36"/>
     </w:pPr>
   </w:style>
-  <w:style w:styleId="Title" w:type="paragraph">
+  <w:style w:styleId="Titre" w:type="paragraph">
     <w:name w:val="Title"/>
     <w:basedOn w:val="Normal"/>
-    <w:next w:val="BodyText"/>
-    <w:link w:val="TitleChar"/>
+    <w:next w:val="Corpsdetexte"/>
+    <w:link w:val="TitreCar"/>
     <w:uiPriority w:val="10"/>
     <w:qFormat/>
     <w:rsid w:val="00A10FD9"/>
     <w:pPr>
-      <w:spacing w:after="80" w:line="240" w:lineRule="auto"/>
+      <w:spacing w:after="80"/>
       <w:contextualSpacing/>
       <w:jc w:val="center"/>
     </w:pPr>
@@ -3316,10 +3987,10 @@
       <w:szCs w:val="56"/>
     </w:rPr>
   </w:style>
-  <w:style w:customStyle="1" w:styleId="TitleChar" w:type="character">
-    <w:name w:val="Title Char"/>
-    <w:basedOn w:val="DefaultParagraphFont"/>
-    <w:link w:val="Title"/>
+  <w:style w:customStyle="1" w:styleId="TitreCar" w:type="character">
+    <w:name w:val="Titre Car"/>
+    <w:basedOn w:val="Policepardfaut"/>
+    <w:link w:val="Titre"/>
     <w:uiPriority w:val="10"/>
     <w:rsid w:val="00A10FD9"/>
     <w:rPr>
@@ -3328,11 +3999,11 @@
       <w:szCs w:val="56"/>
     </w:rPr>
   </w:style>
-  <w:style w:styleId="Subtitle" w:type="paragraph">
+  <w:style w:styleId="Sous-titre" w:type="paragraph">
     <w:name w:val="Subtitle"/>
-    <w:basedOn w:val="Title"/>
-    <w:next w:val="BodyText"/>
-    <w:link w:val="SubtitleChar"/>
+    <w:basedOn w:val="Titre"/>
+    <w:next w:val="Corpsdetexte"/>
+    <w:link w:val="Sous-titreCar"/>
     <w:uiPriority w:val="11"/>
     <w:qFormat/>
     <w:rsid w:val="00A10FD9"/>
@@ -3342,16 +4013,15 @@
       </w:numPr>
     </w:pPr>
     <w:rPr>
-      <w:rFonts w:cstheme="majorBidi" w:eastAsiaTheme="majorEastAsia"/>
       <w:spacing w:val="15"/>
       <w:sz w:val="28"/>
       <w:szCs w:val="28"/>
     </w:rPr>
   </w:style>
-  <w:style w:customStyle="1" w:styleId="SubtitleChar" w:type="character">
-    <w:name w:val="Subtitle Char"/>
-    <w:basedOn w:val="DefaultParagraphFont"/>
-    <w:link w:val="Subtitle"/>
+  <w:style w:customStyle="1" w:styleId="Sous-titreCar" w:type="character">
+    <w:name w:val="Sous-titre Car"/>
+    <w:basedOn w:val="Policepardfaut"/>
+    <w:link w:val="Sous-titre"/>
     <w:uiPriority w:val="11"/>
     <w:rsid w:val="00A10FD9"/>
     <w:rPr>
@@ -3364,8 +4034,8 @@
   </w:style>
   <w:style w:customStyle="1" w:styleId="Author" w:type="paragraph">
     <w:name w:val="Author"/>
-    <w:basedOn w:val="Title"/>
-    <w:next w:val="BodyText"/>
+    <w:basedOn w:val="Titre"/>
+    <w:next w:val="Corpsdetexte"/>
     <w:qFormat/>
     <w:pPr>
       <w:keepNext/>
@@ -3378,8 +4048,8 @@
   </w:style>
   <w:style w:styleId="Date" w:type="paragraph">
     <w:name w:val="Date"/>
-    <w:basedOn w:val="Title"/>
-    <w:next w:val="BodyText"/>
+    <w:basedOn w:val="Titre"/>
+    <w:next w:val="Corpsdetexte"/>
     <w:qFormat/>
     <w:pPr>
       <w:keepNext/>
@@ -3410,7 +4080,7 @@
   <w:style w:customStyle="1" w:styleId="Abstract" w:type="paragraph">
     <w:name w:val="Abstract"/>
     <w:basedOn w:val="Normal"/>
-    <w:next w:val="BodyText"/>
+    <w:next w:val="Corpsdetexte"/>
     <w:qFormat/>
     <w:pPr>
       <w:keepNext/>
@@ -3422,28 +4092,17 @@
       <w:szCs w:val="20"/>
     </w:rPr>
   </w:style>
-  <w:style w:styleId="Bibliography" w:type="paragraph">
+  <w:style w:styleId="Bibliographie" w:type="paragraph">
     <w:name w:val="Bibliography"/>
     <w:basedOn w:val="Normal"/>
-    <w:next w:val="Bibliography"/>
     <w:qFormat/>
-    <w:pPr/>
-    <w:rPr/>
-  </w:style>
-  <w:style w:styleId="Heading1" w:type="paragraph">
-    <w:name w:val="heading 1"/>
-    <w:basedOn w:val="Normal"/>
-    <w:next w:val="BodyText"/>
-    <w:link w:val="Heading1Char"/>
+  </w:style>
+  <w:style w:customStyle="1" w:styleId="Titre1Car" w:type="character">
+    <w:name w:val="Titre 1 Car"/>
+    <w:basedOn w:val="Policepardfaut"/>
+    <w:link w:val="Titre1"/>
     <w:uiPriority w:val="9"/>
-    <w:qFormat/>
     <w:rsid w:val="00A10FD9"/>
-    <w:pPr>
-      <w:keepNext/>
-      <w:keepLines/>
-      <w:spacing w:after="80" w:before="360"/>
-      <w:outlineLvl w:val="0"/>
-    </w:pPr>
     <w:rPr>
       <w:rFonts w:asciiTheme="majorHAnsi" w:cstheme="majorBidi" w:eastAsiaTheme="majorEastAsia" w:hAnsiTheme="majorHAnsi"/>
       <w:color w:themeColor="accent1" w:themeShade="BF" w:val="0F4761"/>
@@ -3451,22 +4110,13 @@
       <w:szCs w:val="40"/>
     </w:rPr>
   </w:style>
-  <w:style w:styleId="Heading2" w:type="paragraph">
-    <w:name w:val="heading 2"/>
-    <w:basedOn w:val="Normal"/>
-    <w:next w:val="BodyText"/>
-    <w:link w:val="Heading2Char"/>
+  <w:style w:customStyle="1" w:styleId="Titre2Car" w:type="character">
+    <w:name w:val="Titre 2 Car"/>
+    <w:basedOn w:val="Policepardfaut"/>
+    <w:link w:val="Titre2"/>
     <w:uiPriority w:val="9"/>
     <w:semiHidden/>
-    <w:unhideWhenUsed/>
-    <w:qFormat/>
     <w:rsid w:val="00A10FD9"/>
-    <w:pPr>
-      <w:keepNext/>
-      <w:keepLines/>
-      <w:spacing w:after="80" w:before="160"/>
-      <w:outlineLvl w:val="1"/>
-    </w:pPr>
     <w:rPr>
       <w:rFonts w:asciiTheme="majorHAnsi" w:cstheme="majorBidi" w:eastAsiaTheme="majorEastAsia" w:hAnsiTheme="majorHAnsi"/>
       <w:color w:themeColor="accent1" w:themeShade="BF" w:val="0F4761"/>
@@ -3474,22 +4124,13 @@
       <w:szCs w:val="32"/>
     </w:rPr>
   </w:style>
-  <w:style w:styleId="Heading3" w:type="paragraph">
-    <w:name w:val="heading 3"/>
-    <w:basedOn w:val="Normal"/>
-    <w:next w:val="BodyText"/>
-    <w:link w:val="Heading3Char"/>
+  <w:style w:customStyle="1" w:styleId="Titre3Car" w:type="character">
+    <w:name w:val="Titre 3 Car"/>
+    <w:basedOn w:val="Policepardfaut"/>
+    <w:link w:val="Titre3"/>
     <w:uiPriority w:val="9"/>
     <w:semiHidden/>
-    <w:unhideWhenUsed/>
-    <w:qFormat/>
     <w:rsid w:val="00A10FD9"/>
-    <w:pPr>
-      <w:keepNext/>
-      <w:keepLines/>
-      <w:spacing w:after="80" w:before="160"/>
-      <w:outlineLvl w:val="2"/>
-    </w:pPr>
     <w:rPr>
       <w:rFonts w:cstheme="majorBidi" w:eastAsiaTheme="majorEastAsia"/>
       <w:color w:themeColor="accent1" w:themeShade="BF" w:val="0F4761"/>
@@ -3497,22 +4138,13 @@
       <w:szCs w:val="28"/>
     </w:rPr>
   </w:style>
-  <w:style w:styleId="Heading4" w:type="paragraph">
-    <w:name w:val="heading 4"/>
-    <w:basedOn w:val="Normal"/>
-    <w:next w:val="BodyText"/>
-    <w:link w:val="Heading4Char"/>
+  <w:style w:customStyle="1" w:styleId="Titre4Car" w:type="character">
+    <w:name w:val="Titre 4 Car"/>
+    <w:basedOn w:val="Policepardfaut"/>
+    <w:link w:val="Titre4"/>
     <w:uiPriority w:val="9"/>
     <w:semiHidden/>
-    <w:unhideWhenUsed/>
-    <w:qFormat/>
     <w:rsid w:val="00A10FD9"/>
-    <w:pPr>
-      <w:keepNext/>
-      <w:keepLines/>
-      <w:spacing w:after="40" w:before="80"/>
-      <w:outlineLvl w:val="3"/>
-    </w:pPr>
     <w:rPr>
       <w:rFonts w:cstheme="majorBidi" w:eastAsiaTheme="majorEastAsia"/>
       <w:i/>
@@ -3520,43 +4152,25 @@
       <w:color w:themeColor="accent1" w:themeShade="BF" w:val="0F4761"/>
     </w:rPr>
   </w:style>
-  <w:style w:styleId="Heading5" w:type="paragraph">
-    <w:name w:val="heading 5"/>
-    <w:basedOn w:val="Normal"/>
-    <w:next w:val="BodyText"/>
-    <w:link w:val="Heading5Char"/>
+  <w:style w:customStyle="1" w:styleId="Titre5Car" w:type="character">
+    <w:name w:val="Titre 5 Car"/>
+    <w:basedOn w:val="Policepardfaut"/>
+    <w:link w:val="Titre5"/>
     <w:uiPriority w:val="9"/>
     <w:semiHidden/>
-    <w:unhideWhenUsed/>
-    <w:qFormat/>
     <w:rsid w:val="00A10FD9"/>
-    <w:pPr>
-      <w:keepNext/>
-      <w:keepLines/>
-      <w:spacing w:after="40" w:before="80"/>
-      <w:outlineLvl w:val="4"/>
-    </w:pPr>
     <w:rPr>
       <w:rFonts w:cstheme="majorBidi" w:eastAsiaTheme="majorEastAsia"/>
       <w:color w:themeColor="accent1" w:themeShade="BF" w:val="0F4761"/>
     </w:rPr>
   </w:style>
-  <w:style w:styleId="Heading6" w:type="paragraph">
-    <w:name w:val="heading 6"/>
-    <w:basedOn w:val="Normal"/>
-    <w:next w:val="BodyText"/>
-    <w:link w:val="Heading6Char"/>
+  <w:style w:customStyle="1" w:styleId="Titre6Car" w:type="character">
+    <w:name w:val="Titre 6 Car"/>
+    <w:basedOn w:val="Policepardfaut"/>
+    <w:link w:val="Titre6"/>
     <w:uiPriority w:val="9"/>
     <w:semiHidden/>
-    <w:unhideWhenUsed/>
-    <w:qFormat/>
     <w:rsid w:val="00A10FD9"/>
-    <w:pPr>
-      <w:keepNext/>
-      <w:keepLines/>
-      <w:spacing w:after="0" w:before="40"/>
-      <w:outlineLvl w:val="5"/>
-    </w:pPr>
     <w:rPr>
       <w:rFonts w:cstheme="majorBidi" w:eastAsiaTheme="majorEastAsia"/>
       <w:i/>
@@ -3564,43 +4178,25 @@
       <w:color w:themeColor="text1" w:themeTint="A6" w:val="595959"/>
     </w:rPr>
   </w:style>
-  <w:style w:styleId="Heading7" w:type="paragraph">
-    <w:name w:val="heading 7"/>
-    <w:basedOn w:val="Normal"/>
-    <w:next w:val="BodyText"/>
-    <w:link w:val="Heading7Char"/>
+  <w:style w:customStyle="1" w:styleId="Titre7Car" w:type="character">
+    <w:name w:val="Titre 7 Car"/>
+    <w:basedOn w:val="Policepardfaut"/>
+    <w:link w:val="Titre7"/>
     <w:uiPriority w:val="9"/>
     <w:semiHidden/>
-    <w:unhideWhenUsed/>
-    <w:qFormat/>
     <w:rsid w:val="00A10FD9"/>
-    <w:pPr>
-      <w:keepNext/>
-      <w:keepLines/>
-      <w:spacing w:after="0" w:before="40"/>
-      <w:outlineLvl w:val="6"/>
-    </w:pPr>
     <w:rPr>
       <w:rFonts w:cstheme="majorBidi" w:eastAsiaTheme="majorEastAsia"/>
       <w:color w:themeColor="text1" w:themeTint="A6" w:val="595959"/>
     </w:rPr>
   </w:style>
-  <w:style w:styleId="Heading8" w:type="paragraph">
-    <w:name w:val="heading 8"/>
-    <w:basedOn w:val="Normal"/>
-    <w:next w:val="BodyText"/>
-    <w:link w:val="Heading8Char"/>
+  <w:style w:customStyle="1" w:styleId="Titre8Car" w:type="character">
+    <w:name w:val="Titre 8 Car"/>
+    <w:basedOn w:val="Policepardfaut"/>
+    <w:link w:val="Titre8"/>
     <w:uiPriority w:val="9"/>
     <w:semiHidden/>
-    <w:unhideWhenUsed/>
-    <w:qFormat/>
     <w:rsid w:val="00A10FD9"/>
-    <w:pPr>
-      <w:keepNext/>
-      <w:keepLines/>
-      <w:spacing w:after="0"/>
-      <w:outlineLvl w:val="7"/>
-    </w:pPr>
     <w:rPr>
       <w:rFonts w:cstheme="majorBidi" w:eastAsiaTheme="majorEastAsia"/>
       <w:i/>
@@ -3608,186 +4204,51 @@
       <w:color w:themeColor="text1" w:themeTint="D8" w:val="272727"/>
     </w:rPr>
   </w:style>
-  <w:style w:styleId="Heading9" w:type="paragraph">
-    <w:name w:val="heading 9"/>
-    <w:basedOn w:val="Normal"/>
-    <w:next w:val="BodyText"/>
-    <w:link w:val="Heading9Char"/>
-    <w:uiPriority w:val="9"/>
-    <w:semiHidden/>
-    <w:unhideWhenUsed/>
-    <w:qFormat/>
-    <w:rsid w:val="00A10FD9"/>
-    <w:pPr>
-      <w:keepNext/>
-      <w:keepLines/>
-      <w:spacing w:after="0"/>
-      <w:outlineLvl w:val="8"/>
-    </w:pPr>
-    <w:rPr>
-      <w:rFonts w:cstheme="majorBidi" w:eastAsiaTheme="majorEastAsia"/>
-      <w:color w:themeColor="text1" w:themeTint="D8" w:val="272727"/>
-    </w:rPr>
-  </w:style>
-  <w:style w:customStyle="1" w:styleId="Heading1Char" w:type="character">
-    <w:name w:val="Heading 1 Char"/>
-    <w:basedOn w:val="DefaultParagraphFont"/>
-    <w:link w:val="Heading1"/>
-    <w:uiPriority w:val="9"/>
-    <w:rsid w:val="00A10FD9"/>
-    <w:rPr>
-      <w:rFonts w:asciiTheme="majorHAnsi" w:cstheme="majorBidi" w:eastAsiaTheme="majorEastAsia" w:hAnsiTheme="majorHAnsi"/>
-      <w:color w:themeColor="accent1" w:themeShade="BF" w:val="0F4761"/>
-      <w:sz w:val="40"/>
-      <w:szCs w:val="40"/>
-    </w:rPr>
-  </w:style>
-  <w:style w:customStyle="1" w:styleId="Heading2Char" w:type="character">
-    <w:name w:val="Heading 2 Char"/>
-    <w:basedOn w:val="DefaultParagraphFont"/>
-    <w:link w:val="Heading2"/>
+  <w:style w:customStyle="1" w:styleId="Titre9Car" w:type="character">
+    <w:name w:val="Titre 9 Car"/>
+    <w:basedOn w:val="Policepardfaut"/>
+    <w:link w:val="Titre9"/>
     <w:uiPriority w:val="9"/>
     <w:semiHidden/>
     <w:rsid w:val="00A10FD9"/>
     <w:rPr>
-      <w:rFonts w:asciiTheme="majorHAnsi" w:cstheme="majorBidi" w:eastAsiaTheme="majorEastAsia" w:hAnsiTheme="majorHAnsi"/>
-      <w:color w:themeColor="accent1" w:themeShade="BF" w:val="0F4761"/>
-      <w:sz w:val="32"/>
-      <w:szCs w:val="32"/>
-    </w:rPr>
-  </w:style>
-  <w:style w:customStyle="1" w:styleId="Heading3Char" w:type="character">
-    <w:name w:val="Heading 3 Char"/>
-    <w:basedOn w:val="DefaultParagraphFont"/>
-    <w:link w:val="Heading3"/>
-    <w:uiPriority w:val="9"/>
-    <w:semiHidden/>
-    <w:rsid w:val="00A10FD9"/>
-    <w:rPr>
-      <w:rFonts w:cstheme="majorBidi" w:eastAsiaTheme="majorEastAsia"/>
-      <w:color w:themeColor="accent1" w:themeShade="BF" w:val="0F4761"/>
-      <w:sz w:val="28"/>
-      <w:szCs w:val="28"/>
-    </w:rPr>
-  </w:style>
-  <w:style w:customStyle="1" w:styleId="Heading4Char" w:type="character">
-    <w:name w:val="Heading 4 Char"/>
-    <w:basedOn w:val="DefaultParagraphFont"/>
-    <w:link w:val="Heading4"/>
-    <w:uiPriority w:val="9"/>
-    <w:semiHidden/>
-    <w:rsid w:val="00A10FD9"/>
-    <w:rPr>
-      <w:rFonts w:cstheme="majorBidi" w:eastAsiaTheme="majorEastAsia"/>
-      <w:i/>
-      <w:iCs/>
-      <w:color w:themeColor="accent1" w:themeShade="BF" w:val="0F4761"/>
-    </w:rPr>
-  </w:style>
-  <w:style w:customStyle="1" w:styleId="Heading5Char" w:type="character">
-    <w:name w:val="Heading 5 Char"/>
-    <w:basedOn w:val="DefaultParagraphFont"/>
-    <w:link w:val="Heading5"/>
-    <w:uiPriority w:val="9"/>
-    <w:semiHidden/>
-    <w:rsid w:val="00A10FD9"/>
-    <w:rPr>
-      <w:rFonts w:cstheme="majorBidi" w:eastAsiaTheme="majorEastAsia"/>
-      <w:color w:themeColor="accent1" w:themeShade="BF" w:val="0F4761"/>
-    </w:rPr>
-  </w:style>
-  <w:style w:customStyle="1" w:styleId="Heading6Char" w:type="character">
-    <w:name w:val="Heading 6 Char"/>
-    <w:basedOn w:val="DefaultParagraphFont"/>
-    <w:link w:val="Heading6"/>
-    <w:uiPriority w:val="9"/>
-    <w:semiHidden/>
-    <w:rsid w:val="00A10FD9"/>
-    <w:rPr>
-      <w:rFonts w:cstheme="majorBidi" w:eastAsiaTheme="majorEastAsia"/>
-      <w:i/>
-      <w:iCs/>
-      <w:color w:themeColor="text1" w:themeTint="A6" w:val="595959"/>
-    </w:rPr>
-  </w:style>
-  <w:style w:customStyle="1" w:styleId="Heading7Char" w:type="character">
-    <w:name w:val="Heading 7 Char"/>
-    <w:basedOn w:val="DefaultParagraphFont"/>
-    <w:link w:val="Heading7"/>
-    <w:uiPriority w:val="9"/>
-    <w:semiHidden/>
-    <w:rsid w:val="00A10FD9"/>
-    <w:rPr>
-      <w:rFonts w:cstheme="majorBidi" w:eastAsiaTheme="majorEastAsia"/>
-      <w:color w:themeColor="text1" w:themeTint="A6" w:val="595959"/>
-    </w:rPr>
-  </w:style>
-  <w:style w:customStyle="1" w:styleId="Heading8Char" w:type="character">
-    <w:name w:val="Heading 8 Char"/>
-    <w:basedOn w:val="DefaultParagraphFont"/>
-    <w:link w:val="Heading8"/>
-    <w:uiPriority w:val="9"/>
-    <w:semiHidden/>
-    <w:rsid w:val="00A10FD9"/>
-    <w:rPr>
-      <w:rFonts w:cstheme="majorBidi" w:eastAsiaTheme="majorEastAsia"/>
-      <w:i/>
-      <w:iCs/>
-      <w:color w:themeColor="text1" w:themeTint="D8" w:val="272727"/>
-    </w:rPr>
-  </w:style>
-  <w:style w:customStyle="1" w:styleId="Heading9Char" w:type="character">
-    <w:name w:val="Heading 9 Char"/>
-    <w:basedOn w:val="DefaultParagraphFont"/>
-    <w:link w:val="Heading9"/>
-    <w:uiPriority w:val="9"/>
-    <w:semiHidden/>
-    <w:rsid w:val="00A10FD9"/>
-    <w:rPr>
       <w:rFonts w:cstheme="majorBidi" w:eastAsiaTheme="majorEastAsia"/>
       <w:color w:themeColor="text1" w:themeTint="D8" w:val="272727"/>
     </w:rPr>
   </w:style>
-  <w:style w:styleId="BlockText" w:type="paragraph">
+  <w:style w:styleId="Normalcentr" w:type="paragraph">
     <w:name w:val="Block Text"/>
-    <w:basedOn w:val="BodyText"/>
-    <w:next w:val="BodyText"/>
+    <w:basedOn w:val="Corpsdetexte"/>
+    <w:next w:val="Corpsdetexte"/>
     <w:uiPriority w:val="9"/>
     <w:unhideWhenUsed/>
     <w:qFormat/>
     <w:pPr>
       <w:spacing w:after="100" w:before="100"/>
-      <w:ind w:firstLine="0" w:left="480" w:right="480"/>
+      <w:ind w:left="480" w:right="480"/>
     </w:pPr>
   </w:style>
-  <w:style w:styleId="FootnoteText" w:type="paragraph">
-    <w:name w:val="Footnote Text"/>
+  <w:style w:styleId="Notedebasdepage" w:type="paragraph">
+    <w:name w:val="footnote text"/>
     <w:basedOn w:val="Normal"/>
-    <w:next w:val="FootnoteText"/>
     <w:uiPriority w:val="9"/>
     <w:unhideWhenUsed/>
     <w:qFormat/>
   </w:style>
-  <w:style w:styleId="FootnoteBlockText" w:type="paragraph">
+  <w:style w:customStyle="1" w:styleId="FootnoteBlockText" w:type="paragraph">
     <w:name w:val="Footnote Block Text"/>
-    <w:basedOn w:val="FootnoteText"/>
-    <w:next w:val="FootnoteText"/>
+    <w:basedOn w:val="Notedebasdepage"/>
+    <w:next w:val="Notedebasdepage"/>
     <w:uiPriority w:val="9"/>
     <w:unhideWhenUsed/>
     <w:qFormat/>
     <w:pPr>
       <w:spacing w:after="100" w:before="100"/>
-      <w:ind w:firstLine="0" w:left="480" w:right="480"/>
+      <w:ind w:left="480" w:right="480"/>
     </w:pPr>
   </w:style>
-  <w:style w:default="1" w:styleId="DefaultParagraphFont" w:type="character">
-    <w:name w:val="Default Paragraph Font"/>
-    <w:semiHidden/>
-    <w:unhideWhenUsed/>
-  </w:style>
-  <w:style w:default="1" w:styleId="Table" w:type="table">
+  <w:style w:customStyle="1" w:styleId="Table" w:type="table">
     <w:name w:val="Table"/>
-    <w:basedOn w:val="TableNormal"/>
     <w:semiHidden/>
     <w:unhideWhenUsed/>
     <w:qFormat/>
@@ -3803,14 +4264,13 @@
     <w:tblStylePr w:type="firstRow">
       <w:tblPr>
         <w:jc w:val="left"/>
-        <w:tblInd w:type="dxa" w:w="0"/>
       </w:tblPr>
       <w:trPr>
         <w:jc w:val="left"/>
       </w:trPr>
       <w:tcPr>
         <w:tcBorders>
-          <w:bottom w:val="single"/>
+          <w:bottom w:color="auto" w:space="0" w:sz="0" w:val="single"/>
         </w:tcBorders>
         <w:vAlign w:val="bottom"/>
       </w:tcPr>
@@ -3833,12 +4293,12 @@
     <w:name w:val="Definition"/>
     <w:basedOn w:val="Normal"/>
   </w:style>
-  <w:style w:styleId="Caption" w:type="paragraph">
-    <w:name w:val="Caption"/>
+  <w:style w:styleId="Lgende" w:type="paragraph">
+    <w:name w:val="caption"/>
     <w:basedOn w:val="Normal"/>
-    <w:link w:val="BodyTextChar"/>
+    <w:link w:val="LgendeCar"/>
     <w:pPr>
-      <w:spacing w:after="120" w:before="0"/>
+      <w:spacing w:after="120"/>
     </w:pPr>
     <w:rPr>
       <w:i/>
@@ -3846,14 +4306,14 @@
   </w:style>
   <w:style w:customStyle="1" w:styleId="TableCaption" w:type="paragraph">
     <w:name w:val="Table Caption"/>
-    <w:basedOn w:val="Caption"/>
+    <w:basedOn w:val="Lgende"/>
     <w:pPr>
       <w:keepNext/>
     </w:pPr>
   </w:style>
   <w:style w:customStyle="1" w:styleId="ImageCaption" w:type="paragraph">
     <w:name w:val="Image Caption"/>
-    <w:basedOn w:val="Caption"/>
+    <w:basedOn w:val="Lgende"/>
   </w:style>
   <w:style w:customStyle="1" w:styleId="Figure" w:type="paragraph">
     <w:name w:val="Figure"/>
@@ -3866,14 +4326,14 @@
       <w:keepNext/>
     </w:pPr>
   </w:style>
-  <w:style w:customStyle="1" w:styleId="BodyTextChar" w:type="character">
-    <w:name w:val="Body Text Char"/>
-    <w:basedOn w:val="DefaultParagraphFont"/>
-    <w:link w:val="BodyText"/>
+  <w:style w:customStyle="1" w:styleId="LgendeCar" w:type="character">
+    <w:name w:val="Légende Car"/>
+    <w:basedOn w:val="Policepardfaut"/>
+    <w:link w:val="Lgende"/>
   </w:style>
   <w:style w:customStyle="1" w:styleId="VerbatimChar" w:type="character">
     <w:name w:val="Verbatim Char"/>
-    <w:basedOn w:val="BodyTextChar"/>
+    <w:basedOn w:val="LgendeCar"/>
     <w:rPr>
       <w:rFonts w:ascii="Consolas" w:hAnsi="Consolas"/>
       <w:sz w:val="22"/>
@@ -3881,26 +4341,26 @@
   </w:style>
   <w:style w:customStyle="1" w:styleId="SectionNumber" w:type="character">
     <w:name w:val="Section Number"/>
-    <w:basedOn w:val="BodyTextChar"/>
-  </w:style>
-  <w:style w:styleId="FootnoteReference" w:type="character">
-    <w:name w:val="Footnote Reference"/>
-    <w:basedOn w:val="BodyTextChar"/>
+    <w:basedOn w:val="LgendeCar"/>
+  </w:style>
+  <w:style w:styleId="Appelnotedebasdep" w:type="character">
+    <w:name w:val="footnote reference"/>
+    <w:basedOn w:val="LgendeCar"/>
     <w:rPr>
       <w:vertAlign w:val="superscript"/>
     </w:rPr>
   </w:style>
-  <w:style w:styleId="Hyperlink" w:type="character">
+  <w:style w:styleId="Lienhypertexte" w:type="character">
     <w:name w:val="Hyperlink"/>
-    <w:basedOn w:val="BodyTextChar"/>
-    <w:rPr>
-      <w:color w:themeColor="accent1" w:val="4F81BD"/>
-    </w:rPr>
-  </w:style>
-  <w:style w:styleId="TOCHeading" w:type="paragraph">
+    <w:basedOn w:val="LgendeCar"/>
+    <w:rPr>
+      <w:color w:themeColor="accent1" w:val="156082"/>
+    </w:rPr>
+  </w:style>
+  <w:style w:styleId="En-ttedetabledesmatires" w:type="paragraph">
     <w:name w:val="TOC Heading"/>
-    <w:basedOn w:val="Heading1"/>
-    <w:next w:val="BodyText"/>
+    <w:basedOn w:val="Titre1"/>
+    <w:next w:val="Corpsdetexte"/>
     <w:uiPriority w:val="39"/>
     <w:unhideWhenUsed/>
     <w:qFormat/>
@@ -3908,12 +4368,13 @@
       <w:spacing w:before="240" w:line="259" w:lineRule="auto"/>
       <w:outlineLvl w:val="9"/>
     </w:pPr>
-    <w:rPr>
-      <w:rFonts w:asciiTheme="majorHAnsi" w:cstheme="majorBidi" w:eastAsiaTheme="majorEastAsia" w:hAnsiTheme="majorHAnsi"/>
-      <w:b w:val="0"/>
-      <w:bCs w:val="0"/>
-      <w:color w:themeColor="accent1" w:themeShade="BF" w:val="365F91"/>
-    </w:rPr>
+  </w:style>
+  <w:style w:styleId="Numrodeligne" w:type="character">
+    <w:name w:val="line number"/>
+    <w:basedOn w:val="Policepardfaut"/>
+    <w:semiHidden/>
+    <w:unhideWhenUsed/>
+    <w:rsid w:val="00333C3B"/>
   </w:style>
   <w:style w:type="paragraph" w:customStyle="1" w:styleId="SourceCode">
     <w:name w:val="Source Code"/>

</xml_diff>

<commit_message>
check reviewer 3 items
</commit_message>
<xml_diff>
--- a/paper/drafts/data_paper_scidata.docx
+++ b/paper/drafts/data_paper_scidata.docx
@@ -168,7 +168,7 @@
         <w:t xml:space="preserve">6</w:t>
       </w:r>
       <w:r>
-        <w:t xml:space="preserve">. To avoid ambiguity, we distinguish throughout this manuscript and dataset between “internal buffer zones” and “external buffer zones.” The temporal emergence of these zones is a critical feature of conservation trajectories: a protected area’s external boundary is typically established by an initial creation decree, while its core zone may be delimited and formalized either in that same decree or in the site’s management and development plan, together with the other zoning categories, at a later stage. Impact evaluations relying solely on the external boundary may therefore misattribute outcomes to the protected area as a whole, whereas the effective protection signal on land use, biodiversity, and community access operates principally at the core zone level.</w:t>
+        <w:t xml:space="preserve">. To avoid ambiguity, we distinguish throughout this manuscript and dataset between “internal buffer zones” and “external buffer zones.” The temporal emergence of these zones is a critical feature of conservation trajectories: a protected area’s external boundary is typically established by an initial creation decree, while its core zone may be delimited and formalized either in that same decree or in the site’s management and development plan, together with the other zoning categories, at a later stage. Impact evaluations seek to estimate the causal effect of an intervention by comparing observed outcomes with an estimate of what would have occurred in its absence. For protected areas, this requires correctly identifying where and when protection applies. Errors in boundary geometry, protection dates, or legal status can therefore misclassify locations or periods as protected or unprotected and bias estimated effects. Internal zoning adds another dimension: evaluations relying solely on the external boundary may pool areas subject to different levels of restriction, potentially masking effects concentrated in more strictly protected zones.</w:t>
       </w:r>
     </w:p>
     <w:p>
@@ -176,7 +176,7 @@
         <w:pStyle w:val="Corpsdetexte"/>
       </w:pPr>
       <w:r>
-        <w:t xml:space="preserve">This matters for researchers from all disciplines that study conservation (biology, ecology, economics, anthropology, etc.). For instance, when impact evaluations assume that current boundaries have remained unchanged since a protected area was established, they may treat recently added areas as if they had been protected for much longer, inducing a downward bias. It is also relevant for policymakers, as protected areas have become a major instrument of spatial planning, with global terrestrial coverage exceeding 17% in 2023</w:t>
+        <w:t xml:space="preserve">This matters for researchers from all disciplines that study conservation (biology, ecology, economics, anthropology, etc.). For instance, if such an evaluation assumes that the current boundary has remained unchanged since a protected area was established, it may treat land incorporated only later as protected during earlier periods, thereby biasing the estimated effect of protection. It is also relevant for policymakers, as protected areas have become a major instrument of spatial planning, with global terrestrial coverage exceeding 17% in 2023</w:t>
       </w:r>
       <w:r>
         <w:rPr>
@@ -354,7 +354,7 @@
               <w:pStyle w:val="ImageCaption"/>
             </w:pPr>
             <w:r>
-              <w:t xml:space="preserve">Figure 1: Workflow diagram of the data processing pipeline</w:t>
+              <w:t xml:space="preserve">Figure 1: Workflow for reconstructing and consolidating protected-area histories. Input data provide geometries or dated attributes used to construct the amendment registry, whereas validation and contextual sources are used for comparison, interpretation and verification. The curated amendment registry is then applied to a WDPA baseline using the Consolidation and Auditing Rules. The deposited release uses the November 2025 WDPA baseline; later WDPA releases can be used to generate subsequent updates</w:t>
             </w:r>
           </w:p>
           <w:bookmarkEnd w:id="13"/>
@@ -561,7 +561,7 @@
         <w:pStyle w:val="Corpsdetexte"/>
       </w:pPr>
       <w:r>
-        <w:t xml:space="preserve">Core-zone shapefiles produced by protected-area managers, including MEDD, MNP, MBG, GERP and WWF, were assembled and compared with protected-area boundaries. These zoning data form part of the geographic information associated with the official management of protected areas under MEDD responsibility, including where MEDD delegates its management mandate to another organization. For the released dataset, the selected and harmonized zoning geometries are recorded under the source identifier</w:t>
+        <w:t xml:space="preserve">Core-zone shapefiles produced by protected-area managers, including MEDD, MNP, MBG (Missouri Botanical Garden), GERP (Groupe d’Étude et de Recherche sur les Primates de Madagascar) and (World Wildlife Fund), were assembled and compared with protected-area boundaries. These zoning data form part of the geographic information associated with the official management of protected areas under MEDD responsibility, including where MEDD delegates its management mandate to another organization. For the released dataset, the selected and harmonized zoning geometries are recorded under the source identifier</w:t>
       </w:r>
       <w:r>
         <w:t xml:space="preserve"> </w:t>
@@ -709,7 +709,7 @@
         <w:pStyle w:val="Corpsdetexte"/>
       </w:pPr>
       <w:r>
-        <w:t xml:space="preserve">The registry documents five types of amendments: boundary modifications, status changes, temporary protections, corrections to the WDPA baseline, and secondary zoning.</w:t>
+        <w:t xml:space="preserve">The registry documents five types of amendments: boundary modifications, status changes, temporary protections, corrections to the WDPA baseline, and secondary zoning. In the Malagasy protected-area creation process, temporary protection refers to a legally binding provisional protection granted while a site proceeds toward definitive legal creation. During this provisional period, the site is subject in substance to the conservation restrictions associated with protected status; the distinction is primarily that the legal protection is granted for a limited period pending definitive designation. Temporary protection therefore does not indicate a protected area intended to be temporary or one that was subsequently degazetted.</w:t>
       </w:r>
     </w:p>
     <w:bookmarkEnd w:id="20"/>
@@ -1792,7 +1792,7 @@
               <w:pStyle w:val="ImageCaption"/>
             </w:pPr>
             <w:r>
-              <w:t xml:space="preserve">Figure 3: Map of the 123 protected areas that constitute Madagascar’s national protected-area system through the end of 2025</w:t>
+              <w:t xml:space="preserve">Figure 3: Map of the 123 protected areas that constituted Madagascar’s national protected-area system through the end of 2025, coloured according to the number of documented external-boundary temporal states. A value of 1 indicates that no boundary change is documented over the study period.</w:t>
             </w:r>
           </w:p>
           <w:bookmarkEnd w:id="27"/>
@@ -2065,7 +2065,7 @@
               <w:pStyle w:val="ImageCaption"/>
             </w:pPr>
             <w:r>
-              <w:t xml:space="preserve">Figure 5: Type and counts of amendments documented in the YAML registry</w:t>
+              <w:t xml:space="preserve">Figure 5: Types and counts of amendments documented in the YAML registry. Temporary protection denotes legally binding provisional protection pending definitive creation, rather than subsequent degazettement</w:t>
             </w:r>
           </w:p>
           <w:bookmarkEnd w:id="36"/>
@@ -2197,7 +2197,7 @@
         <w:pStyle w:val="Corpsdetexte"/>
       </w:pPr>
       <w:r>
-        <w:t xml:space="preserve">The YAML amendment registry is designed for collaborative extension. Researchers who identify additional legal texts, historical maps, or field-validated boundaries can propose corrections or new amendments through the associated GitHub repository, where changes remain auditable through version control. The interactive companion application allows users to explore individual protected areas and compare boundaries from different sources.</w:t>
+        <w:t xml:space="preserve">The YAML amendment registry is designed for collaborative extension. Researchers who identify additional legal texts, historical maps, or field-validated boundaries can propose corrections or new amendments through the associated GitHub repository, where changes remain auditable through version control. Proposed amendments are reviewed by the coauthors and incorporated into the curated registry by consensus. If consensus cannot be reached, final validation rests with Ollier D. Andrianambinina for protected areas managed by Madagascar National Parks (MNP), and with Seheno Ramanantsoa for other protected areas. The CAR engine then automates consolidation of accepted amendments; it does not perform their scientific or institutional validation. The interactive companion application allows users to explore individual protected areas and compare boundaries from different sources.</w:t>
       </w:r>
     </w:p>
     <w:bookmarkEnd w:id="38"/>

</xml_diff>

<commit_message>
rerender (duplicated figure folder
</commit_message>
<xml_diff>
--- a/paper/drafts/data_paper_scidata.docx
+++ b/paper/drafts/data_paper_scidata.docx
@@ -39,7 +39,7 @@
         <w:pStyle w:val="Date"/>
       </w:pPr>
       <w:r>
-        <w:t xml:space="preserve">2026-10-20</w:t>
+        <w:t xml:space="preserve">2026-10-21</w:t>
       </w:r>
     </w:p>
     <w:p>
@@ -143,7 +143,7 @@
         <w:t xml:space="preserve"> </w:t>
       </w:r>
       <w:r>
-        <w:t xml:space="preserve">quantified the net area flux in the global protected area estate from 2004 to 2016 by comparing successive WDPA snapshots, finding that an average of 1.1 million km² was removed from the database annually across 223 countries and territories. Their analysis, however, could not distinguish on-the-ground changes from data-quality corrections, and the snapshot-comparison method itself erases the intermediate states it seeks to document.</w:t>
+        <w:t xml:space="preserve">quantified changes in the global protected area estate by comparing 12 archived WDPA versions from 2004 to 2016, finding that an average of 1.1 million km² was removed from the database annually across 223 countries and territories. 1.1 million km² was removed from the database annually across 223 countries and territories. While this approach captures changes between successive releases, it cannot reconstruct intermediate configurations that were not preserved in any archived version. Moreover, differences between snapshots may reflect both actual changes in protected area status or boundaries and corrections to the database, which cannot be reliably distinguished from the snapshots alone.</w:t>
       </w:r>
     </w:p>
     <w:p>
@@ -151,7 +151,7 @@
         <w:pStyle w:val="Corpsdetexte"/>
       </w:pPr>
       <w:r>
-        <w:t xml:space="preserve">What remains largely unaddressed is the continuous evolution of ongoing protected areas. Between creation and the present, many sites undergo boundary modifications, status reclassifications (for instance from Strict Nature Reserve to National Park), governance changes, internal zoning, or temporary protection decrees. None of these transformations are preserved in the WDPA’s current-state model: each update silently replaces the previous configuration, making it impossible to reconstruct what a protected area looked like at any given date in the past.</w:t>
+        <w:t xml:space="preserve">What remains largely unaddressed is the continuous evolution of ongoing protected areas. Between creation and the present, many sites undergo boundary modifications, status reclassifications (for instance from Strict Nature Reserve to National Park), governance changes, internal zoning, or temporary protection decrees. None of these transformations are preserved in the WDPA’s current-state model: each update silently replaces the previous configuration, making it impossible to reconstruct what a protected area looked like at any given date in the past from the current WDPA alone.</w:t>
       </w:r>
     </w:p>
     <w:p>
@@ -304,7 +304,7 @@
             <w:r>
               <w:drawing>
                 <wp:inline>
-                  <wp:extent cx="5969000" cy="3213412"/>
+                  <wp:extent cx="5969000" cy="3706776"/>
                   <wp:effectExtent b="0" l="0" r="0" t="0"/>
                   <wp:docPr descr="" title="" id="11" name="Picture"/>
                   <a:graphic>
@@ -325,7 +325,7 @@
                         <pic:spPr bwMode="auto">
                           <a:xfrm>
                             <a:off x="0" y="0"/>
-                            <a:ext cx="5969000" cy="3213412"/>
+                            <a:ext cx="5969000" cy="3706776"/>
                           </a:xfrm>
                           <a:prstGeom prst="rect">
                             <a:avLst/>
@@ -553,7 +553,7 @@
         <w:pStyle w:val="Corpsdetexte"/>
       </w:pPr>
       <w:r>
-        <w:t xml:space="preserve">A Shiny web application was developed and deployed for domain expert review. The validation involved protected area managers, GIS specialists from MEDD and Madagascar National Parks, and researchers with long-term experience on Madagascar’s protected area system. The application overlays geometries from different sources and time periods on interactive Leaflet maps, with filtering by IUCN category, dataset of origin, and associated legal texts. This tool enabled systematic visual comparison of boundaries reported by different sources for each protected area. The companion website provides ongoing access to this verification interface.</w:t>
+        <w:t xml:space="preserve">A Shiny web application was developed and deployed for domain expert review. The validation involved protected area managers, GIS specialists from MEDD and Madagascar National Parks, and researchers with long-term experience on Madagascar’s protected area system. The application overlays geometries from different sources and time periods on interactive Leaflet maps, with filtering by IUCN category, dataset of origin, and associated legal texts. This tool enabled visual comparison of boundaries reported by different sources for each protected area. The shiny application is embedded into the Chapter 5 of the companion website and a standalone instance is accessible at https://fbedecarrats-conservation-madascar-dashboard.share.connect.posit.cloud/.</w:t>
       </w:r>
     </w:p>
     <w:p>
@@ -561,7 +561,7 @@
         <w:pStyle w:val="Corpsdetexte"/>
       </w:pPr>
       <w:r>
-        <w:t xml:space="preserve">Core-zone shapefiles produced by protected-area managers, including MEDD, MNP, MBG (Missouri Botanical Garden), GERP (Groupe d’Étude et de Recherche sur les Primates de Madagascar) and (World Wildlife Fund), were assembled and compared with protected-area boundaries. These zoning data form part of the geographic information associated with the official management of protected areas under MEDD responsibility, including where MEDD delegates its management mandate to another organization. For the released dataset, the selected and harmonized zoning geometries are recorded under the source identifier</w:t>
+        <w:t xml:space="preserve">Core-zone shapefiles produced by protected-area managers, including MEDD, MNP, MBG (Missouri Botanical Garden), GERP (Groupe d’Étude et de Recherche sur les Primates de Madagascar) and WWF (World Wildlife Fund), were assembled and compared with protected-area boundaries. These zoning data form part of the geographic information associated with the official management of protected areas under MEDD responsibility, including where MEDD delegates its management mandate to another organization. For the released dataset, the selected and harmonized zoning geometries are recorded under the source identifier</w:t>
       </w:r>
       <w:r>
         <w:t xml:space="preserve"> </w:t>
@@ -739,7 +739,7 @@
         <w:t xml:space="preserve"> </w:t>
       </w:r>
       <w:r>
-        <w:t xml:space="preserve">identifies temporal breakpoints from all amendments for a given WDPAID,</w:t>
+        <w:t xml:space="preserve">identifies temporal breakpoints from all amendments for a given WDPA identifier,</w:t>
       </w:r>
       <w:r>
         <w:t xml:space="preserve"> </w:t>
@@ -791,7 +791,16 @@
         <w:t xml:space="preserve">“Dynamic spatial conservation boundaries and internal zoning of Madagascar from 2000 to 2025”</w:t>
       </w:r>
       <w:r>
-        <w:t xml:space="preserve">, DataSuds. Version 2.0 contains three equivalent consolidated representations of the temporal dataset,</w:t>
+        <w:t xml:space="preserve">, DataSuds</w:t>
+      </w:r>
+      <w:r>
+        <w:rPr>
+          <w:vertAlign w:val="superscript"/>
+        </w:rPr>
+        <w:t xml:space="preserve">10</w:t>
+      </w:r>
+      <w:r>
+        <w:t xml:space="preserve">. Version 2.0 contains three equivalent consolidated representations of the temporal dataset,</w:t>
       </w:r>
       <w:r>
         <w:t xml:space="preserve"> </w:t>
@@ -844,7 +853,7 @@
         <w:rPr>
           <w:vertAlign w:val="superscript"/>
         </w:rPr>
-        <w:t xml:space="preserve">10</w:t>
+        <w:t xml:space="preserve">11</w:t>
       </w:r>
       <w:r>
         <w:t xml:space="preserve">.</w:t>
@@ -2186,7 +2195,7 @@
         <w:rPr>
           <w:vertAlign w:val="superscript"/>
         </w:rPr>
-        <w:t xml:space="preserve">10</w:t>
+        <w:t xml:space="preserve">11</w:t>
       </w:r>
       <w:r>
         <w:t xml:space="preserve">. UNEP-WCMC has separately provided written authorization for public redistribution of the Madagascar-specific derived outputs included in this dataset for the non-commercial use case described here.</w:t>
@@ -2221,60 +2230,60 @@
         <w:rPr>
           <w:vertAlign w:val="superscript"/>
         </w:rPr>
+        <w:t xml:space="preserve">10</w:t>
+      </w:r>
+      <w:r>
+        <w:t xml:space="preserve">. Version 2.0 includes the consolidated files</w:t>
+      </w:r>
+      <w:r>
+        <w:t xml:space="preserve"> </w:t>
+      </w:r>
+      <w:r>
+        <w:t xml:space="preserve">“dynamic_wdpa.gpkg”</w:t>
+      </w:r>
+      <w:r>
+        <w:t xml:space="preserve">,</w:t>
+      </w:r>
+      <w:r>
+        <w:t xml:space="preserve"> </w:t>
+      </w:r>
+      <w:r>
+        <w:t xml:space="preserve">“dynamic_wdpa.parquet”</w:t>
+      </w:r>
+      <w:r>
+        <w:t xml:space="preserve">, and</w:t>
+      </w:r>
+      <w:r>
+        <w:t xml:space="preserve"> </w:t>
+      </w:r>
+      <w:r>
+        <w:t xml:space="preserve">“dynamic_wdpa.rds”</w:t>
+      </w:r>
+      <w:r>
+        <w:t xml:space="preserve">, together with the archived amendment registry</w:t>
+      </w:r>
+      <w:r>
+        <w:t xml:space="preserve"> </w:t>
+      </w:r>
+      <w:r>
+        <w:t xml:space="preserve">“amendments.zip”</w:t>
+      </w:r>
+      <w:r>
+        <w:t xml:space="preserve">, which contains a snapshot of the version-controlled YAML amendment registry and associated GeoJSON geometries. The three consolidated files contain the same substantive information in formats suited respectively to GIS software, R, and broader analytical workflows.</w:t>
+      </w:r>
+    </w:p>
+    <w:p>
+      <w:pPr>
+        <w:pStyle w:val="Corpsdetexte"/>
+      </w:pPr>
+      <w:r>
+        <w:t xml:space="preserve">The consolidated files incorporate information derived from the November 2025 WDPA release. UNEP-WCMC has provided written authorization for redistribution of these Madagascar-specific derived outputs for this non-commercial use case. Commercial use of WDPA material or derivative works requires prior written permission from UNEP-WCMC</w:t>
+      </w:r>
+      <w:r>
+        <w:rPr>
+          <w:vertAlign w:val="superscript"/>
+        </w:rPr>
         <w:t xml:space="preserve">11</w:t>
-      </w:r>
-      <w:r>
-        <w:t xml:space="preserve">. Version 2.0 includes the consolidated files</w:t>
-      </w:r>
-      <w:r>
-        <w:t xml:space="preserve"> </w:t>
-      </w:r>
-      <w:r>
-        <w:t xml:space="preserve">“dynamic_wdpa.gpkg”</w:t>
-      </w:r>
-      <w:r>
-        <w:t xml:space="preserve">,</w:t>
-      </w:r>
-      <w:r>
-        <w:t xml:space="preserve"> </w:t>
-      </w:r>
-      <w:r>
-        <w:t xml:space="preserve">“dynamic_wdpa.parquet”</w:t>
-      </w:r>
-      <w:r>
-        <w:t xml:space="preserve">, and</w:t>
-      </w:r>
-      <w:r>
-        <w:t xml:space="preserve"> </w:t>
-      </w:r>
-      <w:r>
-        <w:t xml:space="preserve">“dynamic_wdpa.rds”</w:t>
-      </w:r>
-      <w:r>
-        <w:t xml:space="preserve">, together with the archived amendment registry</w:t>
-      </w:r>
-      <w:r>
-        <w:t xml:space="preserve"> </w:t>
-      </w:r>
-      <w:r>
-        <w:t xml:space="preserve">“amendments.zip”</w:t>
-      </w:r>
-      <w:r>
-        <w:t xml:space="preserve">, which contains a snapshot of the version-controlled YAML amendment registry and associated GeoJSON geometries. The three consolidated files contain the same substantive information in formats suited respectively to GIS software, R, and broader analytical workflows.</w:t>
-      </w:r>
-    </w:p>
-    <w:p>
-      <w:pPr>
-        <w:pStyle w:val="Corpsdetexte"/>
-      </w:pPr>
-      <w:r>
-        <w:t xml:space="preserve">The consolidated files incorporate information derived from the November 2025 WDPA release. UNEP-WCMC has provided written authorization for redistribution of these Madagascar-specific derived outputs for this non-commercial use case. Commercial use of WDPA material or derivative works requires prior written permission from UNEP-WCMC</w:t>
-      </w:r>
-      <w:r>
-        <w:rPr>
-          <w:vertAlign w:val="superscript"/>
-        </w:rPr>
-        <w:t xml:space="preserve">10</w:t>
       </w:r>
       <w:r>
         <w:t xml:space="preserve">. The deposited files constitute a historical research snapshot; users requiring the latest official protected and conserved area data should obtain the current release directly from Protected Planet.</w:t>
@@ -2338,7 +2347,7 @@
         <w:pStyle w:val="FirstParagraph"/>
       </w:pPr>
       <w:r>
-        <w:t xml:space="preserve">This work was conducted within the BETSAKA project, supported by KfW (grant BMZ 2018-68-538/KfW 108778), Agence Française de Développement (grant PAIRES-CZZ2557), Institut de Recherche pour le Développement (IRD) and Agence Nationale de la Recherche (grant ANR-22-CPJ1-0052-01). The project is coordinated by IRD/UMI-SOURCE and the Université d’Antananarivo/CERED. We thank the Vahatra Association for the foundational monograph on Madagascar’s protected areas, the CNLEGIS team for maintaining the national legislative database, and the organizations (MEDD, MNP, MBG, GERP, WWF) that shared core zone spatial data.</w:t>
+        <w:t xml:space="preserve">The project is coordinated by IRD/UMI-SOURCE and the Université d’Antananarivo/CERED. We thank the Vahatra Association for the foundational monograph on Madagascar’s protected areas, the CNLEGIS team for maintaining the national legislative database, and the organizations (MEDD, MNP, MBG, GERP, WWF) that shared core zone spatial data.</w:t>
       </w:r>
     </w:p>
     <w:bookmarkEnd w:id="41"/>
@@ -3065,7 +3074,7 @@
       </w:r>
     </w:p>
     <w:bookmarkEnd w:id="54"/>
-    <w:bookmarkStart w:id="56" w:name="ref-unepwcmcWDPCAlicense"/>
+    <w:bookmarkStart w:id="56" w:name="ref-bedecarrats2026dataset"/>
     <w:p>
       <w:pPr>
         <w:pStyle w:val="Bibliographie"/>
@@ -3080,12 +3089,48 @@
         <w:t xml:space="preserve">	</w:t>
       </w:r>
       <w:r>
+        <w:t xml:space="preserve">Bédécarrats, F., Ramanantsoa, S. &amp; Andrianambinina, O. D. Dynamic spatial conservation boundaries and internal zoning of madagascar from 2000 to 2025. DataSuds</w:t>
+      </w:r>
+      <w:r>
+        <w:t xml:space="preserve"> </w:t>
+      </w:r>
+      <w:hyperlink r:id="rId55">
+        <w:r>
+          <w:rPr>
+            <w:rStyle w:val="Lienhypertexte"/>
+          </w:rPr>
+          <w:t xml:space="preserve">https://doi.org/10.23708/VN2TWC</w:t>
+        </w:r>
+      </w:hyperlink>
+      <w:r>
+        <w:t xml:space="preserve"> </w:t>
+      </w:r>
+      <w:r>
+        <w:t xml:space="preserve">(2026).</w:t>
+      </w:r>
+    </w:p>
+    <w:bookmarkEnd w:id="56"/>
+    <w:bookmarkStart w:id="58" w:name="ref-unepwcmcWDPCAlicense"/>
+    <w:p>
+      <w:pPr>
+        <w:pStyle w:val="Bibliographie"/>
+      </w:pPr>
+      <w:r>
+        <w:t xml:space="preserve">11.</w:t>
+      </w:r>
+      <w:r>
+        <w:t xml:space="preserve"> </w:t>
+      </w:r>
+      <w:r>
+        <w:t xml:space="preserve">	</w:t>
+      </w:r>
+      <w:r>
         <w:t xml:space="preserve">UNEP-WCMC.</w:t>
       </w:r>
       <w:r>
         <w:t xml:space="preserve"> </w:t>
       </w:r>
-      <w:hyperlink r:id="rId55">
+      <w:hyperlink r:id="rId57">
         <w:r>
           <w:rPr>
             <w:rStyle w:val="Lienhypertexte"/>
@@ -3095,42 +3140,6 @@
       </w:hyperlink>
       <w:r>
         <w:t xml:space="preserve">. (2026).</w:t>
-      </w:r>
-    </w:p>
-    <w:bookmarkEnd w:id="56"/>
-    <w:bookmarkStart w:id="58" w:name="ref-bedecarrats2026dataset"/>
-    <w:p>
-      <w:pPr>
-        <w:pStyle w:val="Bibliographie"/>
-      </w:pPr>
-      <w:r>
-        <w:t xml:space="preserve">11.</w:t>
-      </w:r>
-      <w:r>
-        <w:t xml:space="preserve"> </w:t>
-      </w:r>
-      <w:r>
-        <w:t xml:space="preserve">	</w:t>
-      </w:r>
-      <w:r>
-        <w:t xml:space="preserve">Bédécarrats, F., Ramanantsoa, S. &amp; Andrianambinina, O. D. Dynamic spatial conservation boundaries and internal zoning of madagascar from 2000 to 2025. DataSuds</w:t>
-      </w:r>
-      <w:r>
-        <w:t xml:space="preserve"> </w:t>
-      </w:r>
-      <w:hyperlink r:id="rId57">
-        <w:r>
-          <w:rPr>
-            <w:rStyle w:val="Lienhypertexte"/>
-          </w:rPr>
-          <w:t xml:space="preserve">https://doi.org/10.23708/VN2TWC</w:t>
-        </w:r>
-      </w:hyperlink>
-      <w:r>
-        <w:t xml:space="preserve"> </w:t>
-      </w:r>
-      <w:r>
-        <w:t xml:space="preserve">(2026).</w:t>
       </w:r>
     </w:p>
     <w:bookmarkEnd w:id="58"/>

</xml_diff>